<commit_message>
Update student to candidate
</commit_message>
<xml_diff>
--- a/derieux_resume_multipage.docx
+++ b/derieux_resume_multipage.docx
@@ -1,6 +1,6 @@
 
 <file path=word/document.xml><?xml version="1.0" encoding="utf-8"?>
-<w:document xmlns:wpc="http://schemas.microsoft.com/office/word/2010/wordprocessingCanvas" xmlns:cx="http://schemas.microsoft.com/office/drawing/2014/chartex" xmlns:cx1="http://schemas.microsoft.com/office/drawing/2015/9/8/chartex" xmlns:cx2="http://schemas.microsoft.com/office/drawing/2015/10/21/chartex" xmlns:cx3="http://schemas.microsoft.com/office/drawing/2016/5/9/chartex" xmlns:cx4="http://schemas.microsoft.com/office/drawing/2016/5/10/chartex" xmlns:cx5="http://schemas.microsoft.com/office/drawing/2016/5/11/chartex" xmlns:cx6="http://schemas.microsoft.com/office/drawing/2016/5/12/chartex" xmlns:cx7="http://schemas.microsoft.com/office/drawing/2016/5/13/chartex" xmlns:cx8="http://schemas.microsoft.com/office/drawing/2016/5/14/chartex" xmlns:mc="http://schemas.openxmlformats.org/markup-compatibility/2006" xmlns:aink="http://schemas.microsoft.com/office/drawing/2016/ink" xmlns:am3d="http://schemas.microsoft.com/office/drawing/2017/model3d" xmlns:o="urn:schemas-microsoft-com:office:office" xmlns:oel="http://schemas.microsoft.com/office/2019/extlst" xmlns:r="http://schemas.openxmlformats.org/officeDocument/2006/relationships" xmlns:m="http://schemas.openxmlformats.org/officeDocument/2006/math" xmlns:v="urn:schemas-microsoft-com:vml" xmlns:wp14="http://schemas.microsoft.com/office/word/2010/wordprocessingDrawing" xmlns:wp="http://schemas.openxmlformats.org/drawingml/2006/wordprocessingDrawing" xmlns:w10="urn:schemas-microsoft-com:office:word" xmlns:w="http://schemas.openxmlformats.org/wordprocessingml/2006/main" xmlns:w14="http://schemas.microsoft.com/office/word/2010/wordml" xmlns:w15="http://schemas.microsoft.com/office/word/2012/wordml" xmlns:w16cex="http://schemas.microsoft.com/office/word/2018/wordml/cex" xmlns:w16cid="http://schemas.microsoft.com/office/word/2016/wordml/cid" xmlns:w16="http://schemas.microsoft.com/office/word/2018/wordml" xmlns:w16sdtdh="http://schemas.microsoft.com/office/word/2020/wordml/sdtdatahash" xmlns:w16se="http://schemas.microsoft.com/office/word/2015/wordml/symex" xmlns:wpg="http://schemas.microsoft.com/office/word/2010/wordprocessingGroup" xmlns:wpi="http://schemas.microsoft.com/office/word/2010/wordprocessingInk" xmlns:wne="http://schemas.microsoft.com/office/word/2006/wordml" xmlns:wps="http://schemas.microsoft.com/office/word/2010/wordprocessingShape" mc:Ignorable="w14 w15 w16se w16cid w16 w16cex w16sdtdh wp14">
+<w:document xmlns:wpc="http://schemas.microsoft.com/office/word/2010/wordprocessingCanvas" xmlns:cx="http://schemas.microsoft.com/office/drawing/2014/chartex" xmlns:cx1="http://schemas.microsoft.com/office/drawing/2015/9/8/chartex" xmlns:cx2="http://schemas.microsoft.com/office/drawing/2015/10/21/chartex" xmlns:cx3="http://schemas.microsoft.com/office/drawing/2016/5/9/chartex" xmlns:cx4="http://schemas.microsoft.com/office/drawing/2016/5/10/chartex" xmlns:cx5="http://schemas.microsoft.com/office/drawing/2016/5/11/chartex" xmlns:cx6="http://schemas.microsoft.com/office/drawing/2016/5/12/chartex" xmlns:cx7="http://schemas.microsoft.com/office/drawing/2016/5/13/chartex" xmlns:cx8="http://schemas.microsoft.com/office/drawing/2016/5/14/chartex" xmlns:mc="http://schemas.openxmlformats.org/markup-compatibility/2006" xmlns:aink="http://schemas.microsoft.com/office/drawing/2016/ink" xmlns:am3d="http://schemas.microsoft.com/office/drawing/2017/model3d" xmlns:o="urn:schemas-microsoft-com:office:office" xmlns:oel="http://schemas.microsoft.com/office/2019/extlst" xmlns:r="http://schemas.openxmlformats.org/officeDocument/2006/relationships" xmlns:m="http://schemas.openxmlformats.org/officeDocument/2006/math" xmlns:v="urn:schemas-microsoft-com:vml" xmlns:wp14="http://schemas.microsoft.com/office/word/2010/wordprocessingDrawing" xmlns:wp="http://schemas.openxmlformats.org/drawingml/2006/wordprocessingDrawing" xmlns:w10="urn:schemas-microsoft-com:office:word" xmlns:w="http://schemas.openxmlformats.org/wordprocessingml/2006/main" xmlns:w14="http://schemas.microsoft.com/office/word/2010/wordml" xmlns:w15="http://schemas.microsoft.com/office/word/2012/wordml" xmlns:w16cex="http://schemas.microsoft.com/office/word/2018/wordml/cex" xmlns:w16cid="http://schemas.microsoft.com/office/word/2016/wordml/cid" xmlns:w16="http://schemas.microsoft.com/office/word/2018/wordml" xmlns:w16du="http://schemas.microsoft.com/office/word/2023/wordml/word16du" xmlns:w16sdtdh="http://schemas.microsoft.com/office/word/2020/wordml/sdtdatahash" xmlns:w16sdtfl="http://schemas.microsoft.com/office/word/2024/wordml/sdtformatlock" xmlns:w16se="http://schemas.microsoft.com/office/word/2015/wordml/symex" xmlns:wpg="http://schemas.microsoft.com/office/word/2010/wordprocessingGroup" xmlns:wpi="http://schemas.microsoft.com/office/word/2010/wordprocessingInk" xmlns:wne="http://schemas.microsoft.com/office/word/2006/wordml" xmlns:wps="http://schemas.microsoft.com/office/word/2010/wordprocessingShape" mc:Ignorable="w14 w15 w16se w16cid w16 w16cex w16sdtdh w16sdtfl w16du wp14">
   <w:body>
     <w:p>
       <w:pPr>
@@ -258,6 +258,7 @@
                     <w:t xml:space="preserve">LinkedIn: </w:t>
                   </w:r>
                   <w:hyperlink r:id="rId9" w:history="1">
+                    <w:proofErr w:type="spellStart"/>
                     <w:r>
                       <w:rPr>
                         <w:rStyle w:val="Hyperlink"/>
@@ -266,6 +267,7 @@
                       </w:rPr>
                       <w:t>alexderieux</w:t>
                     </w:r>
+                    <w:proofErr w:type="spellEnd"/>
                   </w:hyperlink>
                 </w:p>
               </w:tc>
@@ -375,7 +377,13 @@
               <w:pStyle w:val="Content"/>
             </w:pPr>
             <w:r>
-              <w:t>Ph.D. student and i</w:t>
+              <w:t xml:space="preserve">Ph.D. </w:t>
+            </w:r>
+            <w:r>
+              <w:t>candidate</w:t>
+            </w:r>
+            <w:r>
+              <w:t xml:space="preserve"> and i</w:t>
             </w:r>
             <w:r>
               <w:t xml:space="preserve">ndustry professional </w:t>
@@ -1423,12 +1431,21 @@
                       <w:iCs/>
                     </w:rPr>
                   </w:pPr>
+                  <w:proofErr w:type="spellStart"/>
                   <w:r>
                     <w:rPr>
                       <w:i/>
                       <w:iCs/>
                     </w:rPr>
-                    <w:t>Wireless@VT, Virginia Polytechnic Institute and State University</w:t>
+                    <w:t>Wireless@VT</w:t>
+                  </w:r>
+                  <w:proofErr w:type="spellEnd"/>
+                  <w:r>
+                    <w:rPr>
+                      <w:i/>
+                      <w:iCs/>
+                    </w:rPr>
+                    <w:t>, Virginia Polytechnic Institute and State University</w:t>
                   </w:r>
                 </w:p>
                 <w:p>
@@ -2241,14 +2258,35 @@
             <w:r>
               <w:t>“</w:t>
             </w:r>
-            <w:r>
-              <w:t>eQMARL: Entangled Quantum Multi-Agent Reinforcement Learning for Distributed Cooperation over Quantum Channels</w:t>
+            <w:proofErr w:type="spellStart"/>
+            <w:r>
+              <w:t>eQMARL</w:t>
+            </w:r>
+            <w:proofErr w:type="spellEnd"/>
+            <w:r>
+              <w:t>: Entangled Quantum Multi-Agent Reinforcement Learning for Distributed Cooperation over Quantum Channels</w:t>
             </w:r>
             <w:r>
               <w:t>”</w:t>
             </w:r>
             <w:r>
-              <w:t>, arXiv [quant-ph]. 2024.</w:t>
+              <w:t xml:space="preserve">, </w:t>
+            </w:r>
+            <w:proofErr w:type="spellStart"/>
+            <w:r>
+              <w:t>arXiv</w:t>
+            </w:r>
+            <w:proofErr w:type="spellEnd"/>
+            <w:r>
+              <w:t xml:space="preserve"> [quant-</w:t>
+            </w:r>
+            <w:proofErr w:type="spellStart"/>
+            <w:r>
+              <w:t>ph</w:t>
+            </w:r>
+            <w:proofErr w:type="spellEnd"/>
+            <w:r>
+              <w:t>]. 2024.</w:t>
             </w:r>
             <w:r>
               <w:t xml:space="preserve"> Available: </w:t>
@@ -2284,7 +2322,15 @@
               <w:t>”</w:t>
             </w:r>
             <w:r>
-              <w:t>, arXiv [cs.GT]. 2022.</w:t>
+              <w:t xml:space="preserve">, </w:t>
+            </w:r>
+            <w:proofErr w:type="spellStart"/>
+            <w:r>
+              <w:t>arXiv</w:t>
+            </w:r>
+            <w:proofErr w:type="spellEnd"/>
+            <w:r>
+              <w:t xml:space="preserve"> [cs.GT]. 2022.</w:t>
             </w:r>
             <w:r>
               <w:t xml:space="preserve"> Available: </w:t>
@@ -2308,7 +2354,15 @@
               <w:ind w:left="267" w:hanging="270"/>
             </w:pPr>
             <w:r>
-              <w:t xml:space="preserve">A. C. DeRieux, W. Saad, W. Zuo, R. Budiarto, M. D. Koerniawan, and D. Novitasari, </w:t>
+              <w:t xml:space="preserve">A. C. DeRieux, W. Saad, W. Zuo, R. Budiarto, M. D. </w:t>
+            </w:r>
+            <w:proofErr w:type="spellStart"/>
+            <w:r>
+              <w:t>Koerniawan</w:t>
+            </w:r>
+            <w:proofErr w:type="spellEnd"/>
+            <w:r>
+              <w:t xml:space="preserve">, and D. Novitasari, </w:t>
             </w:r>
             <w:r>
               <w:t>“</w:t>
@@ -2320,12 +2374,22 @@
               <w:t>”</w:t>
             </w:r>
             <w:r>
-              <w:t>, arXiv [</w:t>
-            </w:r>
+              <w:t xml:space="preserve">, </w:t>
+            </w:r>
+            <w:proofErr w:type="spellStart"/>
+            <w:r>
+              <w:t>arXiv</w:t>
+            </w:r>
+            <w:proofErr w:type="spellEnd"/>
+            <w:r>
+              <w:t xml:space="preserve"> [</w:t>
+            </w:r>
+            <w:proofErr w:type="spellStart"/>
             <w:proofErr w:type="gramStart"/>
             <w:r>
               <w:t>cs.LG</w:t>
             </w:r>
+            <w:proofErr w:type="spellEnd"/>
             <w:proofErr w:type="gramEnd"/>
             <w:r>
               <w:t>]. 2022.</w:t>
@@ -2819,8 +2883,18 @@
                         <w:color w:val="7F7F7F" w:themeColor="text1" w:themeTint="80"/>
                         <w:u w:val="none"/>
                       </w:rPr>
-                      <w:t>/alexderieux</w:t>
+                      <w:t>/</w:t>
                     </w:r>
+                    <w:proofErr w:type="spellStart"/>
+                    <w:r>
+                      <w:rPr>
+                        <w:rStyle w:val="Hyperlink"/>
+                        <w:color w:val="7F7F7F" w:themeColor="text1" w:themeTint="80"/>
+                        <w:u w:val="none"/>
+                      </w:rPr>
+                      <w:t>alexderieux</w:t>
+                    </w:r>
+                    <w:proofErr w:type="spellEnd"/>
                   </w:hyperlink>
                 </w:p>
               </w:tc>
@@ -2960,8 +3034,13 @@
                     <w:pStyle w:val="Heading2"/>
                     <w:keepNext w:val="0"/>
                   </w:pPr>
-                  <w:r>
-                    <w:t>SmartStockRL: Intelligent Stock Trading using Traditional and Deep Q-Learning</w:t>
+                  <w:proofErr w:type="spellStart"/>
+                  <w:r>
+                    <w:t>SmartStockRL</w:t>
+                  </w:r>
+                  <w:proofErr w:type="spellEnd"/>
+                  <w:r>
+                    <w:t>: Intelligent Stock Trading using Traditional and Deep Q-Learning</w:t>
                   </w:r>
                 </w:p>
               </w:tc>
@@ -3076,8 +3155,13 @@
                     <w:pStyle w:val="Heading2"/>
                     <w:keepNext w:val="0"/>
                   </w:pPr>
-                  <w:r>
-                    <w:t>LyricAI: Using LSTMs to Write Religious Music</w:t>
+                  <w:proofErr w:type="spellStart"/>
+                  <w:r>
+                    <w:t>LyricAI</w:t>
+                  </w:r>
+                  <w:proofErr w:type="spellEnd"/>
+                  <w:r>
+                    <w:t>: Using LSTMs to Write Religious Music</w:t>
                   </w:r>
                 </w:p>
               </w:tc>
@@ -3486,7 +3570,23 @@
                   </w:r>
                   <w:proofErr w:type="gramEnd"/>
                   <w:r>
-                    <w:t xml:space="preserve"> RTL-SDR receiver system called ‘RadioPi’ to process local FM transmissions. Signal processing algorithms are written in Python using GNURadio API and custom signal blocks. Design elements include the Raspberry Pi, USB RTL-SDR antenna, and breadboard circuitry for user interface.</w:t>
+                    <w:t xml:space="preserve"> RTL-SDR receiver system called ‘</w:t>
+                  </w:r>
+                  <w:proofErr w:type="spellStart"/>
+                  <w:r>
+                    <w:t>RadioPi</w:t>
+                  </w:r>
+                  <w:proofErr w:type="spellEnd"/>
+                  <w:r>
+                    <w:t xml:space="preserve">’ to process local FM transmissions. Signal processing algorithms are written in Python using </w:t>
+                  </w:r>
+                  <w:proofErr w:type="spellStart"/>
+                  <w:r>
+                    <w:t>GNURadio</w:t>
+                  </w:r>
+                  <w:proofErr w:type="spellEnd"/>
+                  <w:r>
+                    <w:t xml:space="preserve"> API and custom signal blocks. Design elements include the Raspberry Pi, USB RTL-SDR antenna, and breadboard circuitry for user interface.</w:t>
                   </w:r>
                 </w:p>
               </w:tc>
@@ -3972,8 +4072,13 @@
                   <w:r>
                     <w:t xml:space="preserve">/ </w:t>
                   </w:r>
-                  <w:r>
-                    <w:t xml:space="preserve">PyTorch </w:t>
+                  <w:proofErr w:type="spellStart"/>
+                  <w:r>
+                    <w:t>PyTorch</w:t>
+                  </w:r>
+                  <w:proofErr w:type="spellEnd"/>
+                  <w:r>
+                    <w:t xml:space="preserve"> </w:t>
                   </w:r>
                   <w:r>
                     <w:t>/</w:t>
@@ -3988,35 +4093,76 @@
                     <w:br/>
                     <w:t xml:space="preserve">/ </w:t>
                   </w:r>
-                  <w:r>
-                    <w:t>Qiskit / Cirq / PennyLane</w:t>
-                  </w:r>
+                  <w:proofErr w:type="spellStart"/>
+                  <w:r>
+                    <w:t>Qiskit</w:t>
+                  </w:r>
+                  <w:proofErr w:type="spellEnd"/>
+                  <w:r>
+                    <w:t xml:space="preserve"> / Cirq / PennyLane / TensorFlow Quantum / Torch Quantum</w:t>
+                  </w:r>
+                  <w:r>
+                    <w:br/>
+                  </w:r>
+                  <w:r>
+                    <w:t xml:space="preserve">/ </w:t>
+                  </w:r>
+                  <w:r>
+                    <w:t xml:space="preserve">NumPy / Pandas / SciPy / Scikit-Learn / Matplotlib / Seaborn / Flask / </w:t>
+                  </w:r>
+                  <w:proofErr w:type="spellStart"/>
+                  <w:r>
+                    <w:t>NetworkX</w:t>
+                  </w:r>
+                  <w:proofErr w:type="spellEnd"/>
+                  <w:r>
+                    <w:t xml:space="preserve"> </w:t>
+                  </w:r>
+                  <w:r>
+                    <w:br/>
+                  </w:r>
+                  <w:r>
+                    <w:t xml:space="preserve">/ </w:t>
+                  </w:r>
+                  <w:proofErr w:type="spellStart"/>
+                  <w:r>
+                    <w:t>BeautifulSoup</w:t>
+                  </w:r>
+                  <w:proofErr w:type="spellEnd"/>
+                  <w:r>
+                    <w:t xml:space="preserve"> / OpenCV / Pillow / </w:t>
+                  </w:r>
+                  <w:proofErr w:type="spellStart"/>
+                  <w:r>
+                    <w:t>PyQt</w:t>
+                  </w:r>
+                  <w:proofErr w:type="spellEnd"/>
                   <w:r>
                     <w:t xml:space="preserve"> / </w:t>
                   </w:r>
-                  <w:r>
-                    <w:t>TensorFlow Quantum</w:t>
-                  </w:r>
+                  <w:proofErr w:type="spellStart"/>
+                  <w:r>
+                    <w:t>Pytest</w:t>
+                  </w:r>
+                  <w:proofErr w:type="spellEnd"/>
                   <w:r>
                     <w:t xml:space="preserve"> / </w:t>
                   </w:r>
-                  <w:r>
-                    <w:t>Torch Quantum</w:t>
-                  </w:r>
-                  <w:r>
-                    <w:br/>
-                  </w:r>
-                  <w:r>
-                    <w:t xml:space="preserve">/ </w:t>
-                  </w:r>
-                  <w:r>
-                    <w:t xml:space="preserve">NumPy / Pandas / SciPy / Scikit-Learn / Matplotlib / Seaborn / Flask / NetworkX </w:t>
-                  </w:r>
-                  <w:r>
-                    <w:br/>
-                  </w:r>
-                  <w:r>
-                    <w:t>/ BeautifulSoup / OpenCV / Pillow / PyQt / Pytest / Pipenv / Pyenv / Requests</w:t>
+                  <w:proofErr w:type="spellStart"/>
+                  <w:r>
+                    <w:t>Pipenv</w:t>
+                  </w:r>
+                  <w:proofErr w:type="spellEnd"/>
+                  <w:r>
+                    <w:t xml:space="preserve"> / </w:t>
+                  </w:r>
+                  <w:proofErr w:type="spellStart"/>
+                  <w:r>
+                    <w:t>Pyenv</w:t>
+                  </w:r>
+                  <w:proofErr w:type="spellEnd"/>
+                  <w:r>
+                    <w:t xml:space="preserve"> / Requests</w:t>
                   </w:r>
                   <w:r>
                     <w:t xml:space="preserve"> </w:t>
@@ -4298,7 +4444,15 @@
                     <w:t>Microservices</w:t>
                   </w:r>
                   <w:r>
-                    <w:t>:  Docker / Singularity / Podman / Kubernetes</w:t>
+                    <w:t xml:space="preserve">:  Docker / Singularity / </w:t>
+                  </w:r>
+                  <w:proofErr w:type="spellStart"/>
+                  <w:r>
+                    <w:t>Podman</w:t>
+                  </w:r>
+                  <w:proofErr w:type="spellEnd"/>
+                  <w:r>
+                    <w:t xml:space="preserve"> / Kubernetes</w:t>
                   </w:r>
                 </w:p>
                 <w:p>
@@ -4357,7 +4511,15 @@
                     <w:t xml:space="preserve"> </w:t>
                   </w:r>
                   <w:r>
-                    <w:t xml:space="preserve"> InfluxDB / MongoDB / MySQL / SQLite </w:t>
+                    <w:t xml:space="preserve"> </w:t>
+                  </w:r>
+                  <w:proofErr w:type="spellStart"/>
+                  <w:r>
+                    <w:t>InfluxDB</w:t>
+                  </w:r>
+                  <w:proofErr w:type="spellEnd"/>
+                  <w:r>
+                    <w:t xml:space="preserve"> / MongoDB / MySQL / SQLite </w:t>
                   </w:r>
                   <w:r>
                     <w:br/>
@@ -4365,8 +4527,13 @@
                   <w:r>
                     <w:t xml:space="preserve">/ </w:t>
                   </w:r>
-                  <w:r>
-                    <w:t xml:space="preserve">GraphQL / </w:t>
+                  <w:proofErr w:type="spellStart"/>
+                  <w:r>
+                    <w:t>GraphQL</w:t>
+                  </w:r>
+                  <w:proofErr w:type="spellEnd"/>
+                  <w:r>
+                    <w:t xml:space="preserve"> / </w:t>
                   </w:r>
                   <w:r>
                     <w:t>Redis</w:t>
@@ -4653,8 +4820,13 @@
               <w:pStyle w:val="Heading2"/>
               <w:ind w:left="-13"/>
             </w:pPr>
-            <w:r>
-              <w:t xml:space="preserve">Eta Kappa Nu </w:t>
+            <w:proofErr w:type="spellStart"/>
+            <w:r>
+              <w:t>Eta</w:t>
+            </w:r>
+            <w:proofErr w:type="spellEnd"/>
+            <w:r>
+              <w:t xml:space="preserve"> Kappa Nu </w:t>
             </w:r>
             <w:r>
               <w:t xml:space="preserve">(Electrical Engineering Honor </w:t>
@@ -4673,140 +4845,143 @@
                 <w:sz w:val="16"/>
                 <w:szCs w:val="24"/>
               </w:rPr>
-              <w:t>[ 2021 – Present ]</w:t>
-            </w:r>
-          </w:p>
-          <w:p>
-            <w:pPr>
-              <w:pStyle w:val="Heading2"/>
-              <w:ind w:left="-13"/>
-            </w:pPr>
+              <w:t xml:space="preserve">[ 2021 – </w:t>
+            </w:r>
             <w:proofErr w:type="gramStart"/>
-            <w:r>
-              <w:t xml:space="preserve">IEEE  </w:t>
-            </w:r>
             <w:r>
               <w:rPr>
                 <w:color w:val="4F81BD" w:themeColor="accent1"/>
                 <w:sz w:val="16"/>
                 <w:szCs w:val="24"/>
               </w:rPr>
-              <w:t>[</w:t>
+              <w:t>Present ]</w:t>
             </w:r>
             <w:proofErr w:type="gramEnd"/>
+          </w:p>
+          <w:p>
+            <w:pPr>
+              <w:pStyle w:val="Heading2"/>
+              <w:ind w:left="-13"/>
+            </w:pPr>
+            <w:proofErr w:type="gramStart"/>
+            <w:r>
+              <w:t xml:space="preserve">IEEE  </w:t>
+            </w:r>
             <w:r>
               <w:rPr>
                 <w:color w:val="4F81BD" w:themeColor="accent1"/>
                 <w:sz w:val="16"/>
                 <w:szCs w:val="24"/>
               </w:rPr>
-              <w:t xml:space="preserve"> 2021 – Present ]</w:t>
-            </w:r>
-          </w:p>
-        </w:tc>
-      </w:tr>
-      <w:tr>
-        <w:tc>
-          <w:tcPr>
-            <w:tcW w:w="458" w:type="pct"/>
-          </w:tcPr>
-          <w:p>
-            <w:pPr>
-              <w:pStyle w:val="Heading1"/>
-              <w:keepNext w:val="0"/>
-              <w:rPr>
-                <w:sz w:val="10"/>
-                <w:szCs w:val="10"/>
-              </w:rPr>
-            </w:pPr>
-          </w:p>
-        </w:tc>
-        <w:tc>
-          <w:tcPr>
-            <w:tcW w:w="86" w:type="pct"/>
-          </w:tcPr>
-          <w:p>
-            <w:pPr>
-              <w:rPr>
-                <w:sz w:val="10"/>
-                <w:szCs w:val="10"/>
-              </w:rPr>
-            </w:pPr>
-          </w:p>
-        </w:tc>
-        <w:tc>
-          <w:tcPr>
-            <w:tcW w:w="4456" w:type="pct"/>
-          </w:tcPr>
-          <w:p>
-            <w:pPr>
-              <w:rPr>
-                <w:sz w:val="10"/>
-                <w:szCs w:val="10"/>
-              </w:rPr>
-            </w:pPr>
-          </w:p>
-        </w:tc>
-      </w:tr>
-      <w:tr>
-        <w:tc>
-          <w:tcPr>
-            <w:tcW w:w="458" w:type="pct"/>
-          </w:tcPr>
-          <w:p>
-            <w:pPr>
-              <w:pStyle w:val="Heading1"/>
-              <w:keepNext w:val="0"/>
-            </w:pPr>
-            <w:r>
-              <w:t>Honors &amp; Awards</w:t>
-            </w:r>
-          </w:p>
-        </w:tc>
-        <w:tc>
-          <w:tcPr>
-            <w:tcW w:w="86" w:type="pct"/>
-          </w:tcPr>
-          <w:p/>
-        </w:tc>
-        <w:tc>
-          <w:tcPr>
-            <w:tcW w:w="4456" w:type="pct"/>
-          </w:tcPr>
-          <w:p>
-            <w:pPr>
-              <w:pStyle w:val="Heading2"/>
-              <w:ind w:left="-13"/>
-            </w:pPr>
-            <w:r>
-              <w:t xml:space="preserve">Bradley </w:t>
-            </w:r>
-            <w:proofErr w:type="gramStart"/>
-            <w:r>
-              <w:t>Fellowship</w:t>
-            </w:r>
-            <w:r>
-              <w:t xml:space="preserve"> </w:t>
-            </w:r>
-            <w:r>
-              <w:t xml:space="preserve"> </w:t>
-            </w:r>
+              <w:t>[</w:t>
+            </w:r>
+            <w:proofErr w:type="gramEnd"/>
             <w:r>
               <w:rPr>
                 <w:color w:val="4F81BD" w:themeColor="accent1"/>
                 <w:sz w:val="16"/>
                 <w:szCs w:val="24"/>
               </w:rPr>
-              <w:t>[</w:t>
-            </w:r>
-            <w:proofErr w:type="gramEnd"/>
+              <w:t xml:space="preserve"> 2021 – </w:t>
+            </w:r>
+            <w:proofErr w:type="gramStart"/>
             <w:r>
               <w:rPr>
                 <w:color w:val="4F81BD" w:themeColor="accent1"/>
                 <w:sz w:val="16"/>
                 <w:szCs w:val="24"/>
               </w:rPr>
-              <w:t xml:space="preserve"> 202</w:t>
+              <w:t>Present ]</w:t>
+            </w:r>
+            <w:proofErr w:type="gramEnd"/>
+          </w:p>
+        </w:tc>
+      </w:tr>
+      <w:tr>
+        <w:tc>
+          <w:tcPr>
+            <w:tcW w:w="458" w:type="pct"/>
+          </w:tcPr>
+          <w:p>
+            <w:pPr>
+              <w:pStyle w:val="Heading1"/>
+              <w:keepNext w:val="0"/>
+              <w:rPr>
+                <w:sz w:val="10"/>
+                <w:szCs w:val="10"/>
+              </w:rPr>
+            </w:pPr>
+          </w:p>
+        </w:tc>
+        <w:tc>
+          <w:tcPr>
+            <w:tcW w:w="86" w:type="pct"/>
+          </w:tcPr>
+          <w:p>
+            <w:pPr>
+              <w:rPr>
+                <w:sz w:val="10"/>
+                <w:szCs w:val="10"/>
+              </w:rPr>
+            </w:pPr>
+          </w:p>
+        </w:tc>
+        <w:tc>
+          <w:tcPr>
+            <w:tcW w:w="4456" w:type="pct"/>
+          </w:tcPr>
+          <w:p>
+            <w:pPr>
+              <w:rPr>
+                <w:sz w:val="10"/>
+                <w:szCs w:val="10"/>
+              </w:rPr>
+            </w:pPr>
+          </w:p>
+        </w:tc>
+      </w:tr>
+      <w:tr>
+        <w:tc>
+          <w:tcPr>
+            <w:tcW w:w="458" w:type="pct"/>
+          </w:tcPr>
+          <w:p>
+            <w:pPr>
+              <w:pStyle w:val="Heading1"/>
+              <w:keepNext w:val="0"/>
+            </w:pPr>
+            <w:r>
+              <w:t>Honors &amp; Awards</w:t>
+            </w:r>
+          </w:p>
+        </w:tc>
+        <w:tc>
+          <w:tcPr>
+            <w:tcW w:w="86" w:type="pct"/>
+          </w:tcPr>
+          <w:p/>
+        </w:tc>
+        <w:tc>
+          <w:tcPr>
+            <w:tcW w:w="4456" w:type="pct"/>
+          </w:tcPr>
+          <w:p>
+            <w:pPr>
+              <w:pStyle w:val="Heading2"/>
+              <w:ind w:left="-13"/>
+            </w:pPr>
+            <w:r>
+              <w:t xml:space="preserve">Bradley </w:t>
+            </w:r>
+            <w:proofErr w:type="gramStart"/>
+            <w:r>
+              <w:t>Fellowship</w:t>
+            </w:r>
+            <w:r>
+              <w:t xml:space="preserve"> </w:t>
+            </w:r>
+            <w:r>
+              <w:t xml:space="preserve"> </w:t>
             </w:r>
             <w:r>
               <w:rPr>
@@ -4814,16 +4989,43 @@
                 <w:sz w:val="16"/>
                 <w:szCs w:val="24"/>
               </w:rPr>
-              <w:t>2</w:t>
-            </w:r>
+              <w:t>[</w:t>
+            </w:r>
+            <w:proofErr w:type="gramEnd"/>
             <w:r>
               <w:rPr>
                 <w:color w:val="4F81BD" w:themeColor="accent1"/>
                 <w:sz w:val="16"/>
                 <w:szCs w:val="24"/>
               </w:rPr>
-              <w:t xml:space="preserve"> – Present ]</w:t>
-            </w:r>
+              <w:t xml:space="preserve"> 202</w:t>
+            </w:r>
+            <w:r>
+              <w:rPr>
+                <w:color w:val="4F81BD" w:themeColor="accent1"/>
+                <w:sz w:val="16"/>
+                <w:szCs w:val="24"/>
+              </w:rPr>
+              <w:t>2</w:t>
+            </w:r>
+            <w:r>
+              <w:rPr>
+                <w:color w:val="4F81BD" w:themeColor="accent1"/>
+                <w:sz w:val="16"/>
+                <w:szCs w:val="24"/>
+              </w:rPr>
+              <w:t xml:space="preserve"> – </w:t>
+            </w:r>
+            <w:proofErr w:type="gramStart"/>
+            <w:r>
+              <w:rPr>
+                <w:color w:val="4F81BD" w:themeColor="accent1"/>
+                <w:sz w:val="16"/>
+                <w:szCs w:val="24"/>
+              </w:rPr>
+              <w:t>Present ]</w:t>
+            </w:r>
+            <w:proofErr w:type="gramEnd"/>
           </w:p>
           <w:p>
             <w:pPr>
@@ -5775,7 +5977,7 @@
 </file>
 
 <file path=word/endnotes.xml><?xml version="1.0" encoding="utf-8"?>
-<w:endnotes xmlns:wpc="http://schemas.microsoft.com/office/word/2010/wordprocessingCanvas" xmlns:cx="http://schemas.microsoft.com/office/drawing/2014/chartex" xmlns:cx1="http://schemas.microsoft.com/office/drawing/2015/9/8/chartex" xmlns:cx2="http://schemas.microsoft.com/office/drawing/2015/10/21/chartex" xmlns:cx3="http://schemas.microsoft.com/office/drawing/2016/5/9/chartex" xmlns:cx4="http://schemas.microsoft.com/office/drawing/2016/5/10/chartex" xmlns:cx5="http://schemas.microsoft.com/office/drawing/2016/5/11/chartex" xmlns:cx6="http://schemas.microsoft.com/office/drawing/2016/5/12/chartex" xmlns:cx7="http://schemas.microsoft.com/office/drawing/2016/5/13/chartex" xmlns:cx8="http://schemas.microsoft.com/office/drawing/2016/5/14/chartex" xmlns:mc="http://schemas.openxmlformats.org/markup-compatibility/2006" xmlns:aink="http://schemas.microsoft.com/office/drawing/2016/ink" xmlns:am3d="http://schemas.microsoft.com/office/drawing/2017/model3d" xmlns:o="urn:schemas-microsoft-com:office:office" xmlns:oel="http://schemas.microsoft.com/office/2019/extlst" xmlns:r="http://schemas.openxmlformats.org/officeDocument/2006/relationships" xmlns:m="http://schemas.openxmlformats.org/officeDocument/2006/math" xmlns:v="urn:schemas-microsoft-com:vml" xmlns:wp14="http://schemas.microsoft.com/office/word/2010/wordprocessingDrawing" xmlns:wp="http://schemas.openxmlformats.org/drawingml/2006/wordprocessingDrawing" xmlns:w10="urn:schemas-microsoft-com:office:word" xmlns:w="http://schemas.openxmlformats.org/wordprocessingml/2006/main" xmlns:w14="http://schemas.microsoft.com/office/word/2010/wordml" xmlns:w15="http://schemas.microsoft.com/office/word/2012/wordml" xmlns:w16cex="http://schemas.microsoft.com/office/word/2018/wordml/cex" xmlns:w16cid="http://schemas.microsoft.com/office/word/2016/wordml/cid" xmlns:w16="http://schemas.microsoft.com/office/word/2018/wordml" xmlns:w16sdtdh="http://schemas.microsoft.com/office/word/2020/wordml/sdtdatahash" xmlns:w16se="http://schemas.microsoft.com/office/word/2015/wordml/symex" xmlns:wpg="http://schemas.microsoft.com/office/word/2010/wordprocessingGroup" xmlns:wpi="http://schemas.microsoft.com/office/word/2010/wordprocessingInk" xmlns:wne="http://schemas.microsoft.com/office/word/2006/wordml" xmlns:wps="http://schemas.microsoft.com/office/word/2010/wordprocessingShape" mc:Ignorable="w14 w15 w16se w16cid w16 w16cex w16sdtdh wp14">
+<w:endnotes xmlns:wpc="http://schemas.microsoft.com/office/word/2010/wordprocessingCanvas" xmlns:cx="http://schemas.microsoft.com/office/drawing/2014/chartex" xmlns:cx1="http://schemas.microsoft.com/office/drawing/2015/9/8/chartex" xmlns:cx2="http://schemas.microsoft.com/office/drawing/2015/10/21/chartex" xmlns:cx3="http://schemas.microsoft.com/office/drawing/2016/5/9/chartex" xmlns:cx4="http://schemas.microsoft.com/office/drawing/2016/5/10/chartex" xmlns:cx5="http://schemas.microsoft.com/office/drawing/2016/5/11/chartex" xmlns:cx6="http://schemas.microsoft.com/office/drawing/2016/5/12/chartex" xmlns:cx7="http://schemas.microsoft.com/office/drawing/2016/5/13/chartex" xmlns:cx8="http://schemas.microsoft.com/office/drawing/2016/5/14/chartex" xmlns:mc="http://schemas.openxmlformats.org/markup-compatibility/2006" xmlns:aink="http://schemas.microsoft.com/office/drawing/2016/ink" xmlns:am3d="http://schemas.microsoft.com/office/drawing/2017/model3d" xmlns:o="urn:schemas-microsoft-com:office:office" xmlns:oel="http://schemas.microsoft.com/office/2019/extlst" xmlns:r="http://schemas.openxmlformats.org/officeDocument/2006/relationships" xmlns:m="http://schemas.openxmlformats.org/officeDocument/2006/math" xmlns:v="urn:schemas-microsoft-com:vml" xmlns:wp14="http://schemas.microsoft.com/office/word/2010/wordprocessingDrawing" xmlns:wp="http://schemas.openxmlformats.org/drawingml/2006/wordprocessingDrawing" xmlns:w10="urn:schemas-microsoft-com:office:word" xmlns:w="http://schemas.openxmlformats.org/wordprocessingml/2006/main" xmlns:w14="http://schemas.microsoft.com/office/word/2010/wordml" xmlns:w15="http://schemas.microsoft.com/office/word/2012/wordml" xmlns:w16cex="http://schemas.microsoft.com/office/word/2018/wordml/cex" xmlns:w16cid="http://schemas.microsoft.com/office/word/2016/wordml/cid" xmlns:w16="http://schemas.microsoft.com/office/word/2018/wordml" xmlns:w16du="http://schemas.microsoft.com/office/word/2023/wordml/word16du" xmlns:w16sdtdh="http://schemas.microsoft.com/office/word/2020/wordml/sdtdatahash" xmlns:w16sdtfl="http://schemas.microsoft.com/office/word/2024/wordml/sdtformatlock" xmlns:w16se="http://schemas.microsoft.com/office/word/2015/wordml/symex" xmlns:wpg="http://schemas.microsoft.com/office/word/2010/wordprocessingGroup" xmlns:wpi="http://schemas.microsoft.com/office/word/2010/wordprocessingInk" xmlns:wne="http://schemas.microsoft.com/office/word/2006/wordml" xmlns:wps="http://schemas.microsoft.com/office/word/2010/wordprocessingShape" mc:Ignorable="w14 w15 w16se w16cid w16 w16cex w16sdtdh w16sdtfl w16du wp14">
   <w:endnote w:type="separator" w:id="-1">
     <w:p>
       <w:r>
@@ -5794,7 +5996,7 @@
 </file>
 
 <file path=word/footnotes.xml><?xml version="1.0" encoding="utf-8"?>
-<w:footnotes xmlns:wpc="http://schemas.microsoft.com/office/word/2010/wordprocessingCanvas" xmlns:cx="http://schemas.microsoft.com/office/drawing/2014/chartex" xmlns:cx1="http://schemas.microsoft.com/office/drawing/2015/9/8/chartex" xmlns:cx2="http://schemas.microsoft.com/office/drawing/2015/10/21/chartex" xmlns:cx3="http://schemas.microsoft.com/office/drawing/2016/5/9/chartex" xmlns:cx4="http://schemas.microsoft.com/office/drawing/2016/5/10/chartex" xmlns:cx5="http://schemas.microsoft.com/office/drawing/2016/5/11/chartex" xmlns:cx6="http://schemas.microsoft.com/office/drawing/2016/5/12/chartex" xmlns:cx7="http://schemas.microsoft.com/office/drawing/2016/5/13/chartex" xmlns:cx8="http://schemas.microsoft.com/office/drawing/2016/5/14/chartex" xmlns:mc="http://schemas.openxmlformats.org/markup-compatibility/2006" xmlns:aink="http://schemas.microsoft.com/office/drawing/2016/ink" xmlns:am3d="http://schemas.microsoft.com/office/drawing/2017/model3d" xmlns:o="urn:schemas-microsoft-com:office:office" xmlns:oel="http://schemas.microsoft.com/office/2019/extlst" xmlns:r="http://schemas.openxmlformats.org/officeDocument/2006/relationships" xmlns:m="http://schemas.openxmlformats.org/officeDocument/2006/math" xmlns:v="urn:schemas-microsoft-com:vml" xmlns:wp14="http://schemas.microsoft.com/office/word/2010/wordprocessingDrawing" xmlns:wp="http://schemas.openxmlformats.org/drawingml/2006/wordprocessingDrawing" xmlns:w10="urn:schemas-microsoft-com:office:word" xmlns:w="http://schemas.openxmlformats.org/wordprocessingml/2006/main" xmlns:w14="http://schemas.microsoft.com/office/word/2010/wordml" xmlns:w15="http://schemas.microsoft.com/office/word/2012/wordml" xmlns:w16cex="http://schemas.microsoft.com/office/word/2018/wordml/cex" xmlns:w16cid="http://schemas.microsoft.com/office/word/2016/wordml/cid" xmlns:w16="http://schemas.microsoft.com/office/word/2018/wordml" xmlns:w16sdtdh="http://schemas.microsoft.com/office/word/2020/wordml/sdtdatahash" xmlns:w16se="http://schemas.microsoft.com/office/word/2015/wordml/symex" xmlns:wpg="http://schemas.microsoft.com/office/word/2010/wordprocessingGroup" xmlns:wpi="http://schemas.microsoft.com/office/word/2010/wordprocessingInk" xmlns:wne="http://schemas.microsoft.com/office/word/2006/wordml" xmlns:wps="http://schemas.microsoft.com/office/word/2010/wordprocessingShape" mc:Ignorable="w14 w15 w16se w16cid w16 w16cex w16sdtdh wp14">
+<w:footnotes xmlns:wpc="http://schemas.microsoft.com/office/word/2010/wordprocessingCanvas" xmlns:cx="http://schemas.microsoft.com/office/drawing/2014/chartex" xmlns:cx1="http://schemas.microsoft.com/office/drawing/2015/9/8/chartex" xmlns:cx2="http://schemas.microsoft.com/office/drawing/2015/10/21/chartex" xmlns:cx3="http://schemas.microsoft.com/office/drawing/2016/5/9/chartex" xmlns:cx4="http://schemas.microsoft.com/office/drawing/2016/5/10/chartex" xmlns:cx5="http://schemas.microsoft.com/office/drawing/2016/5/11/chartex" xmlns:cx6="http://schemas.microsoft.com/office/drawing/2016/5/12/chartex" xmlns:cx7="http://schemas.microsoft.com/office/drawing/2016/5/13/chartex" xmlns:cx8="http://schemas.microsoft.com/office/drawing/2016/5/14/chartex" xmlns:mc="http://schemas.openxmlformats.org/markup-compatibility/2006" xmlns:aink="http://schemas.microsoft.com/office/drawing/2016/ink" xmlns:am3d="http://schemas.microsoft.com/office/drawing/2017/model3d" xmlns:o="urn:schemas-microsoft-com:office:office" xmlns:oel="http://schemas.microsoft.com/office/2019/extlst" xmlns:r="http://schemas.openxmlformats.org/officeDocument/2006/relationships" xmlns:m="http://schemas.openxmlformats.org/officeDocument/2006/math" xmlns:v="urn:schemas-microsoft-com:vml" xmlns:wp14="http://schemas.microsoft.com/office/word/2010/wordprocessingDrawing" xmlns:wp="http://schemas.openxmlformats.org/drawingml/2006/wordprocessingDrawing" xmlns:w10="urn:schemas-microsoft-com:office:word" xmlns:w="http://schemas.openxmlformats.org/wordprocessingml/2006/main" xmlns:w14="http://schemas.microsoft.com/office/word/2010/wordml" xmlns:w15="http://schemas.microsoft.com/office/word/2012/wordml" xmlns:w16cex="http://schemas.microsoft.com/office/word/2018/wordml/cex" xmlns:w16cid="http://schemas.microsoft.com/office/word/2016/wordml/cid" xmlns:w16="http://schemas.microsoft.com/office/word/2018/wordml" xmlns:w16du="http://schemas.microsoft.com/office/word/2023/wordml/word16du" xmlns:w16sdtdh="http://schemas.microsoft.com/office/word/2020/wordml/sdtdatahash" xmlns:w16sdtfl="http://schemas.microsoft.com/office/word/2024/wordml/sdtformatlock" xmlns:w16se="http://schemas.microsoft.com/office/word/2015/wordml/symex" xmlns:wpg="http://schemas.microsoft.com/office/word/2010/wordprocessingGroup" xmlns:wpi="http://schemas.microsoft.com/office/word/2010/wordprocessingInk" xmlns:wne="http://schemas.microsoft.com/office/word/2006/wordml" xmlns:wps="http://schemas.microsoft.com/office/word/2010/wordprocessingShape" mc:Ignorable="w14 w15 w16se w16cid w16 w16cex w16sdtdh w16sdtfl w16du wp14">
   <w:footnote w:type="separator" w:id="-1">
     <w:p>
       <w:r>
@@ -5813,7 +6015,7 @@
 </file>
 
 <file path=word/header1.xml><?xml version="1.0" encoding="utf-8"?>
-<w:hdr xmlns:wpc="http://schemas.microsoft.com/office/word/2010/wordprocessingCanvas" xmlns:cx="http://schemas.microsoft.com/office/drawing/2014/chartex" xmlns:cx1="http://schemas.microsoft.com/office/drawing/2015/9/8/chartex" xmlns:cx2="http://schemas.microsoft.com/office/drawing/2015/10/21/chartex" xmlns:cx3="http://schemas.microsoft.com/office/drawing/2016/5/9/chartex" xmlns:cx4="http://schemas.microsoft.com/office/drawing/2016/5/10/chartex" xmlns:cx5="http://schemas.microsoft.com/office/drawing/2016/5/11/chartex" xmlns:cx6="http://schemas.microsoft.com/office/drawing/2016/5/12/chartex" xmlns:cx7="http://schemas.microsoft.com/office/drawing/2016/5/13/chartex" xmlns:cx8="http://schemas.microsoft.com/office/drawing/2016/5/14/chartex" xmlns:mc="http://schemas.openxmlformats.org/markup-compatibility/2006" xmlns:aink="http://schemas.microsoft.com/office/drawing/2016/ink" xmlns:am3d="http://schemas.microsoft.com/office/drawing/2017/model3d" xmlns:o="urn:schemas-microsoft-com:office:office" xmlns:oel="http://schemas.microsoft.com/office/2019/extlst" xmlns:r="http://schemas.openxmlformats.org/officeDocument/2006/relationships" xmlns:m="http://schemas.openxmlformats.org/officeDocument/2006/math" xmlns:v="urn:schemas-microsoft-com:vml" xmlns:wp14="http://schemas.microsoft.com/office/word/2010/wordprocessingDrawing" xmlns:wp="http://schemas.openxmlformats.org/drawingml/2006/wordprocessingDrawing" xmlns:w10="urn:schemas-microsoft-com:office:word" xmlns:w="http://schemas.openxmlformats.org/wordprocessingml/2006/main" xmlns:w14="http://schemas.microsoft.com/office/word/2010/wordml" xmlns:w15="http://schemas.microsoft.com/office/word/2012/wordml" xmlns:w16cex="http://schemas.microsoft.com/office/word/2018/wordml/cex" xmlns:w16cid="http://schemas.microsoft.com/office/word/2016/wordml/cid" xmlns:w16="http://schemas.microsoft.com/office/word/2018/wordml" xmlns:w16sdtdh="http://schemas.microsoft.com/office/word/2020/wordml/sdtdatahash" xmlns:w16se="http://schemas.microsoft.com/office/word/2015/wordml/symex" xmlns:wpg="http://schemas.microsoft.com/office/word/2010/wordprocessingGroup" xmlns:wpi="http://schemas.microsoft.com/office/word/2010/wordprocessingInk" xmlns:wne="http://schemas.microsoft.com/office/word/2006/wordml" xmlns:wps="http://schemas.microsoft.com/office/word/2010/wordprocessingShape" mc:Ignorable="w14 w15 w16se w16cid w16 w16cex w16sdtdh wp14">
+<w:hdr xmlns:wpc="http://schemas.microsoft.com/office/word/2010/wordprocessingCanvas" xmlns:cx="http://schemas.microsoft.com/office/drawing/2014/chartex" xmlns:cx1="http://schemas.microsoft.com/office/drawing/2015/9/8/chartex" xmlns:cx2="http://schemas.microsoft.com/office/drawing/2015/10/21/chartex" xmlns:cx3="http://schemas.microsoft.com/office/drawing/2016/5/9/chartex" xmlns:cx4="http://schemas.microsoft.com/office/drawing/2016/5/10/chartex" xmlns:cx5="http://schemas.microsoft.com/office/drawing/2016/5/11/chartex" xmlns:cx6="http://schemas.microsoft.com/office/drawing/2016/5/12/chartex" xmlns:cx7="http://schemas.microsoft.com/office/drawing/2016/5/13/chartex" xmlns:cx8="http://schemas.microsoft.com/office/drawing/2016/5/14/chartex" xmlns:mc="http://schemas.openxmlformats.org/markup-compatibility/2006" xmlns:aink="http://schemas.microsoft.com/office/drawing/2016/ink" xmlns:am3d="http://schemas.microsoft.com/office/drawing/2017/model3d" xmlns:o="urn:schemas-microsoft-com:office:office" xmlns:oel="http://schemas.microsoft.com/office/2019/extlst" xmlns:r="http://schemas.openxmlformats.org/officeDocument/2006/relationships" xmlns:m="http://schemas.openxmlformats.org/officeDocument/2006/math" xmlns:v="urn:schemas-microsoft-com:vml" xmlns:wp14="http://schemas.microsoft.com/office/word/2010/wordprocessingDrawing" xmlns:wp="http://schemas.openxmlformats.org/drawingml/2006/wordprocessingDrawing" xmlns:w10="urn:schemas-microsoft-com:office:word" xmlns:w="http://schemas.openxmlformats.org/wordprocessingml/2006/main" xmlns:w14="http://schemas.microsoft.com/office/word/2010/wordml" xmlns:w15="http://schemas.microsoft.com/office/word/2012/wordml" xmlns:w16cex="http://schemas.microsoft.com/office/word/2018/wordml/cex" xmlns:w16cid="http://schemas.microsoft.com/office/word/2016/wordml/cid" xmlns:w16="http://schemas.microsoft.com/office/word/2018/wordml" xmlns:w16du="http://schemas.microsoft.com/office/word/2023/wordml/word16du" xmlns:w16sdtdh="http://schemas.microsoft.com/office/word/2020/wordml/sdtdatahash" xmlns:w16sdtfl="http://schemas.microsoft.com/office/word/2024/wordml/sdtformatlock" xmlns:w16se="http://schemas.microsoft.com/office/word/2015/wordml/symex" xmlns:wpg="http://schemas.microsoft.com/office/word/2010/wordprocessingGroup" xmlns:wpi="http://schemas.microsoft.com/office/word/2010/wordprocessingInk" xmlns:wne="http://schemas.microsoft.com/office/word/2006/wordml" xmlns:wps="http://schemas.microsoft.com/office/word/2010/wordprocessingShape" mc:Ignorable="w14 w15 w16se w16cid w16 w16cex w16sdtdh w16sdtfl w16du wp14">
   <w:p>
     <w:pPr>
       <w:pStyle w:val="Header"/>
@@ -5879,7 +6081,7 @@
 </file>
 
 <file path=word/numbering.xml><?xml version="1.0" encoding="utf-8"?>
-<w:numbering xmlns:wpc="http://schemas.microsoft.com/office/word/2010/wordprocessingCanvas" xmlns:cx="http://schemas.microsoft.com/office/drawing/2014/chartex" xmlns:cx1="http://schemas.microsoft.com/office/drawing/2015/9/8/chartex" xmlns:cx2="http://schemas.microsoft.com/office/drawing/2015/10/21/chartex" xmlns:cx3="http://schemas.microsoft.com/office/drawing/2016/5/9/chartex" xmlns:cx4="http://schemas.microsoft.com/office/drawing/2016/5/10/chartex" xmlns:cx5="http://schemas.microsoft.com/office/drawing/2016/5/11/chartex" xmlns:cx6="http://schemas.microsoft.com/office/drawing/2016/5/12/chartex" xmlns:cx7="http://schemas.microsoft.com/office/drawing/2016/5/13/chartex" xmlns:cx8="http://schemas.microsoft.com/office/drawing/2016/5/14/chartex" xmlns:mc="http://schemas.openxmlformats.org/markup-compatibility/2006" xmlns:aink="http://schemas.microsoft.com/office/drawing/2016/ink" xmlns:am3d="http://schemas.microsoft.com/office/drawing/2017/model3d" xmlns:o="urn:schemas-microsoft-com:office:office" xmlns:oel="http://schemas.microsoft.com/office/2019/extlst" xmlns:r="http://schemas.openxmlformats.org/officeDocument/2006/relationships" xmlns:m="http://schemas.openxmlformats.org/officeDocument/2006/math" xmlns:v="urn:schemas-microsoft-com:vml" xmlns:wp14="http://schemas.microsoft.com/office/word/2010/wordprocessingDrawing" xmlns:wp="http://schemas.openxmlformats.org/drawingml/2006/wordprocessingDrawing" xmlns:w10="urn:schemas-microsoft-com:office:word" xmlns:w="http://schemas.openxmlformats.org/wordprocessingml/2006/main" xmlns:w14="http://schemas.microsoft.com/office/word/2010/wordml" xmlns:w15="http://schemas.microsoft.com/office/word/2012/wordml" xmlns:w16cex="http://schemas.microsoft.com/office/word/2018/wordml/cex" xmlns:w16cid="http://schemas.microsoft.com/office/word/2016/wordml/cid" xmlns:w16="http://schemas.microsoft.com/office/word/2018/wordml" xmlns:w16sdtdh="http://schemas.microsoft.com/office/word/2020/wordml/sdtdatahash" xmlns:w16se="http://schemas.microsoft.com/office/word/2015/wordml/symex" xmlns:wpg="http://schemas.microsoft.com/office/word/2010/wordprocessingGroup" xmlns:wpi="http://schemas.microsoft.com/office/word/2010/wordprocessingInk" xmlns:wne="http://schemas.microsoft.com/office/word/2006/wordml" xmlns:wps="http://schemas.microsoft.com/office/word/2010/wordprocessingShape" mc:Ignorable="w14 w15 w16se w16cid w16 w16cex w16sdtdh wp14">
+<w:numbering xmlns:wpc="http://schemas.microsoft.com/office/word/2010/wordprocessingCanvas" xmlns:cx="http://schemas.microsoft.com/office/drawing/2014/chartex" xmlns:cx1="http://schemas.microsoft.com/office/drawing/2015/9/8/chartex" xmlns:cx2="http://schemas.microsoft.com/office/drawing/2015/10/21/chartex" xmlns:cx3="http://schemas.microsoft.com/office/drawing/2016/5/9/chartex" xmlns:cx4="http://schemas.microsoft.com/office/drawing/2016/5/10/chartex" xmlns:cx5="http://schemas.microsoft.com/office/drawing/2016/5/11/chartex" xmlns:cx6="http://schemas.microsoft.com/office/drawing/2016/5/12/chartex" xmlns:cx7="http://schemas.microsoft.com/office/drawing/2016/5/13/chartex" xmlns:cx8="http://schemas.microsoft.com/office/drawing/2016/5/14/chartex" xmlns:mc="http://schemas.openxmlformats.org/markup-compatibility/2006" xmlns:aink="http://schemas.microsoft.com/office/drawing/2016/ink" xmlns:am3d="http://schemas.microsoft.com/office/drawing/2017/model3d" xmlns:o="urn:schemas-microsoft-com:office:office" xmlns:oel="http://schemas.microsoft.com/office/2019/extlst" xmlns:r="http://schemas.openxmlformats.org/officeDocument/2006/relationships" xmlns:m="http://schemas.openxmlformats.org/officeDocument/2006/math" xmlns:v="urn:schemas-microsoft-com:vml" xmlns:wp14="http://schemas.microsoft.com/office/word/2010/wordprocessingDrawing" xmlns:wp="http://schemas.openxmlformats.org/drawingml/2006/wordprocessingDrawing" xmlns:w10="urn:schemas-microsoft-com:office:word" xmlns:w="http://schemas.openxmlformats.org/wordprocessingml/2006/main" xmlns:w14="http://schemas.microsoft.com/office/word/2010/wordml" xmlns:w15="http://schemas.microsoft.com/office/word/2012/wordml" xmlns:w16cex="http://schemas.microsoft.com/office/word/2018/wordml/cex" xmlns:w16cid="http://schemas.microsoft.com/office/word/2016/wordml/cid" xmlns:w16="http://schemas.microsoft.com/office/word/2018/wordml" xmlns:w16du="http://schemas.microsoft.com/office/word/2023/wordml/word16du" xmlns:w16sdtdh="http://schemas.microsoft.com/office/word/2020/wordml/sdtdatahash" xmlns:w16sdtfl="http://schemas.microsoft.com/office/word/2024/wordml/sdtformatlock" xmlns:w16se="http://schemas.microsoft.com/office/word/2015/wordml/symex" xmlns:wpg="http://schemas.microsoft.com/office/word/2010/wordprocessingGroup" xmlns:wpi="http://schemas.microsoft.com/office/word/2010/wordprocessingInk" xmlns:wne="http://schemas.microsoft.com/office/word/2006/wordml" xmlns:wps="http://schemas.microsoft.com/office/word/2010/wordprocessingShape" mc:Ignorable="w14 w15 w16se w16cid w16 w16cex w16sdtdh w16sdtfl w16du wp14">
   <w:abstractNum w:abstractNumId="0" w15:restartNumberingAfterBreak="0">
     <w:nsid w:val="FFFFFF1D"/>
     <w:multiLevelType w:val="multilevel"/>
@@ -7143,7 +7345,7 @@
 </file>
 
 <file path=word/styles.xml><?xml version="1.0" encoding="utf-8"?>
-<w:styles xmlns:mc="http://schemas.openxmlformats.org/markup-compatibility/2006" xmlns:r="http://schemas.openxmlformats.org/officeDocument/2006/relationships" xmlns:w="http://schemas.openxmlformats.org/wordprocessingml/2006/main" xmlns:w14="http://schemas.microsoft.com/office/word/2010/wordml" xmlns:w15="http://schemas.microsoft.com/office/word/2012/wordml" xmlns:w16cex="http://schemas.microsoft.com/office/word/2018/wordml/cex" xmlns:w16cid="http://schemas.microsoft.com/office/word/2016/wordml/cid" xmlns:w16="http://schemas.microsoft.com/office/word/2018/wordml" xmlns:w16sdtdh="http://schemas.microsoft.com/office/word/2020/wordml/sdtdatahash" xmlns:w16se="http://schemas.microsoft.com/office/word/2015/wordml/symex" mc:Ignorable="w14 w15 w16se w16cid w16 w16cex w16sdtdh">
+<w:styles xmlns:mc="http://schemas.openxmlformats.org/markup-compatibility/2006" xmlns:r="http://schemas.openxmlformats.org/officeDocument/2006/relationships" xmlns:w="http://schemas.openxmlformats.org/wordprocessingml/2006/main" xmlns:w14="http://schemas.microsoft.com/office/word/2010/wordml" xmlns:w15="http://schemas.microsoft.com/office/word/2012/wordml" xmlns:w16cex="http://schemas.microsoft.com/office/word/2018/wordml/cex" xmlns:w16cid="http://schemas.microsoft.com/office/word/2016/wordml/cid" xmlns:w16="http://schemas.microsoft.com/office/word/2018/wordml" xmlns:w16du="http://schemas.microsoft.com/office/word/2023/wordml/word16du" xmlns:w16sdtdh="http://schemas.microsoft.com/office/word/2020/wordml/sdtdatahash" xmlns:w16sdtfl="http://schemas.microsoft.com/office/word/2024/wordml/sdtformatlock" xmlns:w16se="http://schemas.microsoft.com/office/word/2015/wordml/symex" mc:Ignorable="w14 w15 w16se w16cid w16 w16cex w16sdtdh w16sdtfl w16du">
   <w:docDefaults>
     <w:rPrDefault>
       <w:rPr>
@@ -7919,7 +8121,7 @@
 </file>
 
 <file path=word/glossary/document.xml><?xml version="1.0" encoding="utf-8"?>
-<w:glossaryDocument xmlns:wpc="http://schemas.microsoft.com/office/word/2010/wordprocessingCanvas" xmlns:cx="http://schemas.microsoft.com/office/drawing/2014/chartex" xmlns:cx1="http://schemas.microsoft.com/office/drawing/2015/9/8/chartex" xmlns:cx2="http://schemas.microsoft.com/office/drawing/2015/10/21/chartex" xmlns:cx3="http://schemas.microsoft.com/office/drawing/2016/5/9/chartex" xmlns:cx4="http://schemas.microsoft.com/office/drawing/2016/5/10/chartex" xmlns:cx5="http://schemas.microsoft.com/office/drawing/2016/5/11/chartex" xmlns:cx6="http://schemas.microsoft.com/office/drawing/2016/5/12/chartex" xmlns:cx7="http://schemas.microsoft.com/office/drawing/2016/5/13/chartex" xmlns:cx8="http://schemas.microsoft.com/office/drawing/2016/5/14/chartex" xmlns:mc="http://schemas.openxmlformats.org/markup-compatibility/2006" xmlns:aink="http://schemas.microsoft.com/office/drawing/2016/ink" xmlns:am3d="http://schemas.microsoft.com/office/drawing/2017/model3d" xmlns:o="urn:schemas-microsoft-com:office:office" xmlns:oel="http://schemas.microsoft.com/office/2019/extlst" xmlns:r="http://schemas.openxmlformats.org/officeDocument/2006/relationships" xmlns:m="http://schemas.openxmlformats.org/officeDocument/2006/math" xmlns:v="urn:schemas-microsoft-com:vml" xmlns:wp14="http://schemas.microsoft.com/office/word/2010/wordprocessingDrawing" xmlns:wp="http://schemas.openxmlformats.org/drawingml/2006/wordprocessingDrawing" xmlns:w10="urn:schemas-microsoft-com:office:word" xmlns:w="http://schemas.openxmlformats.org/wordprocessingml/2006/main" xmlns:w14="http://schemas.microsoft.com/office/word/2010/wordml" xmlns:w15="http://schemas.microsoft.com/office/word/2012/wordml" xmlns:w16cex="http://schemas.microsoft.com/office/word/2018/wordml/cex" xmlns:w16cid="http://schemas.microsoft.com/office/word/2016/wordml/cid" xmlns:w16="http://schemas.microsoft.com/office/word/2018/wordml" xmlns:w16sdtdh="http://schemas.microsoft.com/office/word/2020/wordml/sdtdatahash" xmlns:w16se="http://schemas.microsoft.com/office/word/2015/wordml/symex" xmlns:wpg="http://schemas.microsoft.com/office/word/2010/wordprocessingGroup" xmlns:wpi="http://schemas.microsoft.com/office/word/2010/wordprocessingInk" xmlns:wne="http://schemas.microsoft.com/office/word/2006/wordml" xmlns:wps="http://schemas.microsoft.com/office/word/2010/wordprocessingShape" mc:Ignorable="w14 w15 w16se w16cid w16 w16cex w16sdtdh wp14">
+<w:glossaryDocument xmlns:wpc="http://schemas.microsoft.com/office/word/2010/wordprocessingCanvas" xmlns:cx="http://schemas.microsoft.com/office/drawing/2014/chartex" xmlns:cx1="http://schemas.microsoft.com/office/drawing/2015/9/8/chartex" xmlns:cx2="http://schemas.microsoft.com/office/drawing/2015/10/21/chartex" xmlns:cx3="http://schemas.microsoft.com/office/drawing/2016/5/9/chartex" xmlns:cx4="http://schemas.microsoft.com/office/drawing/2016/5/10/chartex" xmlns:cx5="http://schemas.microsoft.com/office/drawing/2016/5/11/chartex" xmlns:cx6="http://schemas.microsoft.com/office/drawing/2016/5/12/chartex" xmlns:cx7="http://schemas.microsoft.com/office/drawing/2016/5/13/chartex" xmlns:cx8="http://schemas.microsoft.com/office/drawing/2016/5/14/chartex" xmlns:mc="http://schemas.openxmlformats.org/markup-compatibility/2006" xmlns:aink="http://schemas.microsoft.com/office/drawing/2016/ink" xmlns:am3d="http://schemas.microsoft.com/office/drawing/2017/model3d" xmlns:o="urn:schemas-microsoft-com:office:office" xmlns:oel="http://schemas.microsoft.com/office/2019/extlst" xmlns:r="http://schemas.openxmlformats.org/officeDocument/2006/relationships" xmlns:m="http://schemas.openxmlformats.org/officeDocument/2006/math" xmlns:v="urn:schemas-microsoft-com:vml" xmlns:wp14="http://schemas.microsoft.com/office/word/2010/wordprocessingDrawing" xmlns:wp="http://schemas.openxmlformats.org/drawingml/2006/wordprocessingDrawing" xmlns:w10="urn:schemas-microsoft-com:office:word" xmlns:w="http://schemas.openxmlformats.org/wordprocessingml/2006/main" xmlns:w14="http://schemas.microsoft.com/office/word/2010/wordml" xmlns:w15="http://schemas.microsoft.com/office/word/2012/wordml" xmlns:w16cex="http://schemas.microsoft.com/office/word/2018/wordml/cex" xmlns:w16cid="http://schemas.microsoft.com/office/word/2016/wordml/cid" xmlns:w16="http://schemas.microsoft.com/office/word/2018/wordml" xmlns:w16du="http://schemas.microsoft.com/office/word/2023/wordml/word16du" xmlns:w16sdtdh="http://schemas.microsoft.com/office/word/2020/wordml/sdtdatahash" xmlns:w16sdtfl="http://schemas.microsoft.com/office/word/2024/wordml/sdtformatlock" xmlns:w16se="http://schemas.microsoft.com/office/word/2015/wordml/symex" xmlns:wpg="http://schemas.microsoft.com/office/word/2010/wordprocessingGroup" xmlns:wpi="http://schemas.microsoft.com/office/word/2010/wordprocessingInk" xmlns:wne="http://schemas.microsoft.com/office/word/2006/wordml" xmlns:wps="http://schemas.microsoft.com/office/word/2010/wordprocessingShape" mc:Ignorable="w14 w15 w16se w16cid w16 w16cex w16sdtdh w16sdtfl w16du wp14">
   <w:docParts>
     <w:docPart>
       <w:docPartPr>
@@ -8004,7 +8206,7 @@
 </file>
 
 <file path=word/glossary/fontTable.xml><?xml version="1.0" encoding="utf-8"?>
-<w:fonts xmlns:mc="http://schemas.openxmlformats.org/markup-compatibility/2006" xmlns:r="http://schemas.openxmlformats.org/officeDocument/2006/relationships" xmlns:w="http://schemas.openxmlformats.org/wordprocessingml/2006/main" xmlns:w14="http://schemas.microsoft.com/office/word/2010/wordml" xmlns:w15="http://schemas.microsoft.com/office/word/2012/wordml" xmlns:w16cex="http://schemas.microsoft.com/office/word/2018/wordml/cex" xmlns:w16cid="http://schemas.microsoft.com/office/word/2016/wordml/cid" xmlns:w16="http://schemas.microsoft.com/office/word/2018/wordml" xmlns:w16sdtdh="http://schemas.microsoft.com/office/word/2020/wordml/sdtdatahash" xmlns:w16se="http://schemas.microsoft.com/office/word/2015/wordml/symex" mc:Ignorable="w14 w15 w16se w16cid w16 w16cex w16sdtdh">
+<w:fonts xmlns:mc="http://schemas.openxmlformats.org/markup-compatibility/2006" xmlns:r="http://schemas.openxmlformats.org/officeDocument/2006/relationships" xmlns:w="http://schemas.openxmlformats.org/wordprocessingml/2006/main" xmlns:w14="http://schemas.microsoft.com/office/word/2010/wordml" xmlns:w15="http://schemas.microsoft.com/office/word/2012/wordml" xmlns:w16cex="http://schemas.microsoft.com/office/word/2018/wordml/cex" xmlns:w16cid="http://schemas.microsoft.com/office/word/2016/wordml/cid" xmlns:w16="http://schemas.microsoft.com/office/word/2018/wordml" xmlns:w16du="http://schemas.microsoft.com/office/word/2023/wordml/word16du" xmlns:w16sdtdh="http://schemas.microsoft.com/office/word/2020/wordml/sdtdatahash" xmlns:w16sdtfl="http://schemas.microsoft.com/office/word/2024/wordml/sdtformatlock" xmlns:w16se="http://schemas.microsoft.com/office/word/2015/wordml/symex" mc:Ignorable="w14 w15 w16se w16cid w16 w16cex w16sdtdh w16sdtfl w16du">
   <w:font w:name="Symbol">
     <w:panose1 w:val="05050102010706020507"/>
     <w:charset w:val="02"/>
@@ -8109,7 +8311,7 @@
 </file>
 
 <file path=word/glossary/settings.xml><?xml version="1.0" encoding="utf-8"?>
-<w:settings xmlns:mc="http://schemas.openxmlformats.org/markup-compatibility/2006" xmlns:o="urn:schemas-microsoft-com:office:office" xmlns:r="http://schemas.openxmlformats.org/officeDocument/2006/relationships" xmlns:m="http://schemas.openxmlformats.org/officeDocument/2006/math" xmlns:v="urn:schemas-microsoft-com:vml" xmlns:w10="urn:schemas-microsoft-com:office:word" xmlns:w="http://schemas.openxmlformats.org/wordprocessingml/2006/main" xmlns:w14="http://schemas.microsoft.com/office/word/2010/wordml" xmlns:w15="http://schemas.microsoft.com/office/word/2012/wordml" xmlns:w16cex="http://schemas.microsoft.com/office/word/2018/wordml/cex" xmlns:w16cid="http://schemas.microsoft.com/office/word/2016/wordml/cid" xmlns:w16="http://schemas.microsoft.com/office/word/2018/wordml" xmlns:w16sdtdh="http://schemas.microsoft.com/office/word/2020/wordml/sdtdatahash" xmlns:w16se="http://schemas.microsoft.com/office/word/2015/wordml/symex" xmlns:sl="http://schemas.openxmlformats.org/schemaLibrary/2006/main" mc:Ignorable="w14 w15 w16se w16cid w16 w16cex w16sdtdh">
+<w:settings xmlns:mc="http://schemas.openxmlformats.org/markup-compatibility/2006" xmlns:o="urn:schemas-microsoft-com:office:office" xmlns:r="http://schemas.openxmlformats.org/officeDocument/2006/relationships" xmlns:m="http://schemas.openxmlformats.org/officeDocument/2006/math" xmlns:v="urn:schemas-microsoft-com:vml" xmlns:w10="urn:schemas-microsoft-com:office:word" xmlns:w="http://schemas.openxmlformats.org/wordprocessingml/2006/main" xmlns:w14="http://schemas.microsoft.com/office/word/2010/wordml" xmlns:w15="http://schemas.microsoft.com/office/word/2012/wordml" xmlns:w16cex="http://schemas.microsoft.com/office/word/2018/wordml/cex" xmlns:w16cid="http://schemas.microsoft.com/office/word/2016/wordml/cid" xmlns:w16="http://schemas.microsoft.com/office/word/2018/wordml" xmlns:w16du="http://schemas.microsoft.com/office/word/2023/wordml/word16du" xmlns:w16sdtdh="http://schemas.microsoft.com/office/word/2020/wordml/sdtdatahash" xmlns:w16sdtfl="http://schemas.microsoft.com/office/word/2024/wordml/sdtformatlock" xmlns:w16se="http://schemas.microsoft.com/office/word/2015/wordml/symex" xmlns:sl="http://schemas.openxmlformats.org/schemaLibrary/2006/main" mc:Ignorable="w14 w15 w16se w16cid w16 w16cex w16sdtdh w16sdtfl w16du">
   <w:view w:val="normal"/>
   <w:defaultTabStop w:val="720"/>
   <w:characterSpacingControl w:val="doNotCompress"/>
@@ -8139,12 +8341,14 @@
     <w:rsid w:val="00674A94"/>
     <w:rsid w:val="006B5A05"/>
     <w:rsid w:val="006D4195"/>
+    <w:rsid w:val="00741838"/>
     <w:rsid w:val="0075251F"/>
     <w:rsid w:val="007A77FF"/>
     <w:rsid w:val="008341C2"/>
     <w:rsid w:val="008951BE"/>
     <w:rsid w:val="008B0C3B"/>
     <w:rsid w:val="009B4380"/>
+    <w:rsid w:val="00B16D3B"/>
     <w:rsid w:val="00B3182F"/>
     <w:rsid w:val="00B85965"/>
     <w:rsid w:val="00BA4BB8"/>
@@ -8184,7 +8388,7 @@
 </file>
 
 <file path=word/glossary/styles.xml><?xml version="1.0" encoding="utf-8"?>
-<w:styles xmlns:mc="http://schemas.openxmlformats.org/markup-compatibility/2006" xmlns:r="http://schemas.openxmlformats.org/officeDocument/2006/relationships" xmlns:w="http://schemas.openxmlformats.org/wordprocessingml/2006/main" xmlns:w14="http://schemas.microsoft.com/office/word/2010/wordml" xmlns:w15="http://schemas.microsoft.com/office/word/2012/wordml" xmlns:w16cex="http://schemas.microsoft.com/office/word/2018/wordml/cex" xmlns:w16cid="http://schemas.microsoft.com/office/word/2016/wordml/cid" xmlns:w16="http://schemas.microsoft.com/office/word/2018/wordml" xmlns:w16sdtdh="http://schemas.microsoft.com/office/word/2020/wordml/sdtdatahash" xmlns:w16se="http://schemas.microsoft.com/office/word/2015/wordml/symex" mc:Ignorable="w14 w15 w16se w16cid w16 w16cex w16sdtdh">
+<w:styles xmlns:mc="http://schemas.openxmlformats.org/markup-compatibility/2006" xmlns:r="http://schemas.openxmlformats.org/officeDocument/2006/relationships" xmlns:w="http://schemas.openxmlformats.org/wordprocessingml/2006/main" xmlns:w14="http://schemas.microsoft.com/office/word/2010/wordml" xmlns:w15="http://schemas.microsoft.com/office/word/2012/wordml" xmlns:w16cex="http://schemas.microsoft.com/office/word/2018/wordml/cex" xmlns:w16cid="http://schemas.microsoft.com/office/word/2016/wordml/cid" xmlns:w16="http://schemas.microsoft.com/office/word/2018/wordml" xmlns:w16du="http://schemas.microsoft.com/office/word/2023/wordml/word16du" xmlns:w16sdtdh="http://schemas.microsoft.com/office/word/2020/wordml/sdtdatahash" xmlns:w16sdtfl="http://schemas.microsoft.com/office/word/2024/wordml/sdtformatlock" xmlns:w16se="http://schemas.microsoft.com/office/word/2015/wordml/symex" mc:Ignorable="w14 w15 w16se w16cid w16 w16cex w16sdtdh w16sdtfl w16du">
   <w:docDefaults>
     <w:rPrDefault>
       <w:rPr>
@@ -8619,7 +8823,7 @@
 </file>
 
 <file path=word/glossary/webSettings.xml><?xml version="1.0" encoding="utf-8"?>
-<w:webSettings xmlns:mc="http://schemas.openxmlformats.org/markup-compatibility/2006" xmlns:r="http://schemas.openxmlformats.org/officeDocument/2006/relationships" xmlns:w="http://schemas.openxmlformats.org/wordprocessingml/2006/main" xmlns:w14="http://schemas.microsoft.com/office/word/2010/wordml" xmlns:w15="http://schemas.microsoft.com/office/word/2012/wordml" xmlns:w16cex="http://schemas.microsoft.com/office/word/2018/wordml/cex" xmlns:w16cid="http://schemas.microsoft.com/office/word/2016/wordml/cid" xmlns:w16="http://schemas.microsoft.com/office/word/2018/wordml" xmlns:w16sdtdh="http://schemas.microsoft.com/office/word/2020/wordml/sdtdatahash" xmlns:w16se="http://schemas.microsoft.com/office/word/2015/wordml/symex" mc:Ignorable="w14 w15 w16se w16cid w16 w16cex w16sdtdh">
+<w:webSettings xmlns:mc="http://schemas.openxmlformats.org/markup-compatibility/2006" xmlns:r="http://schemas.openxmlformats.org/officeDocument/2006/relationships" xmlns:w="http://schemas.openxmlformats.org/wordprocessingml/2006/main" xmlns:w14="http://schemas.microsoft.com/office/word/2010/wordml" xmlns:w15="http://schemas.microsoft.com/office/word/2012/wordml" xmlns:w16cex="http://schemas.microsoft.com/office/word/2018/wordml/cex" xmlns:w16cid="http://schemas.microsoft.com/office/word/2016/wordml/cid" xmlns:w16="http://schemas.microsoft.com/office/word/2018/wordml" xmlns:w16du="http://schemas.microsoft.com/office/word/2023/wordml/word16du" xmlns:w16sdtdh="http://schemas.microsoft.com/office/word/2020/wordml/sdtdatahash" xmlns:w16sdtfl="http://schemas.microsoft.com/office/word/2024/wordml/sdtformatlock" xmlns:w16se="http://schemas.microsoft.com/office/word/2015/wordml/symex" mc:Ignorable="w14 w15 w16se w16cid w16 w16cex w16sdtdh w16sdtfl w16du">
   <w:allowPNG/>
 </w:webSettings>
 </file>

</xml_diff>

<commit_message>
Add QnRL and update research descriptions
</commit_message>
<xml_diff>
--- a/derieux_resume_multipage.docx
+++ b/derieux_resume_multipage.docx
@@ -221,14 +221,18 @@
                     <w:t xml:space="preserve">: </w:t>
                   </w:r>
                   <w:hyperlink r:id="rId8" w:history="1">
+                    <w:proofErr w:type="spellStart"/>
                     <w:r>
                       <w:rPr>
                         <w:rStyle w:val="Hyperlink"/>
+                        <w:i/>
+                        <w:iCs/>
                         <w:color w:val="7F7F7F" w:themeColor="text1" w:themeTint="80"/>
                         <w:u w:val="none"/>
                       </w:rPr>
                       <w:t>zanderman</w:t>
                     </w:r>
+                    <w:proofErr w:type="spellEnd"/>
                   </w:hyperlink>
                 </w:p>
               </w:tc>
@@ -258,14 +262,18 @@
                     <w:t xml:space="preserve">LinkedIn: </w:t>
                   </w:r>
                   <w:hyperlink r:id="rId9" w:history="1">
+                    <w:proofErr w:type="spellStart"/>
                     <w:r>
                       <w:rPr>
                         <w:rStyle w:val="Hyperlink"/>
+                        <w:i/>
+                        <w:iCs/>
                         <w:color w:val="7F7F7F" w:themeColor="text1" w:themeTint="80"/>
                         <w:u w:val="none"/>
                       </w:rPr>
                       <w:t>alexderieux</w:t>
                     </w:r>
+                    <w:proofErr w:type="spellEnd"/>
                   </w:hyperlink>
                 </w:p>
               </w:tc>
@@ -399,6 +407,9 @@
               <w:t xml:space="preserve"> space systems, </w:t>
             </w:r>
             <w:r>
+              <w:t xml:space="preserve">game theory, </w:t>
+            </w:r>
+            <w:r>
               <w:t xml:space="preserve">and </w:t>
             </w:r>
             <w:r>
@@ -411,7 +422,19 @@
               <w:t>Interested in</w:t>
             </w:r>
             <w:r>
-              <w:t xml:space="preserve"> designing quantum-native artificial intelligence systems that leverage unique quantum mechanical properties to facilitate learning and operation naturally within the quantum domain.</w:t>
+              <w:t xml:space="preserve"> designing quantum-native artificial intelligence systems that </w:t>
+            </w:r>
+            <w:r>
+              <w:t xml:space="preserve">naturally </w:t>
+            </w:r>
+            <w:r>
+              <w:t>leverage unique</w:t>
+            </w:r>
+            <w:r>
+              <w:t>ly</w:t>
+            </w:r>
+            <w:r>
+              <w:t xml:space="preserve"> quantum properties to facilitate learning and operation within the quantum domain.</w:t>
             </w:r>
           </w:p>
         </w:tc>
@@ -1413,12 +1436,21 @@
                       <w:iCs/>
                     </w:rPr>
                   </w:pPr>
+                  <w:proofErr w:type="spellStart"/>
                   <w:r>
                     <w:rPr>
                       <w:i/>
                       <w:iCs/>
                     </w:rPr>
-                    <w:t>Wireless@VT, Virginia Polytechnic Institute and State University</w:t>
+                    <w:t>Wireless@VT</w:t>
+                  </w:r>
+                  <w:proofErr w:type="spellEnd"/>
+                  <w:r>
+                    <w:rPr>
+                      <w:i/>
+                      <w:iCs/>
+                    </w:rPr>
+                    <w:t>, Virginia Polytechnic Institute and State University</w:t>
                   </w:r>
                 </w:p>
                 <w:p>
@@ -1426,10 +1458,39 @@
                     <w:pStyle w:val="Content"/>
                   </w:pPr>
                   <w:r>
-                    <w:t>Machine Learning research with applications to areas of smart cities, wireless communications, optimization, game theory, and quantum information theory.</w:t>
-                  </w:r>
-                  <w:r>
-                    <w:t xml:space="preserve"> Developing architectures and techniques to facilitate heterogeneous multi-task learning (HMTL) in smart garden alleys with diverse data sources. Designing time-series forecasting models in TensorFlow using the Transformer “attention” architecture to predict plant growth as a function of meteorological data.</w:t>
+                    <w:t xml:space="preserve">Quantum machine learning research with a focus on </w:t>
+                  </w:r>
+                  <w:r>
+                    <w:t>designing quantum-native artificial intelligence systems that leverage unique quantum mechanical properties to facilitate learning and operation naturally within the quantum domain.</w:t>
+                  </w:r>
+                </w:p>
+                <w:p>
+                  <w:pPr>
+                    <w:pStyle w:val="Content"/>
+                  </w:pPr>
+                  <w:r>
+                    <w:t xml:space="preserve">Classical </w:t>
+                  </w:r>
+                  <w:r>
+                    <w:t>m</w:t>
+                  </w:r>
+                  <w:r>
+                    <w:t xml:space="preserve">achine Learning research with applications to areas of smart cities, wireless communications, optimization, </w:t>
+                  </w:r>
+                  <w:r>
+                    <w:t xml:space="preserve">and </w:t>
+                  </w:r>
+                  <w:r>
+                    <w:t>game theory.</w:t>
+                  </w:r>
+                  <w:r>
+                    <w:t xml:space="preserve"> </w:t>
+                  </w:r>
+                  <w:r>
+                    <w:t>Developed</w:t>
+                  </w:r>
+                  <w:r>
+                    <w:t xml:space="preserve"> architectures and techniques to facilitate heterogeneous multi-task learning (HMTL) in smart garden alleys with diverse data sources.</w:t>
                   </w:r>
                 </w:p>
               </w:tc>
@@ -2203,15 +2264,25 @@
                 <w:b w:val="0"/>
                 <w:bCs w:val="0"/>
               </w:rPr>
-              <w:t xml:space="preserve">A. DeRieux and W. Saad, “eQMARL: Entangled Quantum Multi-Agent Reinforcement Learning for Distributed Cooperation over Quantum Channels”, </w:t>
-            </w:r>
+              <w:t>A. DeRieux and W. Saad, “</w:t>
+            </w:r>
+            <w:proofErr w:type="spellStart"/>
             <w:r>
               <w:rPr>
                 <w:b w:val="0"/>
                 <w:bCs w:val="0"/>
               </w:rPr>
-              <w:t xml:space="preserve">in Proc. Of </w:t>
-            </w:r>
+              <w:t>QnRL</w:t>
+            </w:r>
+            <w:proofErr w:type="spellEnd"/>
+            <w:r>
+              <w:rPr>
+                <w:b w:val="0"/>
+                <w:bCs w:val="0"/>
+              </w:rPr>
+              <w:t xml:space="preserve">: Quantum-Native Reinforcement Learning”, June 2026, </w:t>
+            </w:r>
+            <w:proofErr w:type="spellStart"/>
             <w:r>
               <w:rPr>
                 <w:b w:val="0"/>
@@ -2219,30 +2290,133 @@
                 <w:i/>
                 <w:iCs/>
               </w:rPr>
-              <w:t>The Thirteenth International Conference on Learning Representations (ICLR)</w:t>
-            </w:r>
+              <w:t>arXiv</w:t>
+            </w:r>
+            <w:proofErr w:type="spellEnd"/>
             <w:r>
               <w:rPr>
                 <w:b w:val="0"/>
                 <w:bCs w:val="0"/>
               </w:rPr>
-              <w:t>, Singapore, April 2025.</w:t>
-            </w:r>
+              <w:t xml:space="preserve">: arXiv:2606.08276. </w:t>
+            </w:r>
+            <w:proofErr w:type="spellStart"/>
             <w:r>
               <w:rPr>
                 <w:b w:val="0"/>
                 <w:bCs w:val="0"/>
               </w:rPr>
-              <w:t xml:space="preserve"> </w:t>
-            </w:r>
+              <w:t>doi</w:t>
+            </w:r>
+            <w:proofErr w:type="spellEnd"/>
             <w:r>
               <w:rPr>
                 <w:b w:val="0"/>
                 <w:bCs w:val="0"/>
               </w:rPr>
-              <w:t xml:space="preserve">doi: </w:t>
+              <w:t xml:space="preserve">: </w:t>
             </w:r>
             <w:hyperlink r:id="rId10" w:history="1">
+              <w:r>
+                <w:rPr>
+                  <w:rStyle w:val="Hyperlink"/>
+                  <w:b w:val="0"/>
+                  <w:bCs w:val="0"/>
+                </w:rPr>
+                <w:t>10.48550/arXiv.2606.08276</w:t>
+              </w:r>
+            </w:hyperlink>
+            <w:r>
+              <w:rPr>
+                <w:b w:val="0"/>
+                <w:bCs w:val="0"/>
+              </w:rPr>
+              <w:t>.</w:t>
+            </w:r>
+          </w:p>
+          <w:p>
+            <w:pPr>
+              <w:pStyle w:val="Heading2"/>
+              <w:numPr>
+                <w:ilvl w:val="0"/>
+                <w:numId w:val="18"/>
+              </w:numPr>
+              <w:ind w:left="267" w:hanging="270"/>
+              <w:rPr>
+                <w:b w:val="0"/>
+                <w:bCs w:val="0"/>
+              </w:rPr>
+            </w:pPr>
+            <w:r>
+              <w:rPr>
+                <w:b w:val="0"/>
+                <w:bCs w:val="0"/>
+              </w:rPr>
+              <w:t>A. DeRieux and W. Saad, “</w:t>
+            </w:r>
+            <w:proofErr w:type="spellStart"/>
+            <w:r>
+              <w:rPr>
+                <w:b w:val="0"/>
+                <w:bCs w:val="0"/>
+              </w:rPr>
+              <w:t>eQMARL</w:t>
+            </w:r>
+            <w:proofErr w:type="spellEnd"/>
+            <w:r>
+              <w:rPr>
+                <w:b w:val="0"/>
+                <w:bCs w:val="0"/>
+              </w:rPr>
+              <w:t xml:space="preserve">: Entangled Quantum Multi-Agent Reinforcement Learning for Distributed Cooperation over Quantum Channels”, </w:t>
+            </w:r>
+            <w:r>
+              <w:rPr>
+                <w:b w:val="0"/>
+                <w:bCs w:val="0"/>
+              </w:rPr>
+              <w:t xml:space="preserve">in Proc. Of </w:t>
+            </w:r>
+            <w:r>
+              <w:rPr>
+                <w:b w:val="0"/>
+                <w:bCs w:val="0"/>
+                <w:i/>
+                <w:iCs/>
+              </w:rPr>
+              <w:t>The Thirteenth International Conference on Learning Representations (ICLR)</w:t>
+            </w:r>
+            <w:r>
+              <w:rPr>
+                <w:b w:val="0"/>
+                <w:bCs w:val="0"/>
+              </w:rPr>
+              <w:t>, Singapore, April 2025.</w:t>
+            </w:r>
+            <w:r>
+              <w:rPr>
+                <w:b w:val="0"/>
+                <w:bCs w:val="0"/>
+              </w:rPr>
+              <w:t xml:space="preserve"> </w:t>
+            </w:r>
+            <w:proofErr w:type="spellStart"/>
+            <w:r>
+              <w:rPr>
+                <w:b w:val="0"/>
+                <w:bCs w:val="0"/>
+              </w:rPr>
+              <w:t>doi</w:t>
+            </w:r>
+            <w:proofErr w:type="spellEnd"/>
+            <w:r>
+              <w:rPr>
+                <w:b w:val="0"/>
+                <w:bCs w:val="0"/>
+              </w:rPr>
+              <w:t xml:space="preserve">: </w:t>
+            </w:r>
+            <w:hyperlink r:id="rId11" w:history="1">
               <w:r>
                 <w:rPr>
                   <w:rStyle w:val="Hyperlink"/>
@@ -2322,9 +2496,25 @@
                 <w:b w:val="0"/>
                 <w:bCs w:val="0"/>
               </w:rPr>
-              <w:t xml:space="preserve">March 2023, pp. 1-6. doi: </w:t>
-            </w:r>
-            <w:hyperlink r:id="rId11" w:history="1">
+              <w:t xml:space="preserve">March 2023, pp. 1-6. </w:t>
+            </w:r>
+            <w:proofErr w:type="spellStart"/>
+            <w:r>
+              <w:rPr>
+                <w:b w:val="0"/>
+                <w:bCs w:val="0"/>
+              </w:rPr>
+              <w:t>doi</w:t>
+            </w:r>
+            <w:proofErr w:type="spellEnd"/>
+            <w:r>
+              <w:rPr>
+                <w:b w:val="0"/>
+                <w:bCs w:val="0"/>
+              </w:rPr>
+              <w:t xml:space="preserve">: </w:t>
+            </w:r>
+            <w:hyperlink r:id="rId12" w:history="1">
               <w:r>
                 <w:rPr>
                   <w:rStyle w:val="Hyperlink"/>
@@ -2360,16 +2550,99 @@
                 <w:b w:val="0"/>
                 <w:bCs w:val="0"/>
               </w:rPr>
-              <w:t xml:space="preserve">A. C. DeRieux, W. Saad, W. Zuo, R. Budiarto, M. D. Koerniawan, and D. Novitasari, “A Transformer Framework for Data Fusion and Multi-Task Learning in Smart Cities”, arXiv [cs.LG]. 2022. Available: </w:t>
-            </w:r>
-            <w:hyperlink r:id="rId12" w:history="1">
+              <w:t xml:space="preserve">A. C. DeRieux, W. Saad, W. Zuo, R. Budiarto, M. D. </w:t>
+            </w:r>
+            <w:proofErr w:type="spellStart"/>
+            <w:r>
+              <w:rPr>
+                <w:b w:val="0"/>
+                <w:bCs w:val="0"/>
+              </w:rPr>
+              <w:t>Koerniawan</w:t>
+            </w:r>
+            <w:proofErr w:type="spellEnd"/>
+            <w:r>
+              <w:rPr>
+                <w:b w:val="0"/>
+                <w:bCs w:val="0"/>
+              </w:rPr>
+              <w:t xml:space="preserve">, and D. Novitasari, “A Transformer Framework for Data Fusion and Multi-Task Learning in Smart Cities”, </w:t>
+            </w:r>
+            <w:r>
+              <w:rPr>
+                <w:b w:val="0"/>
+                <w:bCs w:val="0"/>
+              </w:rPr>
+              <w:t xml:space="preserve">Nov. </w:t>
+            </w:r>
+            <w:r>
+              <w:rPr>
+                <w:b w:val="0"/>
+                <w:bCs w:val="0"/>
+              </w:rPr>
+              <w:t>2022</w:t>
+            </w:r>
+            <w:r>
+              <w:rPr>
+                <w:b w:val="0"/>
+                <w:bCs w:val="0"/>
+              </w:rPr>
+              <w:t>,</w:t>
+            </w:r>
+            <w:r>
+              <w:rPr>
+                <w:b w:val="0"/>
+                <w:bCs w:val="0"/>
+              </w:rPr>
+              <w:t xml:space="preserve"> </w:t>
+            </w:r>
+            <w:proofErr w:type="spellStart"/>
+            <w:r>
+              <w:rPr>
+                <w:b w:val="0"/>
+                <w:bCs w:val="0"/>
+              </w:rPr>
+              <w:t>arXiv</w:t>
+            </w:r>
+            <w:proofErr w:type="spellEnd"/>
+            <w:r>
+              <w:rPr>
+                <w:b w:val="0"/>
+                <w:bCs w:val="0"/>
+              </w:rPr>
+              <w:t>: arXiv:2211.10506</w:t>
+            </w:r>
+            <w:r>
+              <w:rPr>
+                <w:b w:val="0"/>
+                <w:bCs w:val="0"/>
+              </w:rPr>
+              <w:t xml:space="preserve">. </w:t>
+            </w:r>
+            <w:proofErr w:type="spellStart"/>
+            <w:r>
+              <w:rPr>
+                <w:b w:val="0"/>
+                <w:bCs w:val="0"/>
+              </w:rPr>
+              <w:t>doi</w:t>
+            </w:r>
+            <w:proofErr w:type="spellEnd"/>
+            <w:r>
+              <w:rPr>
+                <w:b w:val="0"/>
+                <w:bCs w:val="0"/>
+              </w:rPr>
+              <w:t xml:space="preserve">: </w:t>
+            </w:r>
+            <w:hyperlink r:id="rId13" w:history="1">
               <w:r>
                 <w:rPr>
                   <w:rStyle w:val="Hyperlink"/>
                   <w:b w:val="0"/>
                   <w:bCs w:val="0"/>
                 </w:rPr>
-                <w:t>https://arxiv.org/abs/2211.10506</w:t>
+                <w:t>10.48550/arXiv.2211.10506</w:t>
               </w:r>
             </w:hyperlink>
             <w:r>
@@ -2422,15 +2695,28 @@
                 <w:b w:val="0"/>
                 <w:bCs w:val="0"/>
               </w:rPr>
-              <w:t xml:space="preserve"> M.S. Thesis, Virginia Tech, Aug. 2022. [Online]. Available: </w:t>
-            </w:r>
-            <w:hyperlink r:id="rId13" w:history="1">
+              <w:t xml:space="preserve"> M.S. Thesis, Virginia Tech, Aug. 2022</w:t>
+            </w:r>
+            <w:r>
+              <w:rPr>
+                <w:b w:val="0"/>
+                <w:bCs w:val="0"/>
+              </w:rPr>
+              <w:t>,</w:t>
+            </w:r>
+            <w:r>
+              <w:rPr>
+                <w:b w:val="0"/>
+                <w:bCs w:val="0"/>
+              </w:rPr>
+              <w:t xml:space="preserve"> Available: </w:t>
+            </w:r>
+            <w:hyperlink r:id="rId14" w:history="1">
               <w:r>
                 <w:rPr>
                   <w:rStyle w:val="Hyperlink"/>
                   <w:b w:val="0"/>
                   <w:bCs w:val="0"/>
-                  <w:u w:val="none"/>
                 </w:rPr>
                 <w:t>http://hdl.handle.net/10919/111788</w:t>
               </w:r>
@@ -2446,15 +2732,7 @@
         </w:tc>
       </w:tr>
     </w:tbl>
-    <w:p>
-      <w:r>
-        <w:rPr>
-          <w:b/>
-          <w:bCs/>
-        </w:rPr>
-        <w:br w:type="page"/>
-      </w:r>
-    </w:p>
+    <w:p/>
     <w:tbl>
       <w:tblPr>
         <w:tblStyle w:val="TableGrid"/>
@@ -2493,7 +2771,6 @@
               <w:keepNext w:val="0"/>
             </w:pPr>
             <w:r>
-              <w:lastRenderedPageBreak/>
               <w:t>Research &amp;</w:t>
             </w:r>
           </w:p>
@@ -2562,8 +2839,13 @@
                     <w:pStyle w:val="Heading2"/>
                     <w:keepNext w:val="0"/>
                   </w:pPr>
-                  <w:r>
-                    <w:t>eQMARL: Entangled Quantum Multi-Agent Reinforcement Learning for Distributed Cooperation over Quantum Channels</w:t>
+                  <w:proofErr w:type="spellStart"/>
+                  <w:r>
+                    <w:t>QnRL</w:t>
+                  </w:r>
+                  <w:proofErr w:type="spellEnd"/>
+                  <w:r>
+                    <w:t>: Quantum-Native Reinforcement Learning</w:t>
                   </w:r>
                 </w:p>
               </w:tc>
@@ -2577,7 +2859,13 @@
                     <w:keepNext w:val="0"/>
                   </w:pPr>
                   <w:r>
-                    <w:t>4 / 2025</w:t>
+                    <w:t xml:space="preserve">[ </w:t>
+                  </w:r>
+                  <w:r>
+                    <w:t>6 / 2026</w:t>
+                  </w:r>
+                  <w:r>
+                    <w:t xml:space="preserve"> ]</w:t>
                   </w:r>
                 </w:p>
               </w:tc>
@@ -2598,6 +2886,7 @@
                       <w:rFonts w:ascii="Helvetica Neue" w:hAnsi="Helvetica Neue"/>
                       <w:b w:val="0"/>
                       <w:bCs w:val="0"/>
+                      <w:color w:val="7F7F7F" w:themeColor="text1" w:themeTint="80"/>
                     </w:rPr>
                   </w:pPr>
                   <w:r>
@@ -2607,7 +2896,7 @@
                       <w:bCs w:val="0"/>
                       <w:color w:val="7F7F7F" w:themeColor="text1" w:themeTint="80"/>
                     </w:rPr>
-                    <w:t xml:space="preserve">Developed a novel quantum multi-agent reinforcement learning framework for </w:t>
+                    <w:t>Developed a novel</w:t>
                   </w:r>
                   <w:r>
                     <w:rPr>
@@ -2616,7 +2905,7 @@
                       <w:bCs w:val="0"/>
                       <w:color w:val="7F7F7F" w:themeColor="text1" w:themeTint="80"/>
                     </w:rPr>
-                    <w:t xml:space="preserve">distributed actor-critic </w:t>
+                    <w:t xml:space="preserve"> </w:t>
                   </w:r>
                   <w:r>
                     <w:rPr>
@@ -2625,8 +2914,9 @@
                       <w:bCs w:val="0"/>
                       <w:color w:val="7F7F7F" w:themeColor="text1" w:themeTint="80"/>
                     </w:rPr>
-                    <w:t xml:space="preserve">systems </w:t>
-                  </w:r>
+                    <w:t>a novel framework dubbed quantum-native reinforcement learning (</w:t>
+                  </w:r>
+                  <w:proofErr w:type="spellStart"/>
                   <w:r>
                     <w:rPr>
                       <w:rFonts w:ascii="Helvetica Neue" w:hAnsi="Helvetica Neue"/>
@@ -2634,7 +2924,131 @@
                       <w:bCs w:val="0"/>
                       <w:color w:val="7F7F7F" w:themeColor="text1" w:themeTint="80"/>
                     </w:rPr>
-                    <w:t>that facilitates cooperation over a quantum channel and eliminates local observation sharing via a quantum entangled split critic.</w:t>
+                    <w:t>QnRL</w:t>
+                  </w:r>
+                  <w:proofErr w:type="spellEnd"/>
+                  <w:r>
+                    <w:rPr>
+                      <w:rFonts w:ascii="Helvetica Neue" w:hAnsi="Helvetica Neue"/>
+                      <w:b w:val="0"/>
+                      <w:bCs w:val="0"/>
+                      <w:color w:val="7F7F7F" w:themeColor="text1" w:themeTint="80"/>
+                    </w:rPr>
+                    <w:t>) that natively learn</w:t>
+                  </w:r>
+                  <w:r>
+                    <w:rPr>
+                      <w:rFonts w:ascii="Helvetica Neue" w:hAnsi="Helvetica Neue"/>
+                      <w:b w:val="0"/>
+                      <w:bCs w:val="0"/>
+                      <w:color w:val="7F7F7F" w:themeColor="text1" w:themeTint="80"/>
+                    </w:rPr>
+                    <w:t>s</w:t>
+                  </w:r>
+                  <w:r>
+                    <w:rPr>
+                      <w:rFonts w:ascii="Helvetica Neue" w:hAnsi="Helvetica Neue"/>
+                      <w:b w:val="0"/>
+                      <w:bCs w:val="0"/>
+                      <w:color w:val="7F7F7F" w:themeColor="text1" w:themeTint="80"/>
+                    </w:rPr>
+                    <w:t xml:space="preserve"> conditional distributions naturally in Hilbert space via superimposed and entangled quantum states</w:t>
+                  </w:r>
+                  <w:r>
+                    <w:rPr>
+                      <w:rFonts w:ascii="Helvetica Neue" w:hAnsi="Helvetica Neue"/>
+                      <w:b w:val="0"/>
+                      <w:bCs w:val="0"/>
+                      <w:color w:val="7F7F7F" w:themeColor="text1" w:themeTint="80"/>
+                    </w:rPr>
+                    <w:t xml:space="preserve">, and </w:t>
+                  </w:r>
+                  <w:r>
+                    <w:rPr>
+                      <w:rFonts w:ascii="Helvetica Neue" w:hAnsi="Helvetica Neue"/>
+                      <w:b w:val="0"/>
+                      <w:bCs w:val="0"/>
+                      <w:color w:val="7F7F7F" w:themeColor="text1" w:themeTint="80"/>
+                    </w:rPr>
+                    <w:t>a novel</w:t>
+                  </w:r>
+                  <w:r>
+                    <w:rPr>
+                      <w:rFonts w:ascii="Helvetica Neue" w:hAnsi="Helvetica Neue"/>
+                      <w:b w:val="0"/>
+                      <w:bCs w:val="0"/>
+                      <w:color w:val="7F7F7F" w:themeColor="text1" w:themeTint="80"/>
+                    </w:rPr>
+                    <w:t xml:space="preserve"> </w:t>
+                  </w:r>
+                  <w:r>
+                    <w:rPr>
+                      <w:rFonts w:ascii="Helvetica Neue" w:hAnsi="Helvetica Neue"/>
+                      <w:b w:val="0"/>
+                      <w:bCs w:val="0"/>
+                      <w:color w:val="7F7F7F" w:themeColor="text1" w:themeTint="80"/>
+                    </w:rPr>
+                    <w:t>quantum amplitude kickback (</w:t>
+                  </w:r>
+                  <w:proofErr w:type="spellStart"/>
+                  <w:r>
+                    <w:rPr>
+                      <w:rFonts w:ascii="Helvetica Neue" w:hAnsi="Helvetica Neue"/>
+                      <w:b w:val="0"/>
+                      <w:bCs w:val="0"/>
+                      <w:color w:val="7F7F7F" w:themeColor="text1" w:themeTint="80"/>
+                    </w:rPr>
+                    <w:t>QuAK</w:t>
+                  </w:r>
+                  <w:proofErr w:type="spellEnd"/>
+                  <w:r>
+                    <w:rPr>
+                      <w:rFonts w:ascii="Helvetica Neue" w:hAnsi="Helvetica Neue"/>
+                      <w:b w:val="0"/>
+                      <w:bCs w:val="0"/>
+                      <w:color w:val="7F7F7F" w:themeColor="text1" w:themeTint="80"/>
+                    </w:rPr>
+                    <w:t>) algorithm that enables comparing the n-</w:t>
+                  </w:r>
+                  <w:proofErr w:type="spellStart"/>
+                  <w:r>
+                    <w:rPr>
+                      <w:rFonts w:ascii="Helvetica Neue" w:hAnsi="Helvetica Neue"/>
+                      <w:b w:val="0"/>
+                      <w:bCs w:val="0"/>
+                      <w:color w:val="7F7F7F" w:themeColor="text1" w:themeTint="80"/>
+                    </w:rPr>
+                    <w:t>th</w:t>
+                  </w:r>
+                  <w:proofErr w:type="spellEnd"/>
+                  <w:r>
+                    <w:rPr>
+                      <w:rFonts w:ascii="Helvetica Neue" w:hAnsi="Helvetica Neue"/>
+                      <w:b w:val="0"/>
+                      <w:bCs w:val="0"/>
+                      <w:color w:val="7F7F7F" w:themeColor="text1" w:themeTint="80"/>
+                    </w:rPr>
+                    <w:t xml:space="preserve"> power of the m-</w:t>
+                  </w:r>
+                  <w:proofErr w:type="spellStart"/>
+                  <w:r>
+                    <w:rPr>
+                      <w:rFonts w:ascii="Helvetica Neue" w:hAnsi="Helvetica Neue"/>
+                      <w:b w:val="0"/>
+                      <w:bCs w:val="0"/>
+                      <w:color w:val="7F7F7F" w:themeColor="text1" w:themeTint="80"/>
+                    </w:rPr>
+                    <w:t>th</w:t>
+                  </w:r>
+                  <w:proofErr w:type="spellEnd"/>
+                  <w:r>
+                    <w:rPr>
+                      <w:rFonts w:ascii="Helvetica Neue" w:hAnsi="Helvetica Neue"/>
+                      <w:b w:val="0"/>
+                      <w:bCs w:val="0"/>
+                      <w:color w:val="7F7F7F" w:themeColor="text1" w:themeTint="80"/>
+                    </w:rPr>
+                    <w:t xml:space="preserve"> moment of multiple superimposed distributions.</w:t>
                   </w:r>
                 </w:p>
               </w:tc>
@@ -2649,8 +3063,13 @@
                     <w:pStyle w:val="Heading2"/>
                     <w:keepNext w:val="0"/>
                   </w:pPr>
-                  <w:r>
-                    <w:t>A Bargaining Game for Personalized, Energy Efficient Split Learning over Wireless Networks</w:t>
+                  <w:proofErr w:type="spellStart"/>
+                  <w:r>
+                    <w:t>eQMARL</w:t>
+                  </w:r>
+                  <w:proofErr w:type="spellEnd"/>
+                  <w:r>
+                    <w:t>: Entangled Quantum Multi-Agent Reinforcement Learning for Distributed Cooperation over Quantum Channels</w:t>
                   </w:r>
                 </w:p>
               </w:tc>
@@ -2664,7 +3083,106 @@
                     <w:keepNext w:val="0"/>
                   </w:pPr>
                   <w:r>
+                    <w:t xml:space="preserve">[ </w:t>
+                  </w:r>
+                  <w:r>
+                    <w:t>4 / 2025</w:t>
+                  </w:r>
+                  <w:r>
+                    <w:t xml:space="preserve"> ]</w:t>
+                  </w:r>
+                </w:p>
+              </w:tc>
+            </w:tr>
+            <w:tr>
+              <w:tc>
+                <w:tcPr>
+                  <w:tcW w:w="5000" w:type="pct"/>
+                  <w:gridSpan w:val="2"/>
+                </w:tcPr>
+                <w:p>
+                  <w:pPr>
+                    <w:pStyle w:val="Dates"/>
+                    <w:keepNext w:val="0"/>
+                    <w:ind w:left="434" w:hanging="434"/>
+                    <w:jc w:val="left"/>
+                    <w:rPr>
+                      <w:rFonts w:ascii="Helvetica Neue" w:hAnsi="Helvetica Neue"/>
+                      <w:b w:val="0"/>
+                      <w:bCs w:val="0"/>
+                    </w:rPr>
+                  </w:pPr>
+                  <w:r>
+                    <w:rPr>
+                      <w:rFonts w:ascii="Helvetica Neue" w:hAnsi="Helvetica Neue"/>
+                      <w:b w:val="0"/>
+                      <w:bCs w:val="0"/>
+                      <w:color w:val="7F7F7F" w:themeColor="text1" w:themeTint="80"/>
+                    </w:rPr>
+                    <w:t xml:space="preserve">Developed a novel quantum multi-agent reinforcement learning framework for </w:t>
+                  </w:r>
+                  <w:r>
+                    <w:rPr>
+                      <w:rFonts w:ascii="Helvetica Neue" w:hAnsi="Helvetica Neue"/>
+                      <w:b w:val="0"/>
+                      <w:bCs w:val="0"/>
+                      <w:color w:val="7F7F7F" w:themeColor="text1" w:themeTint="80"/>
+                    </w:rPr>
+                    <w:t xml:space="preserve">distributed actor-critic </w:t>
+                  </w:r>
+                  <w:r>
+                    <w:rPr>
+                      <w:rFonts w:ascii="Helvetica Neue" w:hAnsi="Helvetica Neue"/>
+                      <w:b w:val="0"/>
+                      <w:bCs w:val="0"/>
+                      <w:color w:val="7F7F7F" w:themeColor="text1" w:themeTint="80"/>
+                    </w:rPr>
+                    <w:t xml:space="preserve">systems </w:t>
+                  </w:r>
+                  <w:r>
+                    <w:rPr>
+                      <w:rFonts w:ascii="Helvetica Neue" w:hAnsi="Helvetica Neue"/>
+                      <w:b w:val="0"/>
+                      <w:bCs w:val="0"/>
+                      <w:color w:val="7F7F7F" w:themeColor="text1" w:themeTint="80"/>
+                    </w:rPr>
+                    <w:t>that facilitates cooperation over a quantum channel and eliminates local observation sharing via a quantum entangled split critic.</w:t>
+                  </w:r>
+                </w:p>
+              </w:tc>
+            </w:tr>
+            <w:tr>
+              <w:tc>
+                <w:tcPr>
+                  <w:tcW w:w="4206" w:type="pct"/>
+                </w:tcPr>
+                <w:p>
+                  <w:pPr>
+                    <w:pStyle w:val="Heading2"/>
+                    <w:keepNext w:val="0"/>
+                  </w:pPr>
+                  <w:r>
+                    <w:t>A Bargaining Game for Personalized, Energy Efficient Split Learning over Wireless Networks</w:t>
+                  </w:r>
+                </w:p>
+              </w:tc>
+              <w:tc>
+                <w:tcPr>
+                  <w:tcW w:w="794" w:type="pct"/>
+                </w:tcPr>
+                <w:p>
+                  <w:pPr>
+                    <w:pStyle w:val="Dates"/>
+                    <w:keepNext w:val="0"/>
+                  </w:pPr>
+                  <w:r>
+                    <w:t xml:space="preserve">[ </w:t>
+                  </w:r>
+                  <w:r>
                     <w:t>3 / 2023</w:t>
+                  </w:r>
+                  <w:r>
+                    <w:t xml:space="preserve"> ]</w:t>
                   </w:r>
                 </w:p>
               </w:tc>
@@ -2862,8 +3380,13 @@
                     <w:pStyle w:val="Heading2"/>
                     <w:keepNext w:val="0"/>
                   </w:pPr>
-                  <w:r>
-                    <w:t>SmartStockRL: Intelligent Stock Trading using Traditional and Deep Q-Learning</w:t>
+                  <w:proofErr w:type="spellStart"/>
+                  <w:r>
+                    <w:t>SmartStockRL</w:t>
+                  </w:r>
+                  <w:proofErr w:type="spellEnd"/>
+                  <w:r>
+                    <w:t>: Intelligent Stock Trading using Traditional and Deep Q-Learning</w:t>
                   </w:r>
                 </w:p>
               </w:tc>
@@ -2973,8 +3496,13 @@
                     <w:pStyle w:val="Heading2"/>
                     <w:keepNext w:val="0"/>
                   </w:pPr>
-                  <w:r>
-                    <w:t>LyricAI: Using LSTMs to Write Religious Music</w:t>
+                  <w:proofErr w:type="spellStart"/>
+                  <w:r>
+                    <w:t>LyricAI</w:t>
+                  </w:r>
+                  <w:proofErr w:type="spellEnd"/>
+                  <w:r>
+                    <w:t>: Using LSTMs to Write Religious Music</w:t>
                   </w:r>
                 </w:p>
               </w:tc>
@@ -3352,7 +3880,23 @@
                     <w:pStyle w:val="Content"/>
                   </w:pPr>
                   <w:r>
-                    <w:t>Developed a RTL-SDR receiver system called ‘RadioPi’ to process local FM transmissions. Signal processing algorithms are written in Python using GNURadio API and custom signal blocks. Design elements include the Raspberry Pi, USB RTL-SDR antenna, and breadboard circuitry for user interface.</w:t>
+                    <w:t>Developed a RTL-SDR receiver system called ‘</w:t>
+                  </w:r>
+                  <w:proofErr w:type="spellStart"/>
+                  <w:r>
+                    <w:t>RadioPi</w:t>
+                  </w:r>
+                  <w:proofErr w:type="spellEnd"/>
+                  <w:r>
+                    <w:t xml:space="preserve">’ to process local FM transmissions. Signal processing algorithms are written in Python using </w:t>
+                  </w:r>
+                  <w:proofErr w:type="spellStart"/>
+                  <w:r>
+                    <w:t>GNURadio</w:t>
+                  </w:r>
+                  <w:proofErr w:type="spellEnd"/>
+                  <w:r>
+                    <w:t xml:space="preserve"> API and custom signal blocks. Design elements include the Raspberry Pi, USB RTL-SDR antenna, and breadboard circuitry for user interface.</w:t>
                   </w:r>
                 </w:p>
               </w:tc>
@@ -3759,6 +4303,12 @@
                   <w:r>
                     <w:t>Rust</w:t>
                   </w:r>
+                  <w:r>
+                    <w:t xml:space="preserve"> / </w:t>
+                  </w:r>
+                  <w:r>
+                    <w:t>Go</w:t>
+                  </w:r>
                 </w:p>
                 <w:p>
                   <w:pPr>
@@ -3770,7 +4320,7 @@
                     <w:ind w:left="345" w:hanging="164"/>
                   </w:pPr>
                   <w:r>
-                    <w:t>Go</w:t>
+                    <w:t>Fortran</w:t>
                   </w:r>
                 </w:p>
                 <w:p>
@@ -3783,19 +4333,6 @@
                     <w:ind w:left="345" w:hanging="164"/>
                   </w:pPr>
                   <w:r>
-                    <w:t>Fortran</w:t>
-                  </w:r>
-                </w:p>
-                <w:p>
-                  <w:pPr>
-                    <w:pStyle w:val="Content"/>
-                    <w:numPr>
-                      <w:ilvl w:val="0"/>
-                      <w:numId w:val="12"/>
-                    </w:numPr>
-                    <w:ind w:left="345" w:hanging="164"/>
-                  </w:pPr>
-                  <w:r>
                     <w:t>LaTeX</w:t>
                   </w:r>
                 </w:p>
@@ -3839,8 +4376,13 @@
                   <w:r>
                     <w:t xml:space="preserve">/ </w:t>
                   </w:r>
-                  <w:r>
-                    <w:t xml:space="preserve">PyTorch </w:t>
+                  <w:proofErr w:type="spellStart"/>
+                  <w:r>
+                    <w:t>PyTorch</w:t>
+                  </w:r>
+                  <w:proofErr w:type="spellEnd"/>
+                  <w:r>
+                    <w:t xml:space="preserve"> </w:t>
                   </w:r>
                   <w:r>
                     <w:t>/</w:t>
@@ -3853,7 +4395,21 @@
                   </w:r>
                   <w:r>
                     <w:br/>
-                    <w:t>/ Qiskit / Cirq / PennyLane / TensorFlow Quantum / Torch Quantum</w:t>
+                    <w:t xml:space="preserve">/ </w:t>
+                  </w:r>
+                  <w:r>
+                    <w:t xml:space="preserve">PennyLane </w:t>
+                  </w:r>
+                  <w:r>
+                    <w:t xml:space="preserve">/ </w:t>
+                  </w:r>
+                  <w:proofErr w:type="spellStart"/>
+                  <w:r>
+                    <w:t>Qiskit</w:t>
+                  </w:r>
+                  <w:proofErr w:type="spellEnd"/>
+                  <w:r>
+                    <w:t xml:space="preserve"> / Cirq / TensorFlow Quantum / Torch Quantum</w:t>
                   </w:r>
                   <w:r>
                     <w:br/>
@@ -3862,19 +4418,64 @@
                     <w:t xml:space="preserve">/ </w:t>
                   </w:r>
                   <w:r>
-                    <w:t xml:space="preserve">NumPy / Pandas / SciPy / Scikit-Learn / Matplotlib / Seaborn / Flask / NetworkX </w:t>
+                    <w:t xml:space="preserve">NumPy / Pandas / SciPy / Scikit-Learn / Matplotlib / Seaborn / Flask / </w:t>
+                  </w:r>
+                  <w:proofErr w:type="spellStart"/>
+                  <w:r>
+                    <w:t>NetworkX</w:t>
+                  </w:r>
+                  <w:proofErr w:type="spellEnd"/>
+                  <w:r>
+                    <w:t xml:space="preserve"> </w:t>
                   </w:r>
                   <w:r>
                     <w:br/>
                   </w:r>
                   <w:r>
-                    <w:t xml:space="preserve">/ BeautifulSoup / OpenCV / Pillow / PyQt / Pytest / </w:t>
+                    <w:t xml:space="preserve">/ </w:t>
+                  </w:r>
+                  <w:proofErr w:type="spellStart"/>
+                  <w:r>
+                    <w:t>BeautifulSoup</w:t>
+                  </w:r>
+                  <w:proofErr w:type="spellEnd"/>
+                  <w:r>
+                    <w:t xml:space="preserve"> / OpenCV / Pillow / </w:t>
+                  </w:r>
+                  <w:proofErr w:type="spellStart"/>
+                  <w:r>
+                    <w:t>PyQt</w:t>
+                  </w:r>
+                  <w:proofErr w:type="spellEnd"/>
+                  <w:r>
+                    <w:t xml:space="preserve"> / </w:t>
+                  </w:r>
+                  <w:proofErr w:type="spellStart"/>
+                  <w:r>
+                    <w:t>Pytest</w:t>
+                  </w:r>
+                  <w:proofErr w:type="spellEnd"/>
+                  <w:r>
+                    <w:t xml:space="preserve"> / </w:t>
                   </w:r>
                   <w:r>
                     <w:t xml:space="preserve">UV / </w:t>
                   </w:r>
-                  <w:r>
-                    <w:t>Pipenv / Pyenv / Requests</w:t>
+                  <w:proofErr w:type="spellStart"/>
+                  <w:r>
+                    <w:t>Pipenv</w:t>
+                  </w:r>
+                  <w:proofErr w:type="spellEnd"/>
+                  <w:r>
+                    <w:t xml:space="preserve"> / </w:t>
+                  </w:r>
+                  <w:proofErr w:type="spellStart"/>
+                  <w:r>
+                    <w:t>Pyenv</w:t>
+                  </w:r>
+                  <w:proofErr w:type="spellEnd"/>
+                  <w:r>
+                    <w:t xml:space="preserve"> / Requests</w:t>
                   </w:r>
                   <w:r>
                     <w:t xml:space="preserve"> </w:t>
@@ -4075,8 +4676,8 @@
               <w:tblLook w:val="04A0" w:firstRow="1" w:lastRow="0" w:firstColumn="1" w:lastColumn="0" w:noHBand="0" w:noVBand="1"/>
             </w:tblPr>
             <w:tblGrid>
-              <w:gridCol w:w="4840"/>
-              <w:gridCol w:w="4781"/>
+              <w:gridCol w:w="5484"/>
+              <w:gridCol w:w="4137"/>
               <w:gridCol w:w="4326"/>
             </w:tblGrid>
             <w:tr>
@@ -4086,7 +4687,7 @@
               </w:trPr>
               <w:tc>
                 <w:tcPr>
-                  <w:tcW w:w="1735" w:type="pct"/>
+                  <w:tcW w:w="1966" w:type="pct"/>
                 </w:tcPr>
                 <w:p>
                   <w:pPr>
@@ -4112,7 +4713,7 @@
               </w:tc>
               <w:tc>
                 <w:tcPr>
-                  <w:tcW w:w="1714" w:type="pct"/>
+                  <w:tcW w:w="1483" w:type="pct"/>
                 </w:tcPr>
                 <w:p>
                   <w:pPr>
@@ -4137,7 +4738,7 @@
               </w:trPr>
               <w:tc>
                 <w:tcPr>
-                  <w:tcW w:w="1735" w:type="pct"/>
+                  <w:tcW w:w="1966" w:type="pct"/>
                 </w:tcPr>
                 <w:p>
                   <w:pPr>
@@ -4169,7 +4770,15 @@
                     <w:t>Microservices</w:t>
                   </w:r>
                   <w:r>
-                    <w:t>:  Docker / Singularity / Podman / Kubernetes</w:t>
+                    <w:t xml:space="preserve">:  Docker / Singularity / </w:t>
+                  </w:r>
+                  <w:proofErr w:type="spellStart"/>
+                  <w:r>
+                    <w:t>Podman</w:t>
+                  </w:r>
+                  <w:proofErr w:type="spellEnd"/>
+                  <w:r>
+                    <w:t xml:space="preserve"> / Kubernetes</w:t>
                   </w:r>
                 </w:p>
                 <w:p>
@@ -4222,22 +4831,23 @@
                     <w:t>Databases</w:t>
                   </w:r>
                   <w:r>
-                    <w:t>:</w:t>
-                  </w:r>
-                  <w:r>
-                    <w:t xml:space="preserve"> </w:t>
-                  </w:r>
-                  <w:r>
-                    <w:t xml:space="preserve"> InfluxDB / MongoDB / MySQL / SQLite </w:t>
-                  </w:r>
-                  <w:r>
-                    <w:br/>
-                  </w:r>
-                  <w:r>
-                    <w:t xml:space="preserve">/ </w:t>
-                  </w:r>
-                  <w:r>
-                    <w:t xml:space="preserve">GraphQL / </w:t>
+                    <w:t xml:space="preserve">: </w:t>
+                  </w:r>
+                  <w:proofErr w:type="spellStart"/>
+                  <w:r>
+                    <w:t>InfluxDB</w:t>
+                  </w:r>
+                  <w:proofErr w:type="spellEnd"/>
+                  <w:r>
+                    <w:t xml:space="preserve"> / MongoDB / MySQL / SQLite / </w:t>
+                  </w:r>
+                  <w:proofErr w:type="spellStart"/>
+                  <w:r>
+                    <w:t>GraphQL</w:t>
+                  </w:r>
+                  <w:proofErr w:type="spellEnd"/>
+                  <w:r>
+                    <w:t xml:space="preserve"> / </w:t>
                   </w:r>
                   <w:r>
                     <w:t>Redis</w:t>
@@ -4253,6 +4863,9 @@
                     <w:ind w:left="345" w:hanging="164"/>
                   </w:pPr>
                   <w:r>
+                    <w:t xml:space="preserve">TCP / UDP </w:t>
+                  </w:r>
+                  <w:r>
                     <w:t>Networking</w:t>
                   </w:r>
                 </w:p>
@@ -4323,7 +4936,7 @@
               </w:tc>
               <w:tc>
                 <w:tcPr>
-                  <w:tcW w:w="3265" w:type="pct"/>
+                  <w:tcW w:w="3034" w:type="pct"/>
                   <w:gridSpan w:val="2"/>
                 </w:tcPr>
                 <w:p>
@@ -4414,7 +5027,13 @@
                     <w:t>Raspberry Pi / Arduino</w:t>
                   </w:r>
                   <w:r>
-                    <w:t xml:space="preserve"> / STM32</w:t>
+                    <w:t xml:space="preserve"> </w:t>
+                  </w:r>
+                  <w:r>
+                    <w:br/>
+                  </w:r>
+                  <w:r>
+                    <w:t>/ STM32</w:t>
                   </w:r>
                   <w:r>
                     <w:t xml:space="preserve"> / PIC32</w:t>
@@ -4524,8 +5143,13 @@
               <w:pStyle w:val="Heading2"/>
               <w:ind w:left="-13"/>
             </w:pPr>
-            <w:r>
-              <w:t xml:space="preserve">Eta Kappa Nu </w:t>
+            <w:proofErr w:type="spellStart"/>
+            <w:r>
+              <w:t>Eta</w:t>
+            </w:r>
+            <w:proofErr w:type="spellEnd"/>
+            <w:r>
+              <w:t xml:space="preserve"> Kappa Nu </w:t>
             </w:r>
             <w:r>
               <w:t>(Electrical Engineering Honor Society</w:t>
@@ -4889,59 +5513,8 @@
           </w:p>
         </w:tc>
       </w:tr>
-      <w:tr>
-        <w:tc>
-          <w:tcPr>
-            <w:tcW w:w="458" w:type="pct"/>
-          </w:tcPr>
-          <w:p>
-            <w:pPr>
-              <w:pStyle w:val="Heading1"/>
-              <w:keepNext w:val="0"/>
-              <w:rPr>
-                <w:sz w:val="10"/>
-                <w:szCs w:val="10"/>
-              </w:rPr>
-            </w:pPr>
-          </w:p>
-        </w:tc>
-        <w:tc>
-          <w:tcPr>
-            <w:tcW w:w="86" w:type="pct"/>
-          </w:tcPr>
-          <w:p>
-            <w:pPr>
-              <w:rPr>
-                <w:sz w:val="10"/>
-                <w:szCs w:val="10"/>
-              </w:rPr>
-            </w:pPr>
-          </w:p>
-        </w:tc>
-        <w:tc>
-          <w:tcPr>
-            <w:tcW w:w="4456" w:type="pct"/>
-          </w:tcPr>
-          <w:p>
-            <w:pPr>
-              <w:rPr>
-                <w:sz w:val="10"/>
-                <w:szCs w:val="10"/>
-              </w:rPr>
-            </w:pPr>
-          </w:p>
-        </w:tc>
-      </w:tr>
     </w:tbl>
-    <w:p>
-      <w:r>
-        <w:rPr>
-          <w:b/>
-          <w:bCs/>
-        </w:rPr>
-        <w:br w:type="page"/>
-      </w:r>
-    </w:p>
+    <w:p/>
     <w:tbl>
       <w:tblPr>
         <w:tblStyle w:val="TableGrid"/>
@@ -4982,7 +5555,6 @@
               </w:rPr>
             </w:pPr>
             <w:r>
-              <w:lastRenderedPageBreak/>
               <w:t>Activities &amp; Leadership</w:t>
             </w:r>
           </w:p>
@@ -5613,7 +6185,7 @@
       </w:pPr>
     </w:p>
     <w:sectPr>
-      <w:headerReference w:type="even" r:id="rId14"/>
+      <w:headerReference w:type="even" r:id="rId15"/>
       <w:pgSz w:w="12240" w:h="15840"/>
       <w:pgMar w:top="720" w:right="720" w:bottom="720" w:left="720" w:header="720" w:footer="720" w:gutter="0"/>
       <w:cols w:space="720"/>
@@ -7436,7 +8008,6 @@
   <w:style w:type="character" w:default="1" w:styleId="DefaultParagraphFont">
     <w:name w:val="Default Paragraph Font"/>
     <w:uiPriority w:val="1"/>
-    <w:semiHidden/>
     <w:unhideWhenUsed/>
   </w:style>
   <w:style w:type="table" w:default="1" w:styleId="TableNormal">
@@ -7982,6 +8553,7 @@
     <w:rsid w:val="0032046F"/>
     <w:rsid w:val="003A5844"/>
     <w:rsid w:val="004724DF"/>
+    <w:rsid w:val="004B2B15"/>
     <w:rsid w:val="004B72E9"/>
     <w:rsid w:val="004E6208"/>
     <w:rsid w:val="0053687F"/>
@@ -7995,6 +8567,7 @@
     <w:rsid w:val="008951BE"/>
     <w:rsid w:val="008B0C3B"/>
     <w:rsid w:val="00920774"/>
+    <w:rsid w:val="00963654"/>
     <w:rsid w:val="009B4380"/>
     <w:rsid w:val="00B16D3B"/>
     <w:rsid w:val="00B3182F"/>

</xml_diff>

<commit_message>
Update logo and spelling
</commit_message>
<xml_diff>
--- a/derieux_resume_multipage.docx
+++ b/derieux_resume_multipage.docx
@@ -64,9 +64,10 @@
             </w:pPr>
             <w:r>
               <w:rPr>
+                <w:rFonts w:hint="eastAsia"/>
                 <w:sz w:val="48"/>
               </w:rPr>
-              <w:t xml:space="preserve">&lt; </w:t>
+              <w:t>￨</w:t>
             </w:r>
             <w:r>
               <w:rPr>
@@ -79,7 +80,7 @@
               <w:rPr>
                 <w:sz w:val="48"/>
               </w:rPr>
-              <w:t xml:space="preserve"> /&gt;</w:t>
+              <w:sym w:font="Symbol" w:char="F0F1"/>
             </w:r>
           </w:p>
           <w:tbl>
@@ -221,6 +222,7 @@
                     <w:t xml:space="preserve">: </w:t>
                   </w:r>
                   <w:hyperlink r:id="rId8" w:history="1">
+                    <w:proofErr w:type="spellStart"/>
                     <w:r>
                       <w:rPr>
                         <w:rStyle w:val="Hyperlink"/>
@@ -231,6 +233,7 @@
                       </w:rPr>
                       <w:t>zanderman</w:t>
                     </w:r>
+                    <w:proofErr w:type="spellEnd"/>
                   </w:hyperlink>
                 </w:p>
               </w:tc>
@@ -260,6 +263,7 @@
                     <w:t xml:space="preserve">LinkedIn: </w:t>
                   </w:r>
                   <w:hyperlink r:id="rId9" w:history="1">
+                    <w:proofErr w:type="spellStart"/>
                     <w:r>
                       <w:rPr>
                         <w:rStyle w:val="Hyperlink"/>
@@ -270,6 +274,7 @@
                       </w:rPr>
                       <w:t>alexderieux</w:t>
                     </w:r>
+                    <w:proofErr w:type="spellEnd"/>
                   </w:hyperlink>
                 </w:p>
               </w:tc>
@@ -755,8 +760,13 @@
                     <w:keepNext w:val="0"/>
                   </w:pPr>
                   <w:r>
-                    <w:t>[ 8/2022 – Present ]</w:t>
-                  </w:r>
+                    <w:t xml:space="preserve">[ 8/2022 – </w:t>
+                  </w:r>
+                  <w:proofErr w:type="gramStart"/>
+                  <w:r>
+                    <w:t>Present ]</w:t>
+                  </w:r>
+                  <w:proofErr w:type="gramEnd"/>
                 </w:p>
               </w:tc>
             </w:tr>
@@ -897,8 +907,13 @@
                     <w:keepNext w:val="0"/>
                   </w:pPr>
                   <w:r>
-                    <w:t>[ 1/2021 – 8/2022 ]</w:t>
-                  </w:r>
+                    <w:t>[ 1/2021 – 8/</w:t>
+                  </w:r>
+                  <w:proofErr w:type="gramStart"/>
+                  <w:r>
+                    <w:t>2022 ]</w:t>
+                  </w:r>
+                  <w:proofErr w:type="gramEnd"/>
                 </w:p>
               </w:tc>
             </w:tr>
@@ -1071,8 +1086,13 @@
                     <w:keepNext w:val="0"/>
                   </w:pPr>
                   <w:r>
-                    <w:t>[ 8/2012 – 5/2016 ]</w:t>
-                  </w:r>
+                    <w:t>[ 8/2012 – 5/</w:t>
+                  </w:r>
+                  <w:proofErr w:type="gramStart"/>
+                  <w:r>
+                    <w:t>2016 ]</w:t>
+                  </w:r>
+                  <w:proofErr w:type="gramEnd"/>
                 </w:p>
               </w:tc>
             </w:tr>
@@ -1229,8 +1249,13 @@
                     <w:keepNext w:val="0"/>
                   </w:pPr>
                   <w:r>
-                    <w:t>[ 8/2012 – 12/2016 ]</w:t>
-                  </w:r>
+                    <w:t>[ 8/2012 – 12/</w:t>
+                  </w:r>
+                  <w:proofErr w:type="gramStart"/>
+                  <w:r>
+                    <w:t>2016 ]</w:t>
+                  </w:r>
+                  <w:proofErr w:type="gramEnd"/>
                 </w:p>
               </w:tc>
             </w:tr>
@@ -1413,8 +1438,13 @@
                     <w:keepNext w:val="0"/>
                   </w:pPr>
                   <w:r>
-                    <w:t>[ 8/2021 – Present ]</w:t>
-                  </w:r>
+                    <w:t xml:space="preserve">[ 8/2021 – </w:t>
+                  </w:r>
+                  <w:proofErr w:type="gramStart"/>
+                  <w:r>
+                    <w:t>Present ]</w:t>
+                  </w:r>
+                  <w:proofErr w:type="gramEnd"/>
                 </w:p>
               </w:tc>
             </w:tr>
@@ -1432,12 +1462,21 @@
                       <w:iCs/>
                     </w:rPr>
                   </w:pPr>
+                  <w:proofErr w:type="spellStart"/>
                   <w:r>
                     <w:rPr>
                       <w:i/>
                       <w:iCs/>
                     </w:rPr>
-                    <w:t>Wireless@VT, Virginia Polytechnic Institute and State University</w:t>
+                    <w:t>Wireless@VT</w:t>
+                  </w:r>
+                  <w:proofErr w:type="spellEnd"/>
+                  <w:r>
+                    <w:rPr>
+                      <w:i/>
+                      <w:iCs/>
+                    </w:rPr>
+                    <w:t>, Virginia Polytechnic Institute and State University</w:t>
                   </w:r>
                 </w:p>
                 <w:p>
@@ -1583,11 +1622,16 @@
                     <w:t xml:space="preserve"> </w:t>
                   </w:r>
                   <w:r>
-                    <w:t>05/2023</w:t>
+                    <w:t>05/</w:t>
+                  </w:r>
+                  <w:proofErr w:type="gramStart"/>
+                  <w:r>
+                    <w:t>2023</w:t>
                   </w:r>
                   <w:r>
                     <w:t xml:space="preserve"> ]</w:t>
                   </w:r>
+                  <w:proofErr w:type="gramEnd"/>
                 </w:p>
               </w:tc>
             </w:tr>
@@ -1730,11 +1774,16 @@
                     <w:t xml:space="preserve">[ 2/2017 – </w:t>
                   </w:r>
                   <w:r>
-                    <w:t>9/2024</w:t>
+                    <w:t>9/</w:t>
+                  </w:r>
+                  <w:proofErr w:type="gramStart"/>
+                  <w:r>
+                    <w:t>2024</w:t>
                   </w:r>
                   <w:r>
                     <w:t xml:space="preserve"> ]</w:t>
                   </w:r>
+                  <w:proofErr w:type="gramEnd"/>
                 </w:p>
               </w:tc>
             </w:tr>
@@ -1856,7 +1905,15 @@
                     <w:keepNext w:val="0"/>
                   </w:pPr>
                   <w:r>
-                    <w:t xml:space="preserve">[ 7/2012 – 2/2017 ] </w:t>
+                    <w:t>[ 7/2012 – 2/</w:t>
+                  </w:r>
+                  <w:proofErr w:type="gramStart"/>
+                  <w:r>
+                    <w:t>2017 ]</w:t>
+                  </w:r>
+                  <w:proofErr w:type="gramEnd"/>
+                  <w:r>
+                    <w:t xml:space="preserve"> </w:t>
                   </w:r>
                 </w:p>
               </w:tc>
@@ -1984,8 +2041,13 @@
                     <w:keepNext w:val="0"/>
                   </w:pPr>
                   <w:r>
-                    <w:t>[ 8/2016 – 12/2016 ]</w:t>
-                  </w:r>
+                    <w:t>[ 8/2016 – 12/</w:t>
+                  </w:r>
+                  <w:proofErr w:type="gramStart"/>
+                  <w:r>
+                    <w:t>2016 ]</w:t>
+                  </w:r>
+                  <w:proofErr w:type="gramEnd"/>
                 </w:p>
               </w:tc>
             </w:tr>
@@ -2104,7 +2166,15 @@
                     <w:keepNext w:val="0"/>
                   </w:pPr>
                   <w:r>
-                    <w:t xml:space="preserve">[ 1/2012 – 5/2012 ] </w:t>
+                    <w:t>[ 1/2012 – 5/</w:t>
+                  </w:r>
+                  <w:proofErr w:type="gramStart"/>
+                  <w:r>
+                    <w:t>2012 ]</w:t>
+                  </w:r>
+                  <w:proofErr w:type="gramEnd"/>
+                  <w:r>
+                    <w:t xml:space="preserve"> </w:t>
                   </w:r>
                 </w:p>
               </w:tc>
@@ -2251,8 +2321,25 @@
                 <w:b w:val="0"/>
                 <w:bCs w:val="0"/>
               </w:rPr>
-              <w:t xml:space="preserve">A. DeRieux and W. Saad, “QnRL: Quantum-Native Reinforcement Learning”, June 2026, </w:t>
-            </w:r>
+              <w:t>A. DeRieux and W. Saad, “</w:t>
+            </w:r>
+            <w:proofErr w:type="spellStart"/>
+            <w:r>
+              <w:rPr>
+                <w:b w:val="0"/>
+                <w:bCs w:val="0"/>
+              </w:rPr>
+              <w:t>QnRL</w:t>
+            </w:r>
+            <w:proofErr w:type="spellEnd"/>
+            <w:r>
+              <w:rPr>
+                <w:b w:val="0"/>
+                <w:bCs w:val="0"/>
+              </w:rPr>
+              <w:t xml:space="preserve">: Quantum-Native Reinforcement Learning”, June 2026, </w:t>
+            </w:r>
+            <w:proofErr w:type="spellStart"/>
             <w:r>
               <w:rPr>
                 <w:b w:val="0"/>
@@ -2262,12 +2349,29 @@
               </w:rPr>
               <w:t>arXiv</w:t>
             </w:r>
+            <w:proofErr w:type="spellEnd"/>
             <w:r>
               <w:rPr>
                 <w:b w:val="0"/>
                 <w:bCs w:val="0"/>
               </w:rPr>
-              <w:t xml:space="preserve">: arXiv:2606.08276. doi: </w:t>
+              <w:t xml:space="preserve">: arXiv:2606.08276. </w:t>
+            </w:r>
+            <w:proofErr w:type="spellStart"/>
+            <w:r>
+              <w:rPr>
+                <w:b w:val="0"/>
+                <w:bCs w:val="0"/>
+              </w:rPr>
+              <w:t>doi</w:t>
+            </w:r>
+            <w:proofErr w:type="spellEnd"/>
+            <w:r>
+              <w:rPr>
+                <w:b w:val="0"/>
+                <w:bCs w:val="0"/>
+              </w:rPr>
+              <w:t xml:space="preserve">: </w:t>
             </w:r>
             <w:hyperlink r:id="rId10" w:history="1">
               <w:r>
@@ -2305,7 +2409,23 @@
                 <w:b w:val="0"/>
                 <w:bCs w:val="0"/>
               </w:rPr>
-              <w:t xml:space="preserve">A. DeRieux and W. Saad, “eQMARL: Entangled Quantum Multi-Agent Reinforcement Learning for Distributed Cooperation over Quantum Channels”, </w:t>
+              <w:t>A. DeRieux and W. Saad, “</w:t>
+            </w:r>
+            <w:proofErr w:type="spellStart"/>
+            <w:r>
+              <w:rPr>
+                <w:b w:val="0"/>
+                <w:bCs w:val="0"/>
+              </w:rPr>
+              <w:t>eQMARL</w:t>
+            </w:r>
+            <w:proofErr w:type="spellEnd"/>
+            <w:r>
+              <w:rPr>
+                <w:b w:val="0"/>
+                <w:bCs w:val="0"/>
+              </w:rPr>
+              <w:t xml:space="preserve">: Entangled Quantum Multi-Agent Reinforcement Learning for Distributed Cooperation over Quantum Channels”, </w:t>
             </w:r>
             <w:r>
               <w:rPr>
@@ -2337,12 +2457,21 @@
               </w:rPr>
               <w:t xml:space="preserve"> </w:t>
             </w:r>
+            <w:proofErr w:type="spellStart"/>
             <w:r>
               <w:rPr>
                 <w:b w:val="0"/>
                 <w:bCs w:val="0"/>
               </w:rPr>
-              <w:t xml:space="preserve">doi: </w:t>
+              <w:t>doi</w:t>
+            </w:r>
+            <w:proofErr w:type="spellEnd"/>
+            <w:r>
+              <w:rPr>
+                <w:b w:val="0"/>
+                <w:bCs w:val="0"/>
+              </w:rPr>
+              <w:t xml:space="preserve">: </w:t>
             </w:r>
             <w:hyperlink r:id="rId11" w:history="1">
               <w:r>
@@ -2424,7 +2553,23 @@
                 <w:b w:val="0"/>
                 <w:bCs w:val="0"/>
               </w:rPr>
-              <w:t xml:space="preserve">March 2023, pp. 1-6. doi: </w:t>
+              <w:t xml:space="preserve">March 2023, pp. 1-6. </w:t>
+            </w:r>
+            <w:proofErr w:type="spellStart"/>
+            <w:r>
+              <w:rPr>
+                <w:b w:val="0"/>
+                <w:bCs w:val="0"/>
+              </w:rPr>
+              <w:t>doi</w:t>
+            </w:r>
+            <w:proofErr w:type="spellEnd"/>
+            <w:r>
+              <w:rPr>
+                <w:b w:val="0"/>
+                <w:bCs w:val="0"/>
+              </w:rPr>
+              <w:t xml:space="preserve">: </w:t>
             </w:r>
             <w:hyperlink r:id="rId12" w:history="1">
               <w:r>
@@ -2462,56 +2607,90 @@
                 <w:b w:val="0"/>
                 <w:bCs w:val="0"/>
               </w:rPr>
-              <w:t xml:space="preserve">A. C. DeRieux, W. Saad, W. Zuo, R. Budiarto, M. D. Koerniawan, and D. Novitasari, “A Transformer Framework for Data Fusion and Multi-Task Learning in Smart Cities”, </w:t>
-            </w:r>
+              <w:t xml:space="preserve">A. C. DeRieux, W. Saad, W. Zuo, R. Budiarto, M. D. </w:t>
+            </w:r>
+            <w:proofErr w:type="spellStart"/>
             <w:r>
               <w:rPr>
                 <w:b w:val="0"/>
                 <w:bCs w:val="0"/>
               </w:rPr>
-              <w:t xml:space="preserve">Nov. </w:t>
-            </w:r>
+              <w:t>Koerniawan</w:t>
+            </w:r>
+            <w:proofErr w:type="spellEnd"/>
             <w:r>
               <w:rPr>
                 <w:b w:val="0"/>
                 <w:bCs w:val="0"/>
               </w:rPr>
-              <w:t>2022</w:t>
+              <w:t xml:space="preserve">, and D. Novitasari, “A Transformer Framework for Data Fusion and Multi-Task Learning in Smart Cities”, </w:t>
             </w:r>
             <w:r>
               <w:rPr>
                 <w:b w:val="0"/>
                 <w:bCs w:val="0"/>
               </w:rPr>
-              <w:t>,</w:t>
+              <w:t xml:space="preserve">Nov. </w:t>
             </w:r>
             <w:r>
               <w:rPr>
                 <w:b w:val="0"/>
                 <w:bCs w:val="0"/>
               </w:rPr>
-              <w:t xml:space="preserve"> </w:t>
+              <w:t>2022</w:t>
             </w:r>
             <w:r>
               <w:rPr>
                 <w:b w:val="0"/>
                 <w:bCs w:val="0"/>
               </w:rPr>
-              <w:t>arXiv: arXiv:2211.10506</w:t>
+              <w:t>,</w:t>
             </w:r>
             <w:r>
               <w:rPr>
                 <w:b w:val="0"/>
                 <w:bCs w:val="0"/>
               </w:rPr>
-              <w:t xml:space="preserve">. </w:t>
-            </w:r>
+              <w:t xml:space="preserve"> </w:t>
+            </w:r>
+            <w:proofErr w:type="spellStart"/>
             <w:r>
               <w:rPr>
                 <w:b w:val="0"/>
                 <w:bCs w:val="0"/>
               </w:rPr>
-              <w:t xml:space="preserve">doi: </w:t>
+              <w:t>arXiv</w:t>
+            </w:r>
+            <w:proofErr w:type="spellEnd"/>
+            <w:r>
+              <w:rPr>
+                <w:b w:val="0"/>
+                <w:bCs w:val="0"/>
+              </w:rPr>
+              <w:t>: arXiv:2211.10506</w:t>
+            </w:r>
+            <w:r>
+              <w:rPr>
+                <w:b w:val="0"/>
+                <w:bCs w:val="0"/>
+              </w:rPr>
+              <w:t xml:space="preserve">. </w:t>
+            </w:r>
+            <w:proofErr w:type="spellStart"/>
+            <w:r>
+              <w:rPr>
+                <w:b w:val="0"/>
+                <w:bCs w:val="0"/>
+              </w:rPr>
+              <w:t>doi</w:t>
+            </w:r>
+            <w:proofErr w:type="spellEnd"/>
+            <w:r>
+              <w:rPr>
+                <w:b w:val="0"/>
+                <w:bCs w:val="0"/>
+              </w:rPr>
+              <w:t xml:space="preserve">: </w:t>
             </w:r>
             <w:hyperlink r:id="rId13" w:history="1">
               <w:r>
@@ -2717,8 +2896,13 @@
                     <w:pStyle w:val="Heading2"/>
                     <w:keepNext w:val="0"/>
                   </w:pPr>
-                  <w:r>
-                    <w:t>QnRL: Quantum-Native Reinforcement Learning</w:t>
+                  <w:proofErr w:type="spellStart"/>
+                  <w:r>
+                    <w:t>QnRL</w:t>
+                  </w:r>
+                  <w:proofErr w:type="spellEnd"/>
+                  <w:r>
+                    <w:t>: Quantum-Native Reinforcement Learning</w:t>
                   </w:r>
                 </w:p>
               </w:tc>
@@ -2735,11 +2919,16 @@
                     <w:t xml:space="preserve">[ </w:t>
                   </w:r>
                   <w:r>
-                    <w:t>6 / 2026</w:t>
+                    <w:t xml:space="preserve">6 / </w:t>
+                  </w:r>
+                  <w:proofErr w:type="gramStart"/>
+                  <w:r>
+                    <w:t>2026</w:t>
                   </w:r>
                   <w:r>
                     <w:t xml:space="preserve"> ]</w:t>
                   </w:r>
+                  <w:proofErr w:type="gramEnd"/>
                 </w:p>
               </w:tc>
             </w:tr>
@@ -2778,8 +2967,9 @@
                       <w:bCs w:val="0"/>
                       <w:color w:val="7F7F7F" w:themeColor="text1" w:themeTint="80"/>
                     </w:rPr>
-                    <w:t>a novel framework dubbed quantum-native reinforcement learning (QnRL) that natively learn</w:t>
-                  </w:r>
+                    <w:t>a novel framework dubbed quantum-native reinforcement learning (</w:t>
+                  </w:r>
+                  <w:proofErr w:type="spellStart"/>
                   <w:r>
                     <w:rPr>
                       <w:rFonts w:ascii="Helvetica Neue" w:hAnsi="Helvetica Neue"/>
@@ -2787,8 +2977,9 @@
                       <w:bCs w:val="0"/>
                       <w:color w:val="7F7F7F" w:themeColor="text1" w:themeTint="80"/>
                     </w:rPr>
-                    <w:t>s</w:t>
-                  </w:r>
+                    <w:t>QnRL</w:t>
+                  </w:r>
+                  <w:proofErr w:type="spellEnd"/>
                   <w:r>
                     <w:rPr>
                       <w:rFonts w:ascii="Helvetica Neue" w:hAnsi="Helvetica Neue"/>
@@ -2796,7 +2987,7 @@
                       <w:bCs w:val="0"/>
                       <w:color w:val="7F7F7F" w:themeColor="text1" w:themeTint="80"/>
                     </w:rPr>
-                    <w:t xml:space="preserve"> conditional distributions naturally in Hilbert space via superimposed and entangled quantum states</w:t>
+                    <w:t>) that natively learn</w:t>
                   </w:r>
                   <w:r>
                     <w:rPr>
@@ -2805,7 +2996,7 @@
                       <w:bCs w:val="0"/>
                       <w:color w:val="7F7F7F" w:themeColor="text1" w:themeTint="80"/>
                     </w:rPr>
-                    <w:t xml:space="preserve">, and </w:t>
+                    <w:t>s</w:t>
                   </w:r>
                   <w:r>
                     <w:rPr>
@@ -2814,7 +3005,7 @@
                       <w:bCs w:val="0"/>
                       <w:color w:val="7F7F7F" w:themeColor="text1" w:themeTint="80"/>
                     </w:rPr>
-                    <w:t>a novel</w:t>
+                    <w:t xml:space="preserve"> conditional distributions naturally in Hilbert space via superimposed and entangled quantum states</w:t>
                   </w:r>
                   <w:r>
                     <w:rPr>
@@ -2823,7 +3014,7 @@
                       <w:bCs w:val="0"/>
                       <w:color w:val="7F7F7F" w:themeColor="text1" w:themeTint="80"/>
                     </w:rPr>
-                    <w:t xml:space="preserve"> </w:t>
+                    <w:t xml:space="preserve">, and </w:t>
                   </w:r>
                   <w:r>
                     <w:rPr>
@@ -2832,7 +3023,85 @@
                       <w:bCs w:val="0"/>
                       <w:color w:val="7F7F7F" w:themeColor="text1" w:themeTint="80"/>
                     </w:rPr>
-                    <w:t>quantum amplitude kickback (QuAK) algorithm that enables comparing the n-th power of the m-th moment of multiple superimposed distributions.</w:t>
+                    <w:t>a novel</w:t>
+                  </w:r>
+                  <w:r>
+                    <w:rPr>
+                      <w:rFonts w:ascii="Helvetica Neue" w:hAnsi="Helvetica Neue"/>
+                      <w:b w:val="0"/>
+                      <w:bCs w:val="0"/>
+                      <w:color w:val="7F7F7F" w:themeColor="text1" w:themeTint="80"/>
+                    </w:rPr>
+                    <w:t xml:space="preserve"> </w:t>
+                  </w:r>
+                  <w:r>
+                    <w:rPr>
+                      <w:rFonts w:ascii="Helvetica Neue" w:hAnsi="Helvetica Neue"/>
+                      <w:b w:val="0"/>
+                      <w:bCs w:val="0"/>
+                      <w:color w:val="7F7F7F" w:themeColor="text1" w:themeTint="80"/>
+                    </w:rPr>
+                    <w:t>quantum amplitude kickback (</w:t>
+                  </w:r>
+                  <w:proofErr w:type="spellStart"/>
+                  <w:r>
+                    <w:rPr>
+                      <w:rFonts w:ascii="Helvetica Neue" w:hAnsi="Helvetica Neue"/>
+                      <w:b w:val="0"/>
+                      <w:bCs w:val="0"/>
+                      <w:color w:val="7F7F7F" w:themeColor="text1" w:themeTint="80"/>
+                    </w:rPr>
+                    <w:t>QuAK</w:t>
+                  </w:r>
+                  <w:proofErr w:type="spellEnd"/>
+                  <w:r>
+                    <w:rPr>
+                      <w:rFonts w:ascii="Helvetica Neue" w:hAnsi="Helvetica Neue"/>
+                      <w:b w:val="0"/>
+                      <w:bCs w:val="0"/>
+                      <w:color w:val="7F7F7F" w:themeColor="text1" w:themeTint="80"/>
+                    </w:rPr>
+                    <w:t>) algorithm that enables comparing the n-</w:t>
+                  </w:r>
+                  <w:proofErr w:type="spellStart"/>
+                  <w:r>
+                    <w:rPr>
+                      <w:rFonts w:ascii="Helvetica Neue" w:hAnsi="Helvetica Neue"/>
+                      <w:b w:val="0"/>
+                      <w:bCs w:val="0"/>
+                      <w:color w:val="7F7F7F" w:themeColor="text1" w:themeTint="80"/>
+                    </w:rPr>
+                    <w:t>th</w:t>
+                  </w:r>
+                  <w:proofErr w:type="spellEnd"/>
+                  <w:r>
+                    <w:rPr>
+                      <w:rFonts w:ascii="Helvetica Neue" w:hAnsi="Helvetica Neue"/>
+                      <w:b w:val="0"/>
+                      <w:bCs w:val="0"/>
+                      <w:color w:val="7F7F7F" w:themeColor="text1" w:themeTint="80"/>
+                    </w:rPr>
+                    <w:t xml:space="preserve"> power of the m-</w:t>
+                  </w:r>
+                  <w:proofErr w:type="spellStart"/>
+                  <w:r>
+                    <w:rPr>
+                      <w:rFonts w:ascii="Helvetica Neue" w:hAnsi="Helvetica Neue"/>
+                      <w:b w:val="0"/>
+                      <w:bCs w:val="0"/>
+                      <w:color w:val="7F7F7F" w:themeColor="text1" w:themeTint="80"/>
+                    </w:rPr>
+                    <w:t>th</w:t>
+                  </w:r>
+                  <w:proofErr w:type="spellEnd"/>
+                  <w:r>
+                    <w:rPr>
+                      <w:rFonts w:ascii="Helvetica Neue" w:hAnsi="Helvetica Neue"/>
+                      <w:b w:val="0"/>
+                      <w:bCs w:val="0"/>
+                      <w:color w:val="7F7F7F" w:themeColor="text1" w:themeTint="80"/>
+                    </w:rPr>
+                    <w:t xml:space="preserve"> moment of multiple superimposed distributions.</w:t>
                   </w:r>
                 </w:p>
               </w:tc>
@@ -2847,8 +3116,13 @@
                     <w:pStyle w:val="Heading2"/>
                     <w:keepNext w:val="0"/>
                   </w:pPr>
-                  <w:r>
-                    <w:t>eQMARL: Entangled Quantum Multi-Agent Reinforcement Learning for Distributed Cooperation over Quantum Channels</w:t>
+                  <w:proofErr w:type="spellStart"/>
+                  <w:r>
+                    <w:t>eQMARL</w:t>
+                  </w:r>
+                  <w:proofErr w:type="spellEnd"/>
+                  <w:r>
+                    <w:t>: Entangled Quantum Multi-Agent Reinforcement Learning for Distributed Cooperation over Quantum Channels</w:t>
                   </w:r>
                 </w:p>
               </w:tc>
@@ -2865,11 +3139,16 @@
                     <w:t xml:space="preserve">[ </w:t>
                   </w:r>
                   <w:r>
-                    <w:t>4 / 2025</w:t>
+                    <w:t xml:space="preserve">4 / </w:t>
+                  </w:r>
+                  <w:proofErr w:type="gramStart"/>
+                  <w:r>
+                    <w:t>2025</w:t>
                   </w:r>
                   <w:r>
                     <w:t xml:space="preserve"> ]</w:t>
                   </w:r>
+                  <w:proofErr w:type="gramEnd"/>
                 </w:p>
               </w:tc>
             </w:tr>
@@ -2958,11 +3237,16 @@
                     <w:t xml:space="preserve">[ </w:t>
                   </w:r>
                   <w:r>
-                    <w:t>3 / 2023</w:t>
+                    <w:t xml:space="preserve">3 / </w:t>
+                  </w:r>
+                  <w:proofErr w:type="gramStart"/>
+                  <w:r>
+                    <w:t>2023</w:t>
                   </w:r>
                   <w:r>
                     <w:t xml:space="preserve"> ]</w:t>
                   </w:r>
+                  <w:proofErr w:type="gramEnd"/>
                 </w:p>
               </w:tc>
             </w:tr>
@@ -3030,8 +3314,13 @@
                     <w:keepNext w:val="0"/>
                   </w:pPr>
                   <w:r>
-                    <w:t>[ 1/2021 – 8/2022 ]</w:t>
-                  </w:r>
+                    <w:t>[ 1/2021 – 8/</w:t>
+                  </w:r>
+                  <w:proofErr w:type="gramStart"/>
+                  <w:r>
+                    <w:t>2022 ]</w:t>
+                  </w:r>
+                  <w:proofErr w:type="gramEnd"/>
                 </w:p>
               </w:tc>
             </w:tr>
@@ -3159,8 +3448,13 @@
                     <w:pStyle w:val="Heading2"/>
                     <w:keepNext w:val="0"/>
                   </w:pPr>
-                  <w:r>
-                    <w:t>SmartStockRL: Intelligent Stock Trading using Traditional and Deep Q-Learning</w:t>
+                  <w:proofErr w:type="spellStart"/>
+                  <w:r>
+                    <w:t>SmartStockRL</w:t>
+                  </w:r>
+                  <w:proofErr w:type="spellEnd"/>
+                  <w:r>
+                    <w:t>: Intelligent Stock Trading using Traditional and Deep Q-Learning</w:t>
                   </w:r>
                 </w:p>
               </w:tc>
@@ -3174,8 +3468,13 @@
                     <w:keepNext w:val="0"/>
                   </w:pPr>
                   <w:r>
-                    <w:t>[ 10/2021 – 12/2021 ]</w:t>
-                  </w:r>
+                    <w:t>[ 10/2021 – 12/</w:t>
+                  </w:r>
+                  <w:proofErr w:type="gramStart"/>
+                  <w:r>
+                    <w:t>2021 ]</w:t>
+                  </w:r>
+                  <w:proofErr w:type="gramEnd"/>
                 </w:p>
               </w:tc>
             </w:tr>
@@ -3270,8 +3569,13 @@
                     <w:pStyle w:val="Heading2"/>
                     <w:keepNext w:val="0"/>
                   </w:pPr>
-                  <w:r>
-                    <w:t>LyricAI: Using LSTMs to Write Religious Music</w:t>
+                  <w:proofErr w:type="spellStart"/>
+                  <w:r>
+                    <w:t>LyricAI</w:t>
+                  </w:r>
+                  <w:proofErr w:type="spellEnd"/>
+                  <w:r>
+                    <w:t>: Using LSTMs to Write Religious Music</w:t>
                   </w:r>
                 </w:p>
               </w:tc>
@@ -3285,8 +3589,13 @@
                     <w:keepNext w:val="0"/>
                   </w:pPr>
                   <w:r>
-                    <w:t>[ 4/2021 – 5/2021 ]</w:t>
-                  </w:r>
+                    <w:t>[ 4/2021 – 5/</w:t>
+                  </w:r>
+                  <w:proofErr w:type="gramStart"/>
+                  <w:r>
+                    <w:t>2021 ]</w:t>
+                  </w:r>
+                  <w:proofErr w:type="gramEnd"/>
                 </w:p>
               </w:tc>
             </w:tr>
@@ -3396,8 +3705,13 @@
                     <w:keepNext w:val="0"/>
                   </w:pPr>
                   <w:r>
-                    <w:t>[ 8/2016 – 12/2016 ]</w:t>
-                  </w:r>
+                    <w:t>[ 8/2016 – 12/</w:t>
+                  </w:r>
+                  <w:proofErr w:type="gramStart"/>
+                  <w:r>
+                    <w:t>2016 ]</w:t>
+                  </w:r>
+                  <w:proofErr w:type="gramEnd"/>
                 </w:p>
               </w:tc>
             </w:tr>
@@ -3513,7 +3827,15 @@
                     <w:keepNext w:val="0"/>
                   </w:pPr>
                   <w:r>
-                    <w:t xml:space="preserve">[ 8/2015 – 5/2016 ] </w:t>
+                    <w:t>[ 8/2015 – 5/</w:t>
+                  </w:r>
+                  <w:proofErr w:type="gramStart"/>
+                  <w:r>
+                    <w:t>2016 ]</w:t>
+                  </w:r>
+                  <w:proofErr w:type="gramEnd"/>
+                  <w:r>
+                    <w:t xml:space="preserve"> </w:t>
                   </w:r>
                 </w:p>
               </w:tc>
@@ -3529,7 +3851,15 @@
                     <w:pStyle w:val="Content"/>
                   </w:pPr>
                   <w:r>
-                    <w:t xml:space="preserve">Created a wireless off-the-shelf device for interfacing with vehicle OBDII system. Developed companion Linux and mobile application software for wireless data acquisition and interaction. Learned project management, project documentation such as request for proposal, and customer relations from instructors that have extensive backgrounds in the corporate world. </w:t>
+                    <w:t xml:space="preserve">Created a wireless off-the-shelf device for interfacing with vehicle OBDII system. Developed companion Linux and mobile application software for wireless data acquisition and interaction. Learned project management, project documentation such as </w:t>
+                  </w:r>
+                  <w:proofErr w:type="gramStart"/>
+                  <w:r>
+                    <w:t>request</w:t>
+                  </w:r>
+                  <w:proofErr w:type="gramEnd"/>
+                  <w:r>
+                    <w:t xml:space="preserve"> for proposal, and customer relations from instructors that have extensive backgrounds in the corporate world. </w:t>
                   </w:r>
                 </w:p>
               </w:tc>
@@ -3633,8 +3963,13 @@
                     <w:keepNext w:val="0"/>
                   </w:pPr>
                   <w:r>
-                    <w:t>[ 1/2015 – 5/2015 ]</w:t>
-                  </w:r>
+                    <w:t>[ 1/2015 – 5/</w:t>
+                  </w:r>
+                  <w:proofErr w:type="gramStart"/>
+                  <w:r>
+                    <w:t>2015 ]</w:t>
+                  </w:r>
+                  <w:proofErr w:type="gramEnd"/>
                 </w:p>
               </w:tc>
             </w:tr>
@@ -3649,7 +3984,31 @@
                     <w:pStyle w:val="Content"/>
                   </w:pPr>
                   <w:r>
-                    <w:t>Developed a RTL-SDR receiver system called ‘RadioPi’ to process local FM transmissions. Signal processing algorithms are written in Python using GNURadio API and custom signal blocks. Design elements include the Raspberry Pi, USB RTL-SDR antenna, and breadboard circuitry for user interface.</w:t>
+                    <w:t xml:space="preserve">Developed </w:t>
+                  </w:r>
+                  <w:proofErr w:type="gramStart"/>
+                  <w:r>
+                    <w:t>a</w:t>
+                  </w:r>
+                  <w:proofErr w:type="gramEnd"/>
+                  <w:r>
+                    <w:t xml:space="preserve"> RTL-SDR receiver system called ‘</w:t>
+                  </w:r>
+                  <w:proofErr w:type="spellStart"/>
+                  <w:r>
+                    <w:t>RadioPi</w:t>
+                  </w:r>
+                  <w:proofErr w:type="spellEnd"/>
+                  <w:r>
+                    <w:t xml:space="preserve">’ to process local FM transmissions. Signal processing algorithms are written in Python using </w:t>
+                  </w:r>
+                  <w:proofErr w:type="spellStart"/>
+                  <w:r>
+                    <w:t>GNURadio</w:t>
+                  </w:r>
+                  <w:proofErr w:type="spellEnd"/>
+                  <w:r>
+                    <w:t xml:space="preserve"> API and custom signal blocks. Design elements include the Raspberry Pi, USB RTL-SDR antenna, and breadboard circuitry for user interface.</w:t>
                   </w:r>
                 </w:p>
               </w:tc>
@@ -3753,8 +4112,13 @@
                     <w:keepNext w:val="0"/>
                   </w:pPr>
                   <w:r>
-                    <w:t>[ 7/2015 – 08/2015 ]</w:t>
-                  </w:r>
+                    <w:t>[ 7/2015 – 08/</w:t>
+                  </w:r>
+                  <w:proofErr w:type="gramStart"/>
+                  <w:r>
+                    <w:t>2015 ]</w:t>
+                  </w:r>
+                  <w:proofErr w:type="gramEnd"/>
                 </w:p>
               </w:tc>
             </w:tr>
@@ -3772,7 +4136,13 @@
                     <w:pStyle w:val="Content"/>
                   </w:pPr>
                   <w:r>
-                    <w:t>Developed ‘Velo’, an Android mobile and wearable application that navigates exclusively using onboard GPS modules, thus bypassing the need for wireless data. Users can logon using Facebook and store their routes to local SQLite and online SQL databases using AWS. Crash detection is implemented using onboard gyroscope and accelerometer sensors, notifying a set of emergency contacts of your situation upon detection of the crash.</w:t>
+                    <w:t>Developed ‘Velo’, an Android mobile and wearable application that navigates exclusively using onboard GPS modules, thus bypassing the need for wireless data. Users can log</w:t>
+                  </w:r>
+                  <w:r>
+                    <w:t xml:space="preserve"> </w:t>
+                  </w:r>
+                  <w:r>
+                    <w:t>on using Facebook and store their routes to local SQLite and online SQL databases using AWS. Crash detection is implemented using onboard gyroscope and accelerometer sensors, notifying a set of emergency contacts of your situation upon detection of the crash.</w:t>
                   </w:r>
                 </w:p>
               </w:tc>
@@ -4129,8 +4499,13 @@
                   <w:r>
                     <w:t xml:space="preserve">/ </w:t>
                   </w:r>
-                  <w:r>
-                    <w:t xml:space="preserve">PyTorch </w:t>
+                  <w:proofErr w:type="spellStart"/>
+                  <w:r>
+                    <w:t>PyTorch</w:t>
+                  </w:r>
+                  <w:proofErr w:type="spellEnd"/>
+                  <w:r>
+                    <w:t xml:space="preserve"> </w:t>
                   </w:r>
                   <w:r>
                     <w:t>/</w:t>
@@ -4148,8 +4523,13 @@
                   <w:r>
                     <w:t xml:space="preserve">PennyLane / </w:t>
                   </w:r>
-                  <w:r>
-                    <w:t>Qiskit / Cirq / TensorFlow Quantum / Torch Quantum</w:t>
+                  <w:proofErr w:type="spellStart"/>
+                  <w:r>
+                    <w:t>Qiskit</w:t>
+                  </w:r>
+                  <w:proofErr w:type="spellEnd"/>
+                  <w:r>
+                    <w:t xml:space="preserve"> / Cirq / TensorFlow Quantum / Torch Quantum</w:t>
                   </w:r>
                   <w:r>
                     <w:br/>
@@ -4158,19 +4538,64 @@
                     <w:t xml:space="preserve">/ </w:t>
                   </w:r>
                   <w:r>
-                    <w:t xml:space="preserve">NumPy / Pandas / SciPy / Scikit-Learn / Matplotlib / Seaborn / Flask / NetworkX </w:t>
+                    <w:t xml:space="preserve">NumPy / Pandas / SciPy / Scikit-Learn / Matplotlib / Seaborn / Flask / </w:t>
+                  </w:r>
+                  <w:proofErr w:type="spellStart"/>
+                  <w:r>
+                    <w:t>NetworkX</w:t>
+                  </w:r>
+                  <w:proofErr w:type="spellEnd"/>
+                  <w:r>
+                    <w:t xml:space="preserve"> </w:t>
                   </w:r>
                   <w:r>
                     <w:br/>
                   </w:r>
                   <w:r>
-                    <w:t xml:space="preserve">/ BeautifulSoup / OpenCV / Pillow / PyQt / Pytest / </w:t>
+                    <w:t xml:space="preserve">/ </w:t>
+                  </w:r>
+                  <w:proofErr w:type="spellStart"/>
+                  <w:r>
+                    <w:t>BeautifulSoup</w:t>
+                  </w:r>
+                  <w:proofErr w:type="spellEnd"/>
+                  <w:r>
+                    <w:t xml:space="preserve"> / OpenCV / Pillow / </w:t>
+                  </w:r>
+                  <w:proofErr w:type="spellStart"/>
+                  <w:r>
+                    <w:t>PyQt</w:t>
+                  </w:r>
+                  <w:proofErr w:type="spellEnd"/>
+                  <w:r>
+                    <w:t xml:space="preserve"> / </w:t>
+                  </w:r>
+                  <w:proofErr w:type="spellStart"/>
+                  <w:r>
+                    <w:t>Pytest</w:t>
+                  </w:r>
+                  <w:proofErr w:type="spellEnd"/>
+                  <w:r>
+                    <w:t xml:space="preserve"> / </w:t>
                   </w:r>
                   <w:r>
                     <w:t xml:space="preserve">UV / </w:t>
                   </w:r>
-                  <w:r>
-                    <w:t>Pipenv / Pyenv / Requests</w:t>
+                  <w:proofErr w:type="spellStart"/>
+                  <w:r>
+                    <w:t>Pipenv</w:t>
+                  </w:r>
+                  <w:proofErr w:type="spellEnd"/>
+                  <w:r>
+                    <w:t xml:space="preserve"> / </w:t>
+                  </w:r>
+                  <w:proofErr w:type="spellStart"/>
+                  <w:r>
+                    <w:t>Pyenv</w:t>
+                  </w:r>
+                  <w:proofErr w:type="spellEnd"/>
+                  <w:r>
+                    <w:t xml:space="preserve"> / Requests</w:t>
                   </w:r>
                   <w:r>
                     <w:t xml:space="preserve"> </w:t>
@@ -4465,7 +4890,15 @@
                     <w:t>Microservices</w:t>
                   </w:r>
                   <w:r>
-                    <w:t>:  Docker / Singularity / Podman / Kubernetes</w:t>
+                    <w:t xml:space="preserve">:  Docker / Singularity / </w:t>
+                  </w:r>
+                  <w:proofErr w:type="spellStart"/>
+                  <w:r>
+                    <w:t>Podman</w:t>
+                  </w:r>
+                  <w:proofErr w:type="spellEnd"/>
+                  <w:r>
+                    <w:t xml:space="preserve"> / Kubernetes</w:t>
                   </w:r>
                 </w:p>
                 <w:p>
@@ -4518,10 +4951,23 @@
                     <w:t>Databases</w:t>
                   </w:r>
                   <w:r>
-                    <w:t xml:space="preserve">: InfluxDB / MongoDB / MySQL / SQLite / </w:t>
-                  </w:r>
-                  <w:r>
-                    <w:t xml:space="preserve">GraphQL / </w:t>
+                    <w:t xml:space="preserve">: </w:t>
+                  </w:r>
+                  <w:proofErr w:type="spellStart"/>
+                  <w:r>
+                    <w:t>InfluxDB</w:t>
+                  </w:r>
+                  <w:proofErr w:type="spellEnd"/>
+                  <w:r>
+                    <w:t xml:space="preserve"> / MongoDB / MySQL / SQLite / </w:t>
+                  </w:r>
+                  <w:proofErr w:type="spellStart"/>
+                  <w:r>
+                    <w:t>GraphQL</w:t>
+                  </w:r>
+                  <w:proofErr w:type="spellEnd"/>
+                  <w:r>
+                    <w:t xml:space="preserve"> / </w:t>
                   </w:r>
                   <w:r>
                     <w:t>Redis</w:t>
@@ -4817,124 +5263,52 @@
               <w:pStyle w:val="Heading2"/>
               <w:ind w:left="-13"/>
             </w:pPr>
-            <w:r>
-              <w:t xml:space="preserve">Eta Kappa Nu </w:t>
-            </w:r>
-            <w:r>
-              <w:t>(Electrical Engineering Honor Society</w:t>
+            <w:proofErr w:type="spellStart"/>
+            <w:r>
+              <w:t>Eta</w:t>
+            </w:r>
+            <w:proofErr w:type="spellEnd"/>
+            <w:r>
+              <w:t xml:space="preserve"> Kappa Nu </w:t>
+            </w:r>
+            <w:r>
+              <w:t xml:space="preserve">(Electrical Engineering Honor </w:t>
+            </w:r>
+            <w:proofErr w:type="gramStart"/>
+            <w:r>
+              <w:t>Society</w:t>
             </w:r>
             <w:r>
               <w:t xml:space="preserve">)   </w:t>
             </w:r>
+            <w:proofErr w:type="gramEnd"/>
             <w:r>
               <w:rPr>
                 <w:color w:val="4F81BD" w:themeColor="accent1"/>
                 <w:sz w:val="16"/>
                 <w:szCs w:val="24"/>
               </w:rPr>
-              <w:t>[ 2021 – Present ]</w:t>
-            </w:r>
-          </w:p>
-          <w:p>
-            <w:pPr>
-              <w:pStyle w:val="Heading2"/>
-              <w:ind w:left="-13"/>
-            </w:pPr>
-            <w:r>
-              <w:t xml:space="preserve">IEEE  </w:t>
-            </w:r>
+              <w:t xml:space="preserve">[ 2021 – </w:t>
+            </w:r>
+            <w:proofErr w:type="gramStart"/>
             <w:r>
               <w:rPr>
                 <w:color w:val="4F81BD" w:themeColor="accent1"/>
                 <w:sz w:val="16"/>
                 <w:szCs w:val="24"/>
               </w:rPr>
-              <w:t>[ 2021 – Present ]</w:t>
-            </w:r>
-          </w:p>
-        </w:tc>
-      </w:tr>
-      <w:tr>
-        <w:tc>
-          <w:tcPr>
-            <w:tcW w:w="458" w:type="pct"/>
-          </w:tcPr>
-          <w:p>
-            <w:pPr>
-              <w:pStyle w:val="Heading1"/>
-              <w:keepNext w:val="0"/>
-              <w:rPr>
-                <w:sz w:val="10"/>
-                <w:szCs w:val="10"/>
-              </w:rPr>
-            </w:pPr>
-          </w:p>
-        </w:tc>
-        <w:tc>
-          <w:tcPr>
-            <w:tcW w:w="86" w:type="pct"/>
-          </w:tcPr>
-          <w:p>
-            <w:pPr>
-              <w:rPr>
-                <w:sz w:val="10"/>
-                <w:szCs w:val="10"/>
-              </w:rPr>
-            </w:pPr>
-          </w:p>
-        </w:tc>
-        <w:tc>
-          <w:tcPr>
-            <w:tcW w:w="4456" w:type="pct"/>
-          </w:tcPr>
-          <w:p>
-            <w:pPr>
-              <w:rPr>
-                <w:sz w:val="10"/>
-                <w:szCs w:val="10"/>
-              </w:rPr>
-            </w:pPr>
-          </w:p>
-        </w:tc>
-      </w:tr>
-      <w:tr>
-        <w:tc>
-          <w:tcPr>
-            <w:tcW w:w="458" w:type="pct"/>
-          </w:tcPr>
-          <w:p>
-            <w:pPr>
-              <w:pStyle w:val="Heading1"/>
-              <w:keepNext w:val="0"/>
-            </w:pPr>
-            <w:r>
-              <w:t>Honors &amp; Awards</w:t>
-            </w:r>
-          </w:p>
-        </w:tc>
-        <w:tc>
-          <w:tcPr>
-            <w:tcW w:w="86" w:type="pct"/>
-          </w:tcPr>
-          <w:p/>
-        </w:tc>
-        <w:tc>
-          <w:tcPr>
-            <w:tcW w:w="4456" w:type="pct"/>
-          </w:tcPr>
+              <w:t>Present ]</w:t>
+            </w:r>
+            <w:proofErr w:type="gramEnd"/>
+          </w:p>
           <w:p>
             <w:pPr>
               <w:pStyle w:val="Heading2"/>
               <w:ind w:left="-13"/>
             </w:pPr>
-            <w:r>
-              <w:t>Bradley Fellowship</w:t>
-            </w:r>
-            <w:r>
-              <w:t xml:space="preserve"> </w:t>
-            </w:r>
-            <w:r>
-              <w:t xml:space="preserve"> </w:t>
+            <w:proofErr w:type="gramStart"/>
+            <w:r>
+              <w:t xml:space="preserve">IEEE  </w:t>
             </w:r>
             <w:r>
               <w:rPr>
@@ -4942,24 +5316,163 @@
                 <w:sz w:val="16"/>
                 <w:szCs w:val="24"/>
               </w:rPr>
-              <w:t>[ 202</w:t>
-            </w:r>
+              <w:t>[</w:t>
+            </w:r>
+            <w:proofErr w:type="gramEnd"/>
             <w:r>
               <w:rPr>
                 <w:color w:val="4F81BD" w:themeColor="accent1"/>
                 <w:sz w:val="16"/>
                 <w:szCs w:val="24"/>
               </w:rPr>
-              <w:t>2</w:t>
-            </w:r>
+              <w:t xml:space="preserve"> 2021 – </w:t>
+            </w:r>
+            <w:proofErr w:type="gramStart"/>
             <w:r>
               <w:rPr>
                 <w:color w:val="4F81BD" w:themeColor="accent1"/>
                 <w:sz w:val="16"/>
                 <w:szCs w:val="24"/>
               </w:rPr>
-              <w:t xml:space="preserve"> – Present ]</w:t>
-            </w:r>
+              <w:t>Present ]</w:t>
+            </w:r>
+            <w:proofErr w:type="gramEnd"/>
+          </w:p>
+        </w:tc>
+      </w:tr>
+      <w:tr>
+        <w:tc>
+          <w:tcPr>
+            <w:tcW w:w="458" w:type="pct"/>
+          </w:tcPr>
+          <w:p>
+            <w:pPr>
+              <w:pStyle w:val="Heading1"/>
+              <w:keepNext w:val="0"/>
+              <w:rPr>
+                <w:sz w:val="10"/>
+                <w:szCs w:val="10"/>
+              </w:rPr>
+            </w:pPr>
+          </w:p>
+        </w:tc>
+        <w:tc>
+          <w:tcPr>
+            <w:tcW w:w="86" w:type="pct"/>
+          </w:tcPr>
+          <w:p>
+            <w:pPr>
+              <w:rPr>
+                <w:sz w:val="10"/>
+                <w:szCs w:val="10"/>
+              </w:rPr>
+            </w:pPr>
+          </w:p>
+        </w:tc>
+        <w:tc>
+          <w:tcPr>
+            <w:tcW w:w="4456" w:type="pct"/>
+          </w:tcPr>
+          <w:p>
+            <w:pPr>
+              <w:rPr>
+                <w:sz w:val="10"/>
+                <w:szCs w:val="10"/>
+              </w:rPr>
+            </w:pPr>
+          </w:p>
+        </w:tc>
+      </w:tr>
+      <w:tr>
+        <w:tc>
+          <w:tcPr>
+            <w:tcW w:w="458" w:type="pct"/>
+          </w:tcPr>
+          <w:p>
+            <w:pPr>
+              <w:pStyle w:val="Heading1"/>
+              <w:keepNext w:val="0"/>
+            </w:pPr>
+            <w:r>
+              <w:t>Honors &amp; Awards</w:t>
+            </w:r>
+          </w:p>
+        </w:tc>
+        <w:tc>
+          <w:tcPr>
+            <w:tcW w:w="86" w:type="pct"/>
+          </w:tcPr>
+          <w:p/>
+        </w:tc>
+        <w:tc>
+          <w:tcPr>
+            <w:tcW w:w="4456" w:type="pct"/>
+          </w:tcPr>
+          <w:p>
+            <w:pPr>
+              <w:pStyle w:val="Heading2"/>
+              <w:ind w:left="-13"/>
+            </w:pPr>
+            <w:r>
+              <w:t>Bradley Fellowship</w:t>
+            </w:r>
+            <w:r>
+              <w:t xml:space="preserve">, </w:t>
+            </w:r>
+            <w:r>
+              <w:rPr>
+                <w:b w:val="0"/>
+                <w:bCs w:val="0"/>
+              </w:rPr>
+              <w:t>Virginia Tech</w:t>
+            </w:r>
+            <w:r>
+              <w:t xml:space="preserve">, </w:t>
+            </w:r>
+            <w:r>
+              <w:rPr>
+                <w:b w:val="0"/>
+                <w:bCs w:val="0"/>
+              </w:rPr>
+              <w:t>Department of Electrical and Computer Engineering</w:t>
+            </w:r>
+            <w:r>
+              <w:t xml:space="preserve"> </w:t>
+            </w:r>
+            <w:r>
+              <w:rPr>
+                <w:color w:val="4F81BD" w:themeColor="accent1"/>
+                <w:sz w:val="16"/>
+                <w:szCs w:val="24"/>
+              </w:rPr>
+              <w:t>[ 202</w:t>
+            </w:r>
+            <w:r>
+              <w:rPr>
+                <w:color w:val="4F81BD" w:themeColor="accent1"/>
+                <w:sz w:val="16"/>
+                <w:szCs w:val="24"/>
+              </w:rPr>
+              <w:t>2</w:t>
+            </w:r>
+            <w:r>
+              <w:rPr>
+                <w:color w:val="4F81BD" w:themeColor="accent1"/>
+                <w:sz w:val="16"/>
+                <w:szCs w:val="24"/>
+              </w:rPr>
+              <w:t xml:space="preserve"> – </w:t>
+            </w:r>
+            <w:proofErr w:type="gramStart"/>
+            <w:r>
+              <w:rPr>
+                <w:color w:val="4F81BD" w:themeColor="accent1"/>
+                <w:sz w:val="16"/>
+                <w:szCs w:val="24"/>
+              </w:rPr>
+              <w:t>Present ]</w:t>
+            </w:r>
+            <w:proofErr w:type="gramEnd"/>
           </w:p>
           <w:p>
             <w:pPr>
@@ -5308,6 +5821,7 @@
                     </w:rPr>
                     <w:t xml:space="preserve"> – </w:t>
                   </w:r>
+                  <w:proofErr w:type="gramStart"/>
                   <w:r>
                     <w:rPr>
                       <w:color w:val="4F81BD" w:themeColor="accent1"/>
@@ -5322,7 +5836,16 @@
                       <w:sz w:val="16"/>
                       <w:szCs w:val="16"/>
                     </w:rPr>
-                    <w:t xml:space="preserve"> ] </w:t>
+                    <w:t xml:space="preserve"> ]</w:t>
+                  </w:r>
+                  <w:proofErr w:type="gramEnd"/>
+                  <w:r>
+                    <w:rPr>
+                      <w:color w:val="4F81BD" w:themeColor="accent1"/>
+                      <w:sz w:val="16"/>
+                      <w:szCs w:val="16"/>
+                    </w:rPr>
+                    <w:t xml:space="preserve"> </w:t>
                   </w:r>
                   <w:r>
                     <w:rPr>
@@ -5423,7 +5946,28 @@
                     <w:keepNext w:val="0"/>
                   </w:pPr>
                   <w:r>
-                    <w:t xml:space="preserve">Church AV, IT, and Experience Teams </w:t>
+                    <w:t>Church A</w:t>
+                  </w:r>
+                  <w:r>
+                    <w:t>udio-</w:t>
+                  </w:r>
+                  <w:r>
+                    <w:t>V</w:t>
+                  </w:r>
+                  <w:r>
+                    <w:t>isual</w:t>
+                  </w:r>
+                  <w:r>
+                    <w:t xml:space="preserve"> (AV)</w:t>
+                  </w:r>
+                  <w:r>
+                    <w:t xml:space="preserve">, </w:t>
+                  </w:r>
+                  <w:r>
+                    <w:t>Information Technology (IT)</w:t>
+                  </w:r>
+                  <w:r>
+                    <w:t xml:space="preserve">, and Experience Teams </w:t>
                   </w:r>
                   <w:r>
                     <w:rPr>
@@ -5449,6 +5993,7 @@
                     </w:rPr>
                     <w:t xml:space="preserve"> – </w:t>
                   </w:r>
+                  <w:proofErr w:type="gramStart"/>
                   <w:r>
                     <w:rPr>
                       <w:color w:val="4F81BD" w:themeColor="accent1"/>
@@ -5465,6 +6010,7 @@
                     </w:rPr>
                     <w:t xml:space="preserve"> ]</w:t>
                   </w:r>
+                  <w:proofErr w:type="gramEnd"/>
                   <w:r>
                     <w:rPr>
                       <w:color w:val="4F81BD" w:themeColor="accent1"/>
@@ -5511,7 +6057,7 @@
                       <w:sz w:val="16"/>
                       <w:szCs w:val="16"/>
                     </w:rPr>
-                    <w:t xml:space="preserve">on the </w:t>
+                    <w:t xml:space="preserve">to serve </w:t>
                   </w:r>
                   <w:r>
                     <w:rPr>
@@ -5521,7 +6067,7 @@
                       <w:sz w:val="16"/>
                       <w:szCs w:val="16"/>
                     </w:rPr>
-                    <w:t>AV</w:t>
+                    <w:t xml:space="preserve">on the </w:t>
                   </w:r>
                   <w:r>
                     <w:rPr>
@@ -5531,7 +6077,7 @@
                       <w:sz w:val="16"/>
                       <w:szCs w:val="16"/>
                     </w:rPr>
-                    <w:t xml:space="preserve">, </w:t>
+                    <w:t>AV</w:t>
                   </w:r>
                   <w:r>
                     <w:rPr>
@@ -5541,7 +6087,7 @@
                       <w:sz w:val="16"/>
                       <w:szCs w:val="16"/>
                     </w:rPr>
-                    <w:t>IT</w:t>
+                    <w:t xml:space="preserve">, </w:t>
                   </w:r>
                   <w:r>
                     <w:rPr>
@@ -5551,10 +6097,17 @@
                       <w:sz w:val="16"/>
                       <w:szCs w:val="16"/>
                     </w:rPr>
+                    <w:t>IT</w:t>
+                  </w:r>
+                  <w:r>
+                    <w:rPr>
+                      <w:b w:val="0"/>
+                      <w:bCs w:val="0"/>
+                      <w:color w:val="7F7F7F" w:themeColor="text1" w:themeTint="80"/>
+                      <w:sz w:val="16"/>
+                      <w:szCs w:val="16"/>
+                    </w:rPr>
                     <w:t>, and experience teams.</w:t>
-                  </w:r>
-                  <w:r>
-                    <w:t xml:space="preserve">  </w:t>
                   </w:r>
                 </w:p>
               </w:tc>
@@ -5639,7 +6192,25 @@
                       <w:sz w:val="16"/>
                       <w:szCs w:val="16"/>
                     </w:rPr>
-                    <w:t xml:space="preserve">[ 2013 – 2014 ] </w:t>
+                    <w:t xml:space="preserve">[ 2013 – </w:t>
+                  </w:r>
+                  <w:proofErr w:type="gramStart"/>
+                  <w:r>
+                    <w:rPr>
+                      <w:color w:val="4F81BD" w:themeColor="accent1"/>
+                      <w:sz w:val="16"/>
+                      <w:szCs w:val="16"/>
+                    </w:rPr>
+                    <w:t>2014 ]</w:t>
+                  </w:r>
+                  <w:proofErr w:type="gramEnd"/>
+                  <w:r>
+                    <w:rPr>
+                      <w:color w:val="4F81BD" w:themeColor="accent1"/>
+                      <w:sz w:val="16"/>
+                      <w:szCs w:val="16"/>
+                    </w:rPr>
+                    <w:t xml:space="preserve"> </w:t>
                   </w:r>
                   <w:r>
                     <w:rPr>
@@ -5751,7 +6322,18 @@
                       <w:sz w:val="16"/>
                       <w:szCs w:val="16"/>
                     </w:rPr>
-                    <w:t>Belgium, Canada, France, Germany, Mexico, Netherlands, U.S. &amp; Hawaii</w:t>
+                    <w:t>Singapore, B</w:t>
+                  </w:r>
+                  <w:r>
+                    <w:rPr>
+                      <w:rFonts w:ascii="Helvetica Neue" w:hAnsi="Helvetica Neue"/>
+                      <w:b w:val="0"/>
+                      <w:bCs w:val="0"/>
+                      <w:color w:val="7F7F7F" w:themeColor="text1" w:themeTint="80"/>
+                      <w:sz w:val="16"/>
+                      <w:szCs w:val="16"/>
+                    </w:rPr>
+                    <w:t>elgium, Canada, France, Germany, Mexico, Netherlands, U.S. &amp; Hawaii</w:t>
                   </w:r>
                 </w:p>
               </w:tc>
@@ -8218,12 +8800,12 @@
     <w:rsid w:val="001078C8"/>
     <w:rsid w:val="001E6351"/>
     <w:rsid w:val="0021737E"/>
-    <w:rsid w:val="002250DA"/>
     <w:rsid w:val="00230187"/>
     <w:rsid w:val="00302FDA"/>
     <w:rsid w:val="0032046F"/>
     <w:rsid w:val="003A5844"/>
     <w:rsid w:val="004724DF"/>
+    <w:rsid w:val="004A4065"/>
     <w:rsid w:val="004B2B15"/>
     <w:rsid w:val="004B72E9"/>
     <w:rsid w:val="004E6208"/>

</xml_diff>

<commit_message>
Add service section with reviewer list
</commit_message>
<xml_diff>
--- a/derieux_resume_multipage.docx
+++ b/derieux_resume_multipage.docx
@@ -4424,7 +4424,7 @@
                       <w:ilvl w:val="0"/>
                       <w:numId w:val="12"/>
                     </w:numPr>
-                    <w:ind w:left="345" w:hanging="164"/>
+                    <w:ind w:left="245" w:hanging="164"/>
                   </w:pPr>
                   <w:r>
                     <w:t>Python</w:t>
@@ -4437,7 +4437,7 @@
                       <w:ilvl w:val="0"/>
                       <w:numId w:val="12"/>
                     </w:numPr>
-                    <w:ind w:left="345" w:hanging="164"/>
+                    <w:ind w:left="245" w:hanging="164"/>
                   </w:pPr>
                   <w:r>
                     <w:t>C / C++</w:t>
@@ -4453,7 +4453,7 @@
                       <w:ilvl w:val="0"/>
                       <w:numId w:val="12"/>
                     </w:numPr>
-                    <w:ind w:left="345" w:hanging="164"/>
+                    <w:ind w:left="245" w:hanging="164"/>
                   </w:pPr>
                   <w:r>
                     <w:t>MATLAB</w:t>
@@ -4466,7 +4466,7 @@
                       <w:ilvl w:val="0"/>
                       <w:numId w:val="12"/>
                     </w:numPr>
-                    <w:ind w:left="345" w:hanging="164"/>
+                    <w:ind w:left="245" w:hanging="164"/>
                   </w:pPr>
                   <w:r>
                     <w:t xml:space="preserve">JavaScript / </w:t>
@@ -4497,7 +4497,7 @@
                       <w:ilvl w:val="0"/>
                       <w:numId w:val="12"/>
                     </w:numPr>
-                    <w:ind w:left="345" w:hanging="164"/>
+                    <w:ind w:left="245" w:hanging="164"/>
                   </w:pPr>
                   <w:r>
                     <w:t>Java</w:t>
@@ -4510,7 +4510,7 @@
                       <w:ilvl w:val="0"/>
                       <w:numId w:val="12"/>
                     </w:numPr>
-                    <w:ind w:left="345" w:hanging="164"/>
+                    <w:ind w:left="245" w:hanging="164"/>
                   </w:pPr>
                   <w:r>
                     <w:t>Rust</w:t>
@@ -4529,7 +4529,7 @@
                       <w:ilvl w:val="0"/>
                       <w:numId w:val="12"/>
                     </w:numPr>
-                    <w:ind w:left="345" w:hanging="164"/>
+                    <w:ind w:left="245" w:hanging="164"/>
                   </w:pPr>
                   <w:r>
                     <w:t>Fortran</w:t>
@@ -4542,7 +4542,7 @@
                       <w:ilvl w:val="0"/>
                       <w:numId w:val="12"/>
                     </w:numPr>
-                    <w:ind w:left="345" w:hanging="164"/>
+                    <w:ind w:left="245" w:hanging="164"/>
                   </w:pPr>
                   <w:r>
                     <w:t>LaTeX</w:t>
@@ -4561,7 +4561,7 @@
                       <w:ilvl w:val="0"/>
                       <w:numId w:val="12"/>
                     </w:numPr>
-                    <w:ind w:left="368" w:hanging="187"/>
+                    <w:ind w:left="278" w:hanging="187"/>
                   </w:pPr>
                   <w:r>
                     <w:rPr>
@@ -4648,7 +4648,7 @@
                       <w:ilvl w:val="0"/>
                       <w:numId w:val="12"/>
                     </w:numPr>
-                    <w:ind w:left="368" w:hanging="187"/>
+                    <w:ind w:left="278" w:hanging="187"/>
                   </w:pPr>
                   <w:r>
                     <w:rPr>
@@ -4691,7 +4691,7 @@
                       <w:ilvl w:val="0"/>
                       <w:numId w:val="12"/>
                     </w:numPr>
-                    <w:ind w:left="368" w:hanging="187"/>
+                    <w:ind w:left="278" w:hanging="187"/>
                   </w:pPr>
                   <w:r>
                     <w:t>Grafana</w:t>
@@ -4704,7 +4704,7 @@
                       <w:ilvl w:val="0"/>
                       <w:numId w:val="12"/>
                     </w:numPr>
-                    <w:ind w:left="368" w:hanging="187"/>
+                    <w:ind w:left="278" w:hanging="187"/>
                   </w:pPr>
                   <w:r>
                     <w:t>Canvas LMS</w:t>
@@ -4901,7 +4901,7 @@
                       <w:ilvl w:val="0"/>
                       <w:numId w:val="12"/>
                     </w:numPr>
-                    <w:ind w:left="345" w:hanging="164"/>
+                    <w:ind w:left="245" w:hanging="164"/>
                   </w:pPr>
                   <w:r>
                     <w:t>SLURM for high performance computing systems</w:t>
@@ -4914,7 +4914,7 @@
                       <w:ilvl w:val="0"/>
                       <w:numId w:val="12"/>
                     </w:numPr>
-                    <w:ind w:left="345" w:hanging="164"/>
+                    <w:ind w:left="245" w:hanging="164"/>
                   </w:pPr>
                   <w:r>
                     <w:rPr>
@@ -4934,7 +4934,7 @@
                       <w:ilvl w:val="0"/>
                       <w:numId w:val="12"/>
                     </w:numPr>
-                    <w:ind w:left="345" w:hanging="164"/>
+                    <w:ind w:left="245" w:hanging="164"/>
                   </w:pPr>
                   <w:r>
                     <w:t>Continuous Integration and Continuous Delivery (CI/CD)</w:t>
@@ -4947,7 +4947,7 @@
                       <w:ilvl w:val="0"/>
                       <w:numId w:val="12"/>
                     </w:numPr>
-                    <w:ind w:left="345" w:hanging="164"/>
+                    <w:ind w:left="245" w:hanging="164"/>
                   </w:pPr>
                   <w:r>
                     <w:rPr>
@@ -4967,7 +4967,7 @@
                       <w:ilvl w:val="0"/>
                       <w:numId w:val="12"/>
                     </w:numPr>
-                    <w:ind w:left="345" w:hanging="164"/>
+                    <w:ind w:left="245" w:hanging="164"/>
                   </w:pPr>
                   <w:r>
                     <w:rPr>
@@ -4993,7 +4993,7 @@
                       <w:ilvl w:val="0"/>
                       <w:numId w:val="12"/>
                     </w:numPr>
-                    <w:ind w:left="345" w:hanging="164"/>
+                    <w:ind w:left="245" w:hanging="164"/>
                   </w:pPr>
                   <w:r>
                     <w:t xml:space="preserve">TCP / UDP </w:t>
@@ -5009,7 +5009,7 @@
                       <w:ilvl w:val="0"/>
                       <w:numId w:val="12"/>
                     </w:numPr>
-                    <w:ind w:left="345" w:hanging="164"/>
+                    <w:ind w:left="245" w:hanging="164"/>
                   </w:pPr>
                   <w:r>
                     <w:rPr>
@@ -5019,51 +5019,32 @@
                     <w:t>Operating Systems</w:t>
                   </w:r>
                   <w:r>
-                    <w:t xml:space="preserve">: </w:t>
-                  </w:r>
-                  <w:r>
-                    <w:t>Linu</w:t>
-                  </w:r>
-                  <w:r>
-                    <w:t xml:space="preserve">x / </w:t>
-                  </w:r>
-                  <w:r>
-                    <w:t>macOS</w:t>
-                  </w:r>
-                  <w:r>
-                    <w:t xml:space="preserve"> / </w:t>
-                  </w:r>
-                  <w:r>
-                    <w:t>Windows</w:t>
-                  </w:r>
-                </w:p>
-                <w:p>
-                  <w:pPr>
-                    <w:pStyle w:val="Content"/>
-                    <w:numPr>
-                      <w:ilvl w:val="0"/>
-                      <w:numId w:val="12"/>
-                    </w:numPr>
-                    <w:ind w:left="345" w:hanging="164"/>
-                  </w:pPr>
-                  <w:r>
                     <w:rPr>
                       <w:b/>
                       <w:bCs/>
                     </w:rPr>
-                    <w:t>Apps</w:t>
+                    <w:t xml:space="preserve"> &amp; Apps</w:t>
                   </w:r>
                   <w:r>
                     <w:t xml:space="preserve">: </w:t>
                   </w:r>
                   <w:r>
-                    <w:t>iO</w:t>
-                  </w:r>
-                  <w:r>
-                    <w:t xml:space="preserve">S / </w:t>
-                  </w:r>
-                  <w:r>
-                    <w:t>Android</w:t>
+                    <w:t>Linu</w:t>
+                  </w:r>
+                  <w:r>
+                    <w:t xml:space="preserve">x / </w:t>
+                  </w:r>
+                  <w:r>
+                    <w:t>macOS</w:t>
+                  </w:r>
+                  <w:r>
+                    <w:t xml:space="preserve"> / </w:t>
+                  </w:r>
+                  <w:r>
+                    <w:t>Windows</w:t>
+                  </w:r>
+                  <w:r>
+                    <w:t xml:space="preserve"> / iOS / Android</w:t>
                   </w:r>
                 </w:p>
               </w:tc>
@@ -5079,7 +5060,7 @@
                       <w:ilvl w:val="0"/>
                       <w:numId w:val="12"/>
                     </w:numPr>
-                    <w:ind w:left="365" w:hanging="198"/>
+                    <w:ind w:left="280" w:hanging="198"/>
                   </w:pPr>
                   <w:r>
                     <w:t>Soldering</w:t>
@@ -5092,7 +5073,7 @@
                       <w:ilvl w:val="0"/>
                       <w:numId w:val="12"/>
                     </w:numPr>
-                    <w:ind w:left="365" w:hanging="198"/>
+                    <w:ind w:left="280" w:hanging="198"/>
                   </w:pPr>
                   <w:r>
                     <w:t>Breadboarding</w:t>
@@ -5105,7 +5086,7 @@
                       <w:ilvl w:val="0"/>
                       <w:numId w:val="12"/>
                     </w:numPr>
-                    <w:ind w:left="365" w:hanging="198"/>
+                    <w:ind w:left="280" w:hanging="198"/>
                   </w:pPr>
                   <w:r>
                     <w:t>Eagle PCB design</w:t>
@@ -5118,7 +5099,7 @@
                       <w:ilvl w:val="0"/>
                       <w:numId w:val="12"/>
                     </w:numPr>
-                    <w:ind w:left="365" w:hanging="198"/>
+                    <w:ind w:left="280" w:hanging="198"/>
                   </w:pPr>
                   <w:r>
                     <w:t>Digital signal processing (DSP)</w:t>
@@ -5131,7 +5112,7 @@
                       <w:ilvl w:val="0"/>
                       <w:numId w:val="12"/>
                     </w:numPr>
-                    <w:ind w:left="365" w:hanging="198"/>
+                    <w:ind w:left="280" w:hanging="198"/>
                   </w:pPr>
                   <w:r>
                     <w:t>Software-defined radio (SDR)</w:t>
@@ -5144,7 +5125,7 @@
                       <w:ilvl w:val="0"/>
                       <w:numId w:val="12"/>
                     </w:numPr>
-                    <w:ind w:left="365" w:hanging="198"/>
+                    <w:ind w:left="280" w:hanging="198"/>
                   </w:pPr>
                   <w:r>
                     <w:rPr>
@@ -5280,10 +5261,16 @@
               <w:t xml:space="preserve">Eta Kappa Nu </w:t>
             </w:r>
             <w:r>
-              <w:t>(Electrical Engineering Honor Society</w:t>
-            </w:r>
-            <w:r>
-              <w:t xml:space="preserve">)   </w:t>
+              <w:t>(</w:t>
+            </w:r>
+            <w:r>
+              <w:t xml:space="preserve">IEEE </w:t>
+            </w:r>
+            <w:r>
+              <w:t>Honor Society</w:t>
+            </w:r>
+            <w:r>
+              <w:t xml:space="preserve">)  </w:t>
             </w:r>
             <w:r>
               <w:rPr>
@@ -5365,8 +5352,158 @@
             <w:pPr>
               <w:pStyle w:val="Heading1"/>
               <w:keepNext w:val="0"/>
-            </w:pPr>
-            <w:r>
+              <w:rPr>
+                <w:sz w:val="10"/>
+                <w:szCs w:val="10"/>
+              </w:rPr>
+            </w:pPr>
+            <w:r>
+              <w:rPr>
+                <w:sz w:val="17"/>
+                <w:szCs w:val="17"/>
+              </w:rPr>
+              <w:t>Service</w:t>
+            </w:r>
+            <w:r>
+              <w:rPr>
+                <w:sz w:val="17"/>
+                <w:szCs w:val="17"/>
+              </w:rPr>
+              <w:t xml:space="preserve"> </w:t>
+            </w:r>
+          </w:p>
+        </w:tc>
+        <w:tc>
+          <w:tcPr>
+            <w:tcW w:w="86" w:type="pct"/>
+          </w:tcPr>
+          <w:p>
+            <w:pPr>
+              <w:rPr>
+                <w:sz w:val="10"/>
+                <w:szCs w:val="10"/>
+              </w:rPr>
+            </w:pPr>
+          </w:p>
+        </w:tc>
+        <w:tc>
+          <w:tcPr>
+            <w:tcW w:w="4456" w:type="pct"/>
+          </w:tcPr>
+          <w:p>
+            <w:pPr>
+              <w:pStyle w:val="Heading2"/>
+              <w:keepNext w:val="0"/>
+            </w:pPr>
+            <w:r>
+              <w:t>Reviewer</w:t>
+            </w:r>
+          </w:p>
+          <w:p>
+            <w:pPr>
+              <w:pStyle w:val="Content"/>
+              <w:numPr>
+                <w:ilvl w:val="0"/>
+                <w:numId w:val="12"/>
+              </w:numPr>
+              <w:ind w:left="245" w:hanging="164"/>
+            </w:pPr>
+            <w:r>
+              <w:t>IEEE Transactions on Artificial Intelligence (TAI)</w:t>
+            </w:r>
+          </w:p>
+          <w:p>
+            <w:pPr>
+              <w:pStyle w:val="Content"/>
+              <w:numPr>
+                <w:ilvl w:val="0"/>
+                <w:numId w:val="12"/>
+              </w:numPr>
+              <w:ind w:left="245" w:hanging="164"/>
+            </w:pPr>
+            <w:r>
+              <w:t>IEEE Transactions on Mobile Computing (TMC)</w:t>
+            </w:r>
+          </w:p>
+          <w:p>
+            <w:pPr>
+              <w:pStyle w:val="Content"/>
+              <w:numPr>
+                <w:ilvl w:val="0"/>
+                <w:numId w:val="12"/>
+              </w:numPr>
+              <w:ind w:left="245" w:hanging="164"/>
+            </w:pPr>
+            <w:r>
+              <w:t>IEEE Transactions on Machine Learning in Communications and Networking (TMLCN)</w:t>
+            </w:r>
+          </w:p>
+          <w:p>
+            <w:pPr>
+              <w:pStyle w:val="Content"/>
+              <w:numPr>
+                <w:ilvl w:val="0"/>
+                <w:numId w:val="12"/>
+              </w:numPr>
+              <w:ind w:left="245" w:hanging="164"/>
+            </w:pPr>
+            <w:r>
+              <w:t>IEEE International Conference on Quantum Computing and Engineering (QCE)</w:t>
+            </w:r>
+          </w:p>
+          <w:p>
+            <w:pPr>
+              <w:pStyle w:val="Content"/>
+              <w:numPr>
+                <w:ilvl w:val="0"/>
+                <w:numId w:val="12"/>
+              </w:numPr>
+              <w:ind w:left="245" w:hanging="164"/>
+            </w:pPr>
+            <w:r>
+              <w:t>IEEE Middle East Conference on Communications and Networking (MECOM)</w:t>
+            </w:r>
+          </w:p>
+          <w:p>
+            <w:pPr>
+              <w:pStyle w:val="Content"/>
+              <w:numPr>
+                <w:ilvl w:val="0"/>
+                <w:numId w:val="12"/>
+              </w:numPr>
+              <w:ind w:left="245" w:hanging="164"/>
+            </w:pPr>
+            <w:r>
+              <w:t>IEEE International Symposium on Personal, Indoor and Mobile Radio Communications (PIMRC)</w:t>
+            </w:r>
+          </w:p>
+          <w:p>
+            <w:pPr>
+              <w:pStyle w:val="Content"/>
+              <w:numPr>
+                <w:ilvl w:val="0"/>
+                <w:numId w:val="12"/>
+              </w:numPr>
+              <w:ind w:left="245" w:hanging="164"/>
+            </w:pPr>
+            <w:r>
+              <w:t>IEEE International Performance Computing and Communications Conference (IPCC)</w:t>
+            </w:r>
+          </w:p>
+        </w:tc>
+      </w:tr>
+      <w:tr>
+        <w:tc>
+          <w:tcPr>
+            <w:tcW w:w="458" w:type="pct"/>
+          </w:tcPr>
+          <w:p>
+            <w:pPr>
+              <w:pStyle w:val="Heading1"/>
+              <w:keepNext w:val="0"/>
+            </w:pPr>
+            <w:r>
+              <w:lastRenderedPageBreak/>
               <w:t xml:space="preserve">Fellowships, </w:t>
             </w:r>
             <w:r>
@@ -5677,32 +5814,51 @@
           </w:p>
         </w:tc>
       </w:tr>
-    </w:tbl>
-    <w:p/>
-    <w:tbl>
-      <w:tblPr>
-        <w:tblStyle w:val="TableGrid"/>
-        <w:tblW w:w="5000" w:type="pct"/>
-        <w:tblBorders>
-          <w:top w:val="none" w:sz="0" w:space="0" w:color="auto"/>
-          <w:left w:val="none" w:sz="0" w:space="0" w:color="auto"/>
-          <w:bottom w:val="none" w:sz="0" w:space="0" w:color="auto"/>
-          <w:right w:val="none" w:sz="0" w:space="0" w:color="auto"/>
-          <w:insideH w:val="none" w:sz="0" w:space="0" w:color="auto"/>
-          <w:insideV w:val="none" w:sz="0" w:space="0" w:color="auto"/>
-        </w:tblBorders>
-        <w:tblLayout w:type="fixed"/>
-        <w:tblCellMar>
-          <w:left w:w="0" w:type="dxa"/>
-          <w:right w:w="0" w:type="dxa"/>
-        </w:tblCellMar>
-        <w:tblLook w:val="04A0" w:firstRow="1" w:lastRow="0" w:firstColumn="1" w:lastColumn="0" w:noHBand="0" w:noVBand="1"/>
-      </w:tblPr>
-      <w:tblGrid>
-        <w:gridCol w:w="989"/>
-        <w:gridCol w:w="186"/>
-        <w:gridCol w:w="9625"/>
-      </w:tblGrid>
+      <w:tr>
+        <w:tc>
+          <w:tcPr>
+            <w:tcW w:w="458" w:type="pct"/>
+          </w:tcPr>
+          <w:p>
+            <w:pPr>
+              <w:pStyle w:val="Heading1"/>
+              <w:keepNext w:val="0"/>
+              <w:rPr>
+                <w:sz w:val="10"/>
+                <w:szCs w:val="10"/>
+              </w:rPr>
+            </w:pPr>
+          </w:p>
+        </w:tc>
+        <w:tc>
+          <w:tcPr>
+            <w:tcW w:w="86" w:type="pct"/>
+          </w:tcPr>
+          <w:p>
+            <w:pPr>
+              <w:rPr>
+                <w:sz w:val="10"/>
+                <w:szCs w:val="10"/>
+              </w:rPr>
+            </w:pPr>
+          </w:p>
+        </w:tc>
+        <w:tc>
+          <w:tcPr>
+            <w:tcW w:w="4456" w:type="pct"/>
+          </w:tcPr>
+          <w:p>
+            <w:pPr>
+              <w:pStyle w:val="Heading2"/>
+              <w:ind w:left="-13"/>
+              <w:rPr>
+                <w:sz w:val="10"/>
+                <w:szCs w:val="10"/>
+              </w:rPr>
+            </w:pPr>
+          </w:p>
+        </w:tc>
+      </w:tr>
       <w:tr>
         <w:tc>
           <w:tcPr>
@@ -5713,14 +5869,287 @@
             <w:pPr>
               <w:pStyle w:val="Heading1"/>
               <w:keepNext w:val="0"/>
+            </w:pPr>
+            <w:r>
+              <w:t>Activities &amp; Leadership</w:t>
+            </w:r>
+          </w:p>
+        </w:tc>
+        <w:tc>
+          <w:tcPr>
+            <w:tcW w:w="86" w:type="pct"/>
+          </w:tcPr>
+          <w:p/>
+        </w:tc>
+        <w:tc>
+          <w:tcPr>
+            <w:tcW w:w="4456" w:type="pct"/>
+          </w:tcPr>
+          <w:p>
+            <w:pPr>
+              <w:pStyle w:val="Heading2"/>
+              <w:ind w:left="-13"/>
+            </w:pPr>
+            <w:r>
+              <w:t xml:space="preserve">Chi Alpha Campus </w:t>
+            </w:r>
+            <w:r>
+              <w:t>Ministries</w:t>
+            </w:r>
+            <w:r>
+              <w:t xml:space="preserve"> </w:t>
+            </w:r>
+            <w:r>
+              <w:rPr>
+                <w:color w:val="4F81BD" w:themeColor="accent1"/>
+                <w:sz w:val="16"/>
+                <w:szCs w:val="16"/>
+              </w:rPr>
+              <w:t>[ 201</w:t>
+            </w:r>
+            <w:r>
+              <w:rPr>
+                <w:color w:val="4F81BD" w:themeColor="accent1"/>
+                <w:sz w:val="16"/>
+                <w:szCs w:val="16"/>
+              </w:rPr>
+              <w:t>2</w:t>
+            </w:r>
+            <w:r>
+              <w:rPr>
+                <w:color w:val="4F81BD" w:themeColor="accent1"/>
+                <w:sz w:val="16"/>
+                <w:szCs w:val="16"/>
+              </w:rPr>
+              <w:t xml:space="preserve"> – </w:t>
+            </w:r>
+            <w:r>
+              <w:rPr>
+                <w:color w:val="4F81BD" w:themeColor="accent1"/>
+                <w:sz w:val="16"/>
+                <w:szCs w:val="16"/>
+              </w:rPr>
+              <w:t>2023</w:t>
+            </w:r>
+            <w:r>
+              <w:rPr>
+                <w:color w:val="4F81BD" w:themeColor="accent1"/>
+                <w:sz w:val="16"/>
+                <w:szCs w:val="16"/>
+              </w:rPr>
+              <w:t xml:space="preserve"> ] </w:t>
+            </w:r>
+            <w:r>
+              <w:rPr>
+                <w:color w:val="4F81BD" w:themeColor="accent1"/>
+                <w:sz w:val="16"/>
+                <w:szCs w:val="16"/>
+              </w:rPr>
+              <w:t xml:space="preserve"> </w:t>
+            </w:r>
+            <w:r>
+              <w:rPr>
+                <w:rFonts w:ascii="Helvetica Neue" w:hAnsi="Helvetica Neue"/>
+                <w:b w:val="0"/>
+                <w:bCs w:val="0"/>
+                <w:color w:val="7F7F7F" w:themeColor="text1" w:themeTint="80"/>
+                <w:sz w:val="16"/>
+                <w:szCs w:val="16"/>
+              </w:rPr>
+              <w:t xml:space="preserve">Co-led life groups of 8+ students and organized </w:t>
+            </w:r>
+            <w:r>
+              <w:rPr>
+                <w:rFonts w:ascii="Helvetica Neue" w:hAnsi="Helvetica Neue"/>
+                <w:b w:val="0"/>
+                <w:bCs w:val="0"/>
+                <w:color w:val="7F7F7F" w:themeColor="text1" w:themeTint="80"/>
+                <w:sz w:val="16"/>
+                <w:szCs w:val="16"/>
+              </w:rPr>
+              <w:t xml:space="preserve">multi-group </w:t>
+            </w:r>
+            <w:r>
+              <w:rPr>
+                <w:rFonts w:ascii="Helvetica Neue" w:hAnsi="Helvetica Neue"/>
+                <w:b w:val="0"/>
+                <w:bCs w:val="0"/>
+                <w:color w:val="7F7F7F" w:themeColor="text1" w:themeTint="80"/>
+                <w:sz w:val="16"/>
+                <w:szCs w:val="16"/>
+              </w:rPr>
+              <w:t>events within the ministry.</w:t>
+            </w:r>
+          </w:p>
+        </w:tc>
+      </w:tr>
+      <w:tr>
+        <w:tc>
+          <w:tcPr>
+            <w:tcW w:w="458" w:type="pct"/>
+            <w:vMerge/>
+          </w:tcPr>
+          <w:p>
+            <w:pPr>
+              <w:pStyle w:val="Heading1"/>
+              <w:keepNext w:val="0"/>
+            </w:pPr>
+          </w:p>
+        </w:tc>
+        <w:tc>
+          <w:tcPr>
+            <w:tcW w:w="86" w:type="pct"/>
+          </w:tcPr>
+          <w:p/>
+        </w:tc>
+        <w:tc>
+          <w:tcPr>
+            <w:tcW w:w="4456" w:type="pct"/>
+          </w:tcPr>
+          <w:p>
+            <w:pPr>
+              <w:pStyle w:val="Heading2"/>
+              <w:ind w:left="-13"/>
+            </w:pPr>
+            <w:r>
+              <w:t xml:space="preserve">Church Audio-Visual (AV), Information Technology (IT), and Experience Teams </w:t>
+            </w:r>
+            <w:r>
+              <w:rPr>
+                <w:color w:val="4F81BD" w:themeColor="accent1"/>
+                <w:sz w:val="16"/>
+                <w:szCs w:val="16"/>
+              </w:rPr>
+              <w:t>[ 20</w:t>
+            </w:r>
+            <w:r>
+              <w:rPr>
+                <w:color w:val="4F81BD" w:themeColor="accent1"/>
+                <w:sz w:val="16"/>
+                <w:szCs w:val="16"/>
+              </w:rPr>
+              <w:t>20</w:t>
+            </w:r>
+            <w:r>
+              <w:rPr>
+                <w:color w:val="4F81BD" w:themeColor="accent1"/>
+                <w:sz w:val="16"/>
+                <w:szCs w:val="16"/>
+              </w:rPr>
+              <w:t xml:space="preserve"> – </w:t>
+            </w:r>
+            <w:r>
+              <w:rPr>
+                <w:color w:val="4F81BD" w:themeColor="accent1"/>
+                <w:sz w:val="16"/>
+                <w:szCs w:val="16"/>
+              </w:rPr>
+              <w:t>2024</w:t>
+            </w:r>
+            <w:r>
+              <w:rPr>
+                <w:color w:val="4F81BD" w:themeColor="accent1"/>
+                <w:sz w:val="16"/>
+                <w:szCs w:val="16"/>
+              </w:rPr>
+              <w:t xml:space="preserve"> ]</w:t>
+            </w:r>
+            <w:r>
+              <w:rPr>
+                <w:color w:val="4F81BD" w:themeColor="accent1"/>
+                <w:sz w:val="16"/>
+                <w:szCs w:val="16"/>
+              </w:rPr>
+              <w:t xml:space="preserve">  </w:t>
+            </w:r>
+            <w:r>
+              <w:rPr>
+                <w:rFonts w:ascii="Helvetica Neue" w:hAnsi="Helvetica Neue"/>
+                <w:b w:val="0"/>
+                <w:bCs w:val="0"/>
+                <w:color w:val="7F7F7F" w:themeColor="text1" w:themeTint="80"/>
+                <w:sz w:val="16"/>
+                <w:szCs w:val="16"/>
+              </w:rPr>
+              <w:t>Volunteer at my local church to serve on the AV, IT, and experience teams.</w:t>
+            </w:r>
+          </w:p>
+        </w:tc>
+      </w:tr>
+      <w:tr>
+        <w:tc>
+          <w:tcPr>
+            <w:tcW w:w="458" w:type="pct"/>
+            <w:vMerge/>
+          </w:tcPr>
+          <w:p>
+            <w:pPr>
+              <w:pStyle w:val="Heading1"/>
+              <w:keepNext w:val="0"/>
+            </w:pPr>
+          </w:p>
+        </w:tc>
+        <w:tc>
+          <w:tcPr>
+            <w:tcW w:w="86" w:type="pct"/>
+          </w:tcPr>
+          <w:p/>
+        </w:tc>
+        <w:tc>
+          <w:tcPr>
+            <w:tcW w:w="4456" w:type="pct"/>
+          </w:tcPr>
+          <w:p>
+            <w:pPr>
+              <w:pStyle w:val="Heading2"/>
+              <w:ind w:left="-13"/>
+            </w:pPr>
+            <w:r>
+              <w:t xml:space="preserve">Virginia Tech Fencing Club </w:t>
+            </w:r>
+            <w:r>
+              <w:rPr>
+                <w:color w:val="4F81BD" w:themeColor="accent1"/>
+                <w:sz w:val="16"/>
+                <w:szCs w:val="16"/>
+              </w:rPr>
+              <w:t xml:space="preserve">[ 2013 – 2014 ] </w:t>
+            </w:r>
+            <w:r>
+              <w:rPr>
+                <w:color w:val="4F81BD" w:themeColor="accent1"/>
+                <w:sz w:val="16"/>
+                <w:szCs w:val="16"/>
+              </w:rPr>
+              <w:t xml:space="preserve"> </w:t>
+            </w:r>
+            <w:r>
+              <w:rPr>
+                <w:b w:val="0"/>
+                <w:bCs w:val="0"/>
+                <w:color w:val="7F7F7F" w:themeColor="text1" w:themeTint="80"/>
+                <w:sz w:val="16"/>
+                <w:szCs w:val="16"/>
+              </w:rPr>
+              <w:t>Trained in the Epee fencing style and competed in tournaments.</w:t>
+            </w:r>
+          </w:p>
+        </w:tc>
+      </w:tr>
+      <w:tr>
+        <w:tc>
+          <w:tcPr>
+            <w:tcW w:w="458" w:type="pct"/>
+          </w:tcPr>
+          <w:p>
+            <w:pPr>
+              <w:pStyle w:val="Heading1"/>
+              <w:keepNext w:val="0"/>
               <w:rPr>
                 <w:sz w:val="10"/>
                 <w:szCs w:val="10"/>
               </w:rPr>
             </w:pPr>
-            <w:r>
-              <w:t>Activities &amp; Leadership</w:t>
-            </w:r>
           </w:p>
         </w:tc>
         <w:tc>
@@ -5740,112 +6169,10 @@
           <w:tcPr>
             <w:tcW w:w="4456" w:type="pct"/>
           </w:tcPr>
-          <w:tbl>
-            <w:tblPr>
-              <w:tblStyle w:val="TableGrid"/>
-              <w:tblW w:w="9630" w:type="dxa"/>
-              <w:tblLayout w:type="fixed"/>
-              <w:tblCellMar>
-                <w:left w:w="0" w:type="dxa"/>
-                <w:right w:w="0" w:type="dxa"/>
-              </w:tblCellMar>
-              <w:tblLook w:val="04A0" w:firstRow="1" w:lastRow="0" w:firstColumn="1" w:lastColumn="0" w:noHBand="0" w:noVBand="1"/>
-            </w:tblPr>
-            <w:tblGrid>
-              <w:gridCol w:w="9630"/>
-            </w:tblGrid>
-            <w:tr>
-              <w:tc>
-                <w:tcPr>
-                  <w:tcW w:w="5000" w:type="pct"/>
-                  <w:tcBorders>
-                    <w:top w:val="nil"/>
-                    <w:left w:val="nil"/>
-                    <w:bottom w:val="nil"/>
-                    <w:right w:val="nil"/>
-                  </w:tcBorders>
-                </w:tcPr>
-                <w:p>
-                  <w:pPr>
-                    <w:pStyle w:val="Heading2"/>
-                    <w:keepNext w:val="0"/>
-                  </w:pPr>
-                  <w:r>
-                    <w:t xml:space="preserve">Chi Alpha Campus </w:t>
-                  </w:r>
-                  <w:r>
-                    <w:t>Ministries</w:t>
-                  </w:r>
-                  <w:r>
-                    <w:t xml:space="preserve"> </w:t>
-                  </w:r>
-                  <w:r>
-                    <w:rPr>
-                      <w:color w:val="4F81BD" w:themeColor="accent1"/>
-                      <w:sz w:val="16"/>
-                      <w:szCs w:val="16"/>
-                    </w:rPr>
-                    <w:t>[ 201</w:t>
-                  </w:r>
-                  <w:r>
-                    <w:rPr>
-                      <w:color w:val="4F81BD" w:themeColor="accent1"/>
-                      <w:sz w:val="16"/>
-                      <w:szCs w:val="16"/>
-                    </w:rPr>
-                    <w:t>2</w:t>
-                  </w:r>
-                  <w:r>
-                    <w:rPr>
-                      <w:color w:val="4F81BD" w:themeColor="accent1"/>
-                      <w:sz w:val="16"/>
-                      <w:szCs w:val="16"/>
-                    </w:rPr>
-                    <w:t xml:space="preserve"> – </w:t>
-                  </w:r>
-                  <w:r>
-                    <w:rPr>
-                      <w:color w:val="4F81BD" w:themeColor="accent1"/>
-                      <w:sz w:val="16"/>
-                      <w:szCs w:val="16"/>
-                    </w:rPr>
-                    <w:t>2023</w:t>
-                  </w:r>
-                  <w:r>
-                    <w:rPr>
-                      <w:color w:val="4F81BD" w:themeColor="accent1"/>
-                      <w:sz w:val="16"/>
-                      <w:szCs w:val="16"/>
-                    </w:rPr>
-                    <w:t xml:space="preserve"> ] </w:t>
-                  </w:r>
-                  <w:r>
-                    <w:rPr>
-                      <w:color w:val="4F81BD" w:themeColor="accent1"/>
-                      <w:sz w:val="16"/>
-                      <w:szCs w:val="16"/>
-                    </w:rPr>
-                    <w:t xml:space="preserve"> </w:t>
-                  </w:r>
-                  <w:r>
-                    <w:rPr>
-                      <w:b w:val="0"/>
-                      <w:bCs w:val="0"/>
-                      <w:color w:val="7F7F7F" w:themeColor="text1" w:themeTint="80"/>
-                      <w:sz w:val="16"/>
-                      <w:szCs w:val="16"/>
-                    </w:rPr>
-                    <w:t>Co-led life groups of 8+ students and organized events with other groups within the ministry.</w:t>
-                  </w:r>
-                  <w:r>
-                    <w:t xml:space="preserve">  </w:t>
-                  </w:r>
-                </w:p>
-              </w:tc>
-            </w:tr>
-          </w:tbl>
-          <w:p>
-            <w:pPr>
+          <w:p>
+            <w:pPr>
+              <w:pStyle w:val="Heading2"/>
+              <w:ind w:left="-13"/>
               <w:rPr>
                 <w:sz w:val="10"/>
                 <w:szCs w:val="10"/>
@@ -5858,246 +6185,66 @@
         <w:tc>
           <w:tcPr>
             <w:tcW w:w="458" w:type="pct"/>
-            <w:vMerge/>
+            <w:vMerge w:val="restart"/>
           </w:tcPr>
           <w:p>
             <w:pPr>
               <w:pStyle w:val="Heading1"/>
               <w:keepNext w:val="0"/>
             </w:pPr>
+            <w:r>
+              <w:t>Hobbies &amp; Interests</w:t>
+            </w:r>
           </w:p>
         </w:tc>
         <w:tc>
           <w:tcPr>
             <w:tcW w:w="86" w:type="pct"/>
           </w:tcPr>
-          <w:p>
-            <w:pPr>
-              <w:rPr>
-                <w:sz w:val="10"/>
-                <w:szCs w:val="10"/>
-              </w:rPr>
-            </w:pPr>
-          </w:p>
+          <w:p/>
         </w:tc>
         <w:tc>
           <w:tcPr>
             <w:tcW w:w="4456" w:type="pct"/>
           </w:tcPr>
-          <w:tbl>
-            <w:tblPr>
-              <w:tblStyle w:val="TableGrid"/>
-              <w:tblW w:w="9630" w:type="dxa"/>
-              <w:tblLayout w:type="fixed"/>
-              <w:tblCellMar>
-                <w:left w:w="0" w:type="dxa"/>
-                <w:right w:w="0" w:type="dxa"/>
-              </w:tblCellMar>
-              <w:tblLook w:val="04A0" w:firstRow="1" w:lastRow="0" w:firstColumn="1" w:lastColumn="0" w:noHBand="0" w:noVBand="1"/>
-            </w:tblPr>
-            <w:tblGrid>
-              <w:gridCol w:w="9630"/>
-            </w:tblGrid>
-            <w:tr>
-              <w:trPr>
-                <w:trHeight w:val="56"/>
-              </w:trPr>
-              <w:tc>
-                <w:tcPr>
-                  <w:tcW w:w="5000" w:type="pct"/>
-                  <w:tcBorders>
-                    <w:top w:val="nil"/>
-                    <w:left w:val="nil"/>
-                    <w:bottom w:val="nil"/>
-                    <w:right w:val="nil"/>
-                  </w:tcBorders>
-                </w:tcPr>
-                <w:p>
-                  <w:pPr>
-                    <w:pStyle w:val="Heading2"/>
-                    <w:keepNext w:val="0"/>
-                  </w:pPr>
-                  <w:r>
-                    <w:t>Church A</w:t>
-                  </w:r>
-                  <w:r>
-                    <w:t>udio-</w:t>
-                  </w:r>
-                  <w:r>
-                    <w:t>V</w:t>
-                  </w:r>
-                  <w:r>
-                    <w:t>isual</w:t>
-                  </w:r>
-                  <w:r>
-                    <w:t xml:space="preserve"> (AV)</w:t>
-                  </w:r>
-                  <w:r>
-                    <w:t xml:space="preserve">, </w:t>
-                  </w:r>
-                  <w:r>
-                    <w:t>Information Technology (IT)</w:t>
-                  </w:r>
-                  <w:r>
-                    <w:t xml:space="preserve">, and Experience Teams </w:t>
-                  </w:r>
-                  <w:r>
-                    <w:rPr>
-                      <w:color w:val="4F81BD" w:themeColor="accent1"/>
-                      <w:sz w:val="16"/>
-                      <w:szCs w:val="16"/>
-                    </w:rPr>
-                    <w:t>[ 20</w:t>
-                  </w:r>
-                  <w:r>
-                    <w:rPr>
-                      <w:color w:val="4F81BD" w:themeColor="accent1"/>
-                      <w:sz w:val="16"/>
-                      <w:szCs w:val="16"/>
-                    </w:rPr>
-                    <w:t>20</w:t>
-                  </w:r>
-                  <w:r>
-                    <w:rPr>
-                      <w:color w:val="4F81BD" w:themeColor="accent1"/>
-                      <w:sz w:val="16"/>
-                      <w:szCs w:val="16"/>
-                    </w:rPr>
-                    <w:t xml:space="preserve"> – </w:t>
-                  </w:r>
-                  <w:r>
-                    <w:rPr>
-                      <w:color w:val="4F81BD" w:themeColor="accent1"/>
-                      <w:sz w:val="16"/>
-                      <w:szCs w:val="16"/>
-                    </w:rPr>
-                    <w:t>2024</w:t>
-                  </w:r>
-                  <w:r>
-                    <w:rPr>
-                      <w:color w:val="4F81BD" w:themeColor="accent1"/>
-                      <w:sz w:val="16"/>
-                      <w:szCs w:val="16"/>
-                    </w:rPr>
-                    <w:t xml:space="preserve"> ]</w:t>
-                  </w:r>
-                  <w:r>
-                    <w:rPr>
-                      <w:color w:val="4F81BD" w:themeColor="accent1"/>
-                      <w:sz w:val="16"/>
-                      <w:szCs w:val="16"/>
-                    </w:rPr>
-                    <w:t xml:space="preserve">  </w:t>
-                  </w:r>
-                  <w:r>
-                    <w:rPr>
-                      <w:b w:val="0"/>
-                      <w:bCs w:val="0"/>
-                      <w:color w:val="7F7F7F" w:themeColor="text1" w:themeTint="80"/>
-                      <w:sz w:val="16"/>
-                      <w:szCs w:val="16"/>
-                    </w:rPr>
-                    <w:t>Volunteer</w:t>
-                  </w:r>
-                  <w:r>
-                    <w:rPr>
-                      <w:b w:val="0"/>
-                      <w:bCs w:val="0"/>
-                      <w:color w:val="7F7F7F" w:themeColor="text1" w:themeTint="80"/>
-                      <w:sz w:val="16"/>
-                      <w:szCs w:val="16"/>
-                    </w:rPr>
-                    <w:t xml:space="preserve"> </w:t>
-                  </w:r>
-                  <w:r>
-                    <w:rPr>
-                      <w:b w:val="0"/>
-                      <w:bCs w:val="0"/>
-                      <w:color w:val="7F7F7F" w:themeColor="text1" w:themeTint="80"/>
-                      <w:sz w:val="16"/>
-                      <w:szCs w:val="16"/>
-                    </w:rPr>
-                    <w:t xml:space="preserve">at my local church </w:t>
-                  </w:r>
-                  <w:r>
-                    <w:rPr>
-                      <w:b w:val="0"/>
-                      <w:bCs w:val="0"/>
-                      <w:color w:val="7F7F7F" w:themeColor="text1" w:themeTint="80"/>
-                      <w:sz w:val="16"/>
-                      <w:szCs w:val="16"/>
-                    </w:rPr>
-                    <w:t xml:space="preserve">to serve </w:t>
-                  </w:r>
-                  <w:r>
-                    <w:rPr>
-                      <w:b w:val="0"/>
-                      <w:bCs w:val="0"/>
-                      <w:color w:val="7F7F7F" w:themeColor="text1" w:themeTint="80"/>
-                      <w:sz w:val="16"/>
-                      <w:szCs w:val="16"/>
-                    </w:rPr>
-                    <w:t xml:space="preserve">on the </w:t>
-                  </w:r>
-                  <w:r>
-                    <w:rPr>
-                      <w:b w:val="0"/>
-                      <w:bCs w:val="0"/>
-                      <w:color w:val="7F7F7F" w:themeColor="text1" w:themeTint="80"/>
-                      <w:sz w:val="16"/>
-                      <w:szCs w:val="16"/>
-                    </w:rPr>
-                    <w:t>AV</w:t>
-                  </w:r>
-                  <w:r>
-                    <w:rPr>
-                      <w:b w:val="0"/>
-                      <w:bCs w:val="0"/>
-                      <w:color w:val="7F7F7F" w:themeColor="text1" w:themeTint="80"/>
-                      <w:sz w:val="16"/>
-                      <w:szCs w:val="16"/>
-                    </w:rPr>
-                    <w:t xml:space="preserve">, </w:t>
-                  </w:r>
-                  <w:r>
-                    <w:rPr>
-                      <w:b w:val="0"/>
-                      <w:bCs w:val="0"/>
-                      <w:color w:val="7F7F7F" w:themeColor="text1" w:themeTint="80"/>
-                      <w:sz w:val="16"/>
-                      <w:szCs w:val="16"/>
-                    </w:rPr>
-                    <w:t>IT</w:t>
-                  </w:r>
-                  <w:r>
-                    <w:rPr>
-                      <w:b w:val="0"/>
-                      <w:bCs w:val="0"/>
-                      <w:color w:val="7F7F7F" w:themeColor="text1" w:themeTint="80"/>
-                      <w:sz w:val="16"/>
-                      <w:szCs w:val="16"/>
-                    </w:rPr>
-                    <w:t>, and experience teams.</w:t>
-                  </w:r>
-                </w:p>
-              </w:tc>
-            </w:tr>
-          </w:tbl>
           <w:p>
             <w:pPr>
               <w:pStyle w:val="Heading2"/>
-              <w:keepNext w:val="0"/>
-            </w:pPr>
+              <w:ind w:left="-13"/>
+            </w:pPr>
+            <w:r>
+              <w:t xml:space="preserve">World Travel: </w:t>
+            </w:r>
+            <w:r>
+              <w:rPr>
+                <w:rFonts w:ascii="Helvetica Neue" w:hAnsi="Helvetica Neue"/>
+                <w:b w:val="0"/>
+                <w:bCs w:val="0"/>
+                <w:color w:val="7F7F7F" w:themeColor="text1" w:themeTint="80"/>
+                <w:sz w:val="16"/>
+                <w:szCs w:val="16"/>
+              </w:rPr>
+              <w:t>Singapore, B</w:t>
+            </w:r>
+            <w:r>
+              <w:rPr>
+                <w:rFonts w:ascii="Helvetica Neue" w:hAnsi="Helvetica Neue"/>
+                <w:b w:val="0"/>
+                <w:bCs w:val="0"/>
+                <w:color w:val="7F7F7F" w:themeColor="text1" w:themeTint="80"/>
+                <w:sz w:val="16"/>
+                <w:szCs w:val="16"/>
+              </w:rPr>
+              <w:t>elgium, Canada, France, Germany, Mexico, Netherlands, U.S. &amp; Hawaii</w:t>
+            </w:r>
           </w:p>
         </w:tc>
       </w:tr>
       <w:tr>
-        <w:trPr>
-          <w:trHeight w:val="324"/>
-        </w:trPr>
         <w:tc>
           <w:tcPr>
             <w:tcW w:w="458" w:type="pct"/>
+            <w:vMerge/>
           </w:tcPr>
           <w:p>
             <w:pPr>
@@ -6110,87 +6257,34 @@
           <w:tcPr>
             <w:tcW w:w="86" w:type="pct"/>
           </w:tcPr>
-          <w:p>
-            <w:pPr>
-              <w:rPr>
-                <w:sz w:val="10"/>
-                <w:szCs w:val="10"/>
-              </w:rPr>
-            </w:pPr>
-          </w:p>
+          <w:p/>
         </w:tc>
         <w:tc>
           <w:tcPr>
             <w:tcW w:w="4456" w:type="pct"/>
           </w:tcPr>
-          <w:tbl>
-            <w:tblPr>
-              <w:tblStyle w:val="TableGrid"/>
-              <w:tblW w:w="9709" w:type="dxa"/>
-              <w:tblLayout w:type="fixed"/>
-              <w:tblCellMar>
-                <w:left w:w="0" w:type="dxa"/>
-                <w:right w:w="0" w:type="dxa"/>
-              </w:tblCellMar>
-              <w:tblLook w:val="04A0" w:firstRow="1" w:lastRow="0" w:firstColumn="1" w:lastColumn="0" w:noHBand="0" w:noVBand="1"/>
-            </w:tblPr>
-            <w:tblGrid>
-              <w:gridCol w:w="9709"/>
-            </w:tblGrid>
-            <w:tr>
-              <w:tc>
-                <w:tcPr>
-                  <w:tcW w:w="5000" w:type="pct"/>
-                  <w:tcBorders>
-                    <w:top w:val="nil"/>
-                    <w:left w:val="nil"/>
-                    <w:bottom w:val="nil"/>
-                    <w:right w:val="nil"/>
-                  </w:tcBorders>
-                </w:tcPr>
-                <w:p>
-                  <w:pPr>
-                    <w:pStyle w:val="Heading2"/>
-                    <w:keepNext w:val="0"/>
-                  </w:pPr>
-                  <w:r>
-                    <w:t xml:space="preserve">Virginia Tech Fencing Club </w:t>
-                  </w:r>
-                  <w:r>
-                    <w:rPr>
-                      <w:color w:val="4F81BD" w:themeColor="accent1"/>
-                      <w:sz w:val="16"/>
-                      <w:szCs w:val="16"/>
-                    </w:rPr>
-                    <w:t xml:space="preserve">[ 2013 – 2014 ] </w:t>
-                  </w:r>
-                  <w:r>
-                    <w:rPr>
-                      <w:color w:val="4F81BD" w:themeColor="accent1"/>
-                      <w:sz w:val="16"/>
-                      <w:szCs w:val="16"/>
-                    </w:rPr>
-                    <w:t xml:space="preserve"> </w:t>
-                  </w:r>
-                  <w:r>
-                    <w:rPr>
-                      <w:b w:val="0"/>
-                      <w:bCs w:val="0"/>
-                      <w:color w:val="7F7F7F" w:themeColor="text1" w:themeTint="80"/>
-                      <w:sz w:val="16"/>
-                      <w:szCs w:val="16"/>
-                    </w:rPr>
-                    <w:t>Trained in the Epee fencing style and competed in tournaments.</w:t>
-                  </w:r>
-                </w:p>
-              </w:tc>
-            </w:tr>
-          </w:tbl>
           <w:p>
             <w:pPr>
               <w:pStyle w:val="Heading2"/>
-              <w:keepNext w:val="0"/>
-            </w:pPr>
+              <w:ind w:left="-13"/>
+            </w:pPr>
+            <w:r>
+              <w:t>Porsche Enthusiast:</w:t>
+            </w:r>
+            <w:r>
+              <w:t xml:space="preserve"> </w:t>
+            </w:r>
+            <w:r>
+              <w:rPr>
+                <w:rFonts w:ascii="Helvetica Neue" w:hAnsi="Helvetica Neue"/>
+                <w:b w:val="0"/>
+                <w:bCs w:val="0"/>
+                <w:color w:val="7F7F7F" w:themeColor="text1" w:themeTint="80"/>
+                <w:sz w:val="16"/>
+                <w:szCs w:val="16"/>
+              </w:rPr>
+              <w:t>Lover of Porsche sports cars and mechanics</w:t>
+            </w:r>
           </w:p>
         </w:tc>
       </w:tr>
@@ -6198,183 +6292,44 @@
         <w:tc>
           <w:tcPr>
             <w:tcW w:w="458" w:type="pct"/>
+            <w:vMerge/>
           </w:tcPr>
           <w:p>
             <w:pPr>
               <w:pStyle w:val="Heading1"/>
               <w:keepNext w:val="0"/>
             </w:pPr>
-            <w:r>
-              <w:t>Hobbies &amp; Interests</w:t>
-            </w:r>
           </w:p>
         </w:tc>
         <w:tc>
           <w:tcPr>
             <w:tcW w:w="86" w:type="pct"/>
           </w:tcPr>
-          <w:p>
-            <w:pPr>
-              <w:rPr>
-                <w:sz w:val="10"/>
-                <w:szCs w:val="10"/>
-              </w:rPr>
-            </w:pPr>
-          </w:p>
+          <w:p/>
         </w:tc>
         <w:tc>
           <w:tcPr>
             <w:tcW w:w="4456" w:type="pct"/>
           </w:tcPr>
-          <w:tbl>
-            <w:tblPr>
-              <w:tblStyle w:val="TableGrid"/>
-              <w:tblW w:w="9630" w:type="dxa"/>
-              <w:tblBorders>
-                <w:top w:val="none" w:sz="0" w:space="0" w:color="auto"/>
-                <w:left w:val="none" w:sz="0" w:space="0" w:color="auto"/>
-                <w:bottom w:val="none" w:sz="0" w:space="0" w:color="auto"/>
-                <w:right w:val="none" w:sz="0" w:space="0" w:color="auto"/>
-                <w:insideH w:val="none" w:sz="0" w:space="0" w:color="auto"/>
-                <w:insideV w:val="none" w:sz="0" w:space="0" w:color="auto"/>
-              </w:tblBorders>
-              <w:tblLayout w:type="fixed"/>
-              <w:tblCellMar>
-                <w:left w:w="0" w:type="dxa"/>
-                <w:right w:w="0" w:type="dxa"/>
-              </w:tblCellMar>
-              <w:tblLook w:val="04A0" w:firstRow="1" w:lastRow="0" w:firstColumn="1" w:lastColumn="0" w:noHBand="0" w:noVBand="1"/>
-            </w:tblPr>
-            <w:tblGrid>
-              <w:gridCol w:w="9530"/>
-              <w:gridCol w:w="100"/>
-            </w:tblGrid>
-            <w:tr>
-              <w:tc>
-                <w:tcPr>
-                  <w:tcW w:w="4948" w:type="pct"/>
-                </w:tcPr>
-                <w:p>
-                  <w:pPr>
-                    <w:pStyle w:val="Heading2"/>
-                    <w:keepNext w:val="0"/>
-                  </w:pPr>
-                  <w:r>
-                    <w:t>World Travel</w:t>
-                  </w:r>
-                  <w:r>
-                    <w:t xml:space="preserve">: </w:t>
-                  </w:r>
-                  <w:r>
-                    <w:rPr>
-                      <w:rFonts w:ascii="Helvetica Neue" w:hAnsi="Helvetica Neue"/>
-                      <w:b w:val="0"/>
-                      <w:bCs w:val="0"/>
-                      <w:color w:val="7F7F7F" w:themeColor="text1" w:themeTint="80"/>
-                      <w:sz w:val="16"/>
-                      <w:szCs w:val="16"/>
-                    </w:rPr>
-                    <w:t>Singapore, B</w:t>
-                  </w:r>
-                  <w:r>
-                    <w:rPr>
-                      <w:rFonts w:ascii="Helvetica Neue" w:hAnsi="Helvetica Neue"/>
-                      <w:b w:val="0"/>
-                      <w:bCs w:val="0"/>
-                      <w:color w:val="7F7F7F" w:themeColor="text1" w:themeTint="80"/>
-                      <w:sz w:val="16"/>
-                      <w:szCs w:val="16"/>
-                    </w:rPr>
-                    <w:t>elgium, Canada, France, Germany, Mexico, Netherlands, U.S. &amp; Hawaii</w:t>
-                  </w:r>
-                </w:p>
-              </w:tc>
-              <w:tc>
-                <w:tcPr>
-                  <w:tcW w:w="52" w:type="pct"/>
-                </w:tcPr>
-                <w:p>
-                  <w:pPr>
-                    <w:pStyle w:val="Dates"/>
-                    <w:keepNext w:val="0"/>
-                  </w:pPr>
-                </w:p>
-              </w:tc>
-            </w:tr>
-            <w:tr>
-              <w:tc>
-                <w:tcPr>
-                  <w:tcW w:w="5000" w:type="pct"/>
-                  <w:gridSpan w:val="2"/>
-                </w:tcPr>
-                <w:p>
-                  <w:pPr>
-                    <w:pStyle w:val="Content"/>
-                  </w:pPr>
-                  <w:r>
-                    <w:rPr>
-                      <w:b/>
-                      <w:bCs/>
-                      <w:color w:val="0F243E" w:themeColor="text2" w:themeShade="80"/>
-                    </w:rPr>
-                    <w:t>Porsche Enthusiast:</w:t>
-                  </w:r>
-                  <w:r>
-                    <w:t xml:space="preserve"> </w:t>
-                  </w:r>
-                  <w:r>
-                    <w:t>Lover of Porsche sports cars and mechanics</w:t>
-                  </w:r>
-                </w:p>
-              </w:tc>
-            </w:tr>
-            <w:tr>
-              <w:tc>
-                <w:tcPr>
-                  <w:tcW w:w="5000" w:type="pct"/>
-                  <w:gridSpan w:val="2"/>
-                </w:tcPr>
-                <w:p>
-                  <w:pPr>
-                    <w:pStyle w:val="Content"/>
-                    <w:rPr>
-                      <w:b/>
-                      <w:bCs/>
-                      <w:color w:val="0F243E" w:themeColor="text2" w:themeShade="80"/>
-                    </w:rPr>
-                  </w:pPr>
-                  <w:r>
-                    <w:rPr>
-                      <w:b/>
-                      <w:bCs/>
-                      <w:color w:val="0F243E" w:themeColor="text2" w:themeShade="80"/>
-                    </w:rPr>
-                    <w:t xml:space="preserve">Dancing: </w:t>
-                  </w:r>
-                  <w:r>
-                    <w:t xml:space="preserve">Intermediate level dance </w:t>
-                  </w:r>
-                  <w:r>
-                    <w:t xml:space="preserve">skill with passion for </w:t>
-                  </w:r>
-                  <w:r>
-                    <w:t>Latin</w:t>
-                  </w:r>
-                  <w:r>
-                    <w:t xml:space="preserve">, </w:t>
-                  </w:r>
-                  <w:r>
-                    <w:t>Swing, and Ballroom styles.</w:t>
-                  </w:r>
-                </w:p>
-              </w:tc>
-            </w:tr>
-          </w:tbl>
           <w:p>
             <w:pPr>
               <w:pStyle w:val="Heading2"/>
-              <w:keepNext w:val="0"/>
-            </w:pPr>
+              <w:ind w:left="-13"/>
+            </w:pPr>
+            <w:r>
+              <w:t xml:space="preserve">Dancing: </w:t>
+            </w:r>
+            <w:r>
+              <w:rPr>
+                <w:rFonts w:ascii="Helvetica Neue" w:hAnsi="Helvetica Neue"/>
+                <w:b w:val="0"/>
+                <w:bCs w:val="0"/>
+                <w:color w:val="7F7F7F" w:themeColor="text1" w:themeTint="80"/>
+                <w:sz w:val="16"/>
+                <w:szCs w:val="16"/>
+              </w:rPr>
+              <w:t>Intermediate level dance skill with passion for Latin, Swing, and Ballroom styles.</w:t>
+            </w:r>
           </w:p>
         </w:tc>
       </w:tr>
@@ -8211,7 +8166,6 @@
   <w:style w:type="character" w:default="1" w:styleId="DefaultParagraphFont">
     <w:name w:val="Default Paragraph Font"/>
     <w:uiPriority w:val="1"/>
-    <w:semiHidden/>
     <w:unhideWhenUsed/>
   </w:style>
   <w:style w:type="table" w:default="1" w:styleId="TableNormal">
@@ -8755,6 +8709,7 @@
     <w:rsid w:val="00230187"/>
     <w:rsid w:val="00302FDA"/>
     <w:rsid w:val="0032046F"/>
+    <w:rsid w:val="00320509"/>
     <w:rsid w:val="003A5844"/>
     <w:rsid w:val="004724DF"/>
     <w:rsid w:val="004A4065"/>

</xml_diff>

<commit_message>
Add featured articles section
</commit_message>
<xml_diff>
--- a/derieux_resume_multipage.docx
+++ b/derieux_resume_multipage.docx
@@ -1245,25 +1245,7 @@
                     <w:pStyle w:val="Content"/>
                   </w:pPr>
                   <w:r>
-                    <w:t>Dissertation Title: “</w:t>
-                  </w:r>
-                  <w:r>
-                    <w:t>Quantum</w:t>
-                  </w:r>
-                  <w:r>
-                    <w:t>-</w:t>
-                  </w:r>
-                  <w:r>
-                    <w:t>Native Artificial Intelligence: Architectures and</w:t>
-                  </w:r>
-                  <w:r>
-                    <w:t xml:space="preserve"> </w:t>
-                  </w:r>
-                  <w:r>
-                    <w:t>Algorithms</w:t>
-                  </w:r>
-                  <w:r>
-                    <w:t>”</w:t>
+                    <w:t>Dissertation Title: “Quantum-Native Artificial Intelligence: Architectures and Algorithms”</w:t>
                   </w:r>
                 </w:p>
                 <w:p>
@@ -1432,19 +1414,7 @@
                     <w:pStyle w:val="Content"/>
                   </w:pPr>
                   <w:r>
-                    <w:t>Thesis Title: “</w:t>
-                  </w:r>
-                  <w:r>
-                    <w:t>Transformer Networks for Smart Cities: Framework and</w:t>
-                  </w:r>
-                  <w:r>
-                    <w:t xml:space="preserve"> </w:t>
-                  </w:r>
-                  <w:r>
-                    <w:t>Application to Makassar Smart Garden Alleys</w:t>
-                  </w:r>
-                  <w:r>
-                    <w:t>”</w:t>
+                    <w:t>Thesis Title: “Transformer Networks for Smart Cities: Framework and Application to Makassar Smart Garden Alleys”</w:t>
                   </w:r>
                 </w:p>
                 <w:p>
@@ -2569,19 +2539,7 @@
                     <w:keepNext w:val="0"/>
                   </w:pPr>
                   <w:r>
-                    <w:t xml:space="preserve">[ </w:t>
-                  </w:r>
-                  <w:r>
-                    <w:t>6</w:t>
-                  </w:r>
-                  <w:r>
-                    <w:t>/201</w:t>
-                  </w:r>
-                  <w:r>
-                    <w:t>0</w:t>
-                  </w:r>
-                  <w:r>
-                    <w:t xml:space="preserve"> – </w:t>
+                    <w:t xml:space="preserve">[ 6/2010 – </w:t>
                   </w:r>
                   <w:r>
                     <w:t>7</w:t>
@@ -2591,13 +2549,7 @@
                   </w:r>
                   <w:proofErr w:type="gramStart"/>
                   <w:r>
-                    <w:t>20</w:t>
-                  </w:r>
-                  <w:r>
-                    <w:t>12</w:t>
-                  </w:r>
-                  <w:r>
-                    <w:t xml:space="preserve"> ]</w:t>
+                    <w:t>2012 ]</w:t>
                   </w:r>
                   <w:proofErr w:type="gramEnd"/>
                 </w:p>
@@ -2628,10 +2580,7 @@
                     <w:t>Participated in 3 consecutive 8-week summer internships</w:t>
                   </w:r>
                   <w:r>
-                    <w:t xml:space="preserve">. </w:t>
-                  </w:r>
-                  <w:r>
-                    <w:t>Developed alternative modes of satellite propulsion using natural and induced magnetic fields. Created custom payload deployment systems for small satellites. Designed an off-the-shelf system for controlling robotic arms used in spacecraft docking and other tele-operation applications.</w:t>
+                    <w:t>. Developed alternative modes of satellite propulsion using natural and induced magnetic fields. Created custom payload deployment systems for small satellites. Designed an off-the-shelf system for controlling robotic arms used in spacecraft docking and other tele-operation applications.</w:t>
                   </w:r>
                 </w:p>
               </w:tc>
@@ -3659,7 +3608,14 @@
                 <w:b w:val="0"/>
                 <w:bCs w:val="0"/>
               </w:rPr>
-              <w:t xml:space="preserve">Virginia Tech </w:t>
+              <w:t>V</w:t>
+            </w:r>
+            <w:r>
+              <w:rPr>
+                <w:b w:val="0"/>
+                <w:bCs w:val="0"/>
+              </w:rPr>
+              <w:t xml:space="preserve">irginia Tech </w:t>
             </w:r>
             <w:r>
               <w:rPr>
@@ -3754,27 +3710,45 @@
                 <w:numId w:val="21"/>
               </w:numPr>
               <w:ind w:left="245" w:hanging="245"/>
-            </w:pPr>
-            <w:r>
-              <w:rPr>
-                <w:b w:val="0"/>
-                <w:bCs w:val="0"/>
-              </w:rPr>
-              <w:t xml:space="preserve">Quantum </w:t>
-            </w:r>
-            <w:r>
-              <w:rPr>
-                <w:b w:val="0"/>
-                <w:bCs w:val="0"/>
-              </w:rPr>
-              <w:t xml:space="preserve">and Artificial Intelligence </w:t>
-            </w:r>
-            <w:r>
-              <w:rPr>
-                <w:b w:val="0"/>
-                <w:bCs w:val="0"/>
-              </w:rPr>
-              <w:t xml:space="preserve">Research </w:t>
+              <w:rPr>
+                <w:b w:val="0"/>
+                <w:bCs w:val="0"/>
+              </w:rPr>
+            </w:pPr>
+            <w:r>
+              <w:rPr>
+                <w:b w:val="0"/>
+                <w:bCs w:val="0"/>
+              </w:rPr>
+              <w:t xml:space="preserve">Virginia Tech </w:t>
+            </w:r>
+            <w:r>
+              <w:rPr>
+                <w:b w:val="0"/>
+                <w:bCs w:val="0"/>
+              </w:rPr>
+              <w:t>Institute for Advanced Computing</w:t>
+            </w:r>
+            <w:r>
+              <w:rPr>
+                <w:b w:val="0"/>
+                <w:bCs w:val="0"/>
+              </w:rPr>
+              <w:t xml:space="preserve"> </w:t>
+            </w:r>
+            <w:r>
+              <w:rPr>
+                <w:b w:val="0"/>
+                <w:bCs w:val="0"/>
+              </w:rPr>
+              <w:t>Showcase</w:t>
+            </w:r>
+            <w:r>
+              <w:rPr>
+                <w:b w:val="0"/>
+                <w:bCs w:val="0"/>
+              </w:rPr>
+              <w:t xml:space="preserve"> </w:t>
             </w:r>
             <w:proofErr w:type="gramStart"/>
             <w:r>
@@ -3782,7 +3756,14 @@
                 <w:b w:val="0"/>
                 <w:bCs w:val="0"/>
               </w:rPr>
-              <w:t xml:space="preserve">Presentations  </w:t>
+              <w:t>Events</w:t>
+            </w:r>
+            <w:r>
+              <w:rPr>
+                <w:b w:val="0"/>
+                <w:bCs w:val="0"/>
+              </w:rPr>
+              <w:t xml:space="preserve">  </w:t>
             </w:r>
             <w:r>
               <w:rPr>
@@ -3801,6 +3782,22 @@
               </w:rPr>
               <w:t xml:space="preserve"> </w:t>
             </w:r>
+            <w:r>
+              <w:rPr>
+                <w:color w:val="4F81BD" w:themeColor="accent1"/>
+                <w:sz w:val="16"/>
+                <w:szCs w:val="16"/>
+              </w:rPr>
+              <w:t>2025</w:t>
+            </w:r>
+            <w:r>
+              <w:rPr>
+                <w:color w:val="4F81BD" w:themeColor="accent1"/>
+                <w:sz w:val="16"/>
+                <w:szCs w:val="16"/>
+              </w:rPr>
+              <w:t xml:space="preserve"> – </w:t>
+            </w:r>
             <w:proofErr w:type="gramStart"/>
             <w:r>
               <w:rPr>
@@ -3808,15 +3805,15 @@
                 <w:sz w:val="16"/>
                 <w:szCs w:val="16"/>
               </w:rPr>
-              <w:t>2023</w:t>
-            </w:r>
-            <w:r>
-              <w:rPr>
-                <w:color w:val="4F81BD" w:themeColor="accent1"/>
-                <w:sz w:val="16"/>
-                <w:szCs w:val="16"/>
-              </w:rPr>
-              <w:t xml:space="preserve">  –</w:t>
+              <w:t xml:space="preserve">Present </w:t>
+            </w:r>
+            <w:r>
+              <w:rPr>
+                <w:color w:val="4F81BD" w:themeColor="accent1"/>
+                <w:sz w:val="16"/>
+                <w:szCs w:val="16"/>
+              </w:rPr>
+              <w:t>]</w:t>
             </w:r>
             <w:proofErr w:type="gramEnd"/>
             <w:r>
@@ -3825,32 +3822,6 @@
                 <w:sz w:val="16"/>
                 <w:szCs w:val="16"/>
               </w:rPr>
-              <w:t xml:space="preserve"> </w:t>
-            </w:r>
-            <w:proofErr w:type="gramStart"/>
-            <w:r>
-              <w:rPr>
-                <w:color w:val="4F81BD" w:themeColor="accent1"/>
-                <w:sz w:val="16"/>
-                <w:szCs w:val="16"/>
-              </w:rPr>
-              <w:t xml:space="preserve">Present </w:t>
-            </w:r>
-            <w:r>
-              <w:rPr>
-                <w:color w:val="4F81BD" w:themeColor="accent1"/>
-                <w:sz w:val="16"/>
-                <w:szCs w:val="16"/>
-              </w:rPr>
-              <w:t>]</w:t>
-            </w:r>
-            <w:proofErr w:type="gramEnd"/>
-            <w:r>
-              <w:rPr>
-                <w:color w:val="4F81BD" w:themeColor="accent1"/>
-                <w:sz w:val="16"/>
-                <w:szCs w:val="16"/>
-              </w:rPr>
               <w:t xml:space="preserve">  </w:t>
             </w:r>
             <w:r>
@@ -3862,7 +3833,7 @@
                 <w:sz w:val="16"/>
                 <w:szCs w:val="16"/>
               </w:rPr>
-              <w:t>Alexandria, VA; Arlington, VA; Blacksburg, VA</w:t>
+              <w:t>Alexandria, VA</w:t>
             </w:r>
           </w:p>
           <w:p>
@@ -3880,7 +3851,21 @@
                 <w:b w:val="0"/>
                 <w:bCs w:val="0"/>
               </w:rPr>
-              <w:t xml:space="preserve">Fellowship </w:t>
+              <w:t xml:space="preserve">Quantum </w:t>
+            </w:r>
+            <w:r>
+              <w:rPr>
+                <w:b w:val="0"/>
+                <w:bCs w:val="0"/>
+              </w:rPr>
+              <w:t xml:space="preserve">and Artificial Intelligence </w:t>
+            </w:r>
+            <w:r>
+              <w:rPr>
+                <w:b w:val="0"/>
+                <w:bCs w:val="0"/>
+              </w:rPr>
+              <w:t xml:space="preserve">Research </w:t>
             </w:r>
             <w:proofErr w:type="gramStart"/>
             <w:r>
@@ -3888,14 +3873,7 @@
                 <w:b w:val="0"/>
                 <w:bCs w:val="0"/>
               </w:rPr>
-              <w:t>Panels</w:t>
-            </w:r>
-            <w:r>
-              <w:rPr>
-                <w:b w:val="0"/>
-                <w:bCs w:val="0"/>
-              </w:rPr>
-              <w:t xml:space="preserve">  </w:t>
+              <w:t xml:space="preserve">Presentations  </w:t>
             </w:r>
             <w:r>
               <w:rPr>
@@ -3914,21 +3892,31 @@
               </w:rPr>
               <w:t xml:space="preserve"> </w:t>
             </w:r>
-            <w:r>
-              <w:rPr>
-                <w:color w:val="4F81BD" w:themeColor="accent1"/>
-                <w:sz w:val="16"/>
-                <w:szCs w:val="16"/>
-              </w:rPr>
-              <w:t>2022</w:t>
-            </w:r>
-            <w:r>
-              <w:rPr>
-                <w:color w:val="4F81BD" w:themeColor="accent1"/>
-                <w:sz w:val="16"/>
-                <w:szCs w:val="16"/>
-              </w:rPr>
-              <w:t xml:space="preserve"> – </w:t>
+            <w:proofErr w:type="gramStart"/>
+            <w:r>
+              <w:rPr>
+                <w:color w:val="4F81BD" w:themeColor="accent1"/>
+                <w:sz w:val="16"/>
+                <w:szCs w:val="16"/>
+              </w:rPr>
+              <w:t>2023</w:t>
+            </w:r>
+            <w:r>
+              <w:rPr>
+                <w:color w:val="4F81BD" w:themeColor="accent1"/>
+                <w:sz w:val="16"/>
+                <w:szCs w:val="16"/>
+              </w:rPr>
+              <w:t xml:space="preserve">  –</w:t>
+            </w:r>
+            <w:proofErr w:type="gramEnd"/>
+            <w:r>
+              <w:rPr>
+                <w:color w:val="4F81BD" w:themeColor="accent1"/>
+                <w:sz w:val="16"/>
+                <w:szCs w:val="16"/>
+              </w:rPr>
+              <w:t xml:space="preserve"> </w:t>
             </w:r>
             <w:proofErr w:type="gramStart"/>
             <w:r>
@@ -3977,17 +3965,13 @@
                 <w:numId w:val="21"/>
               </w:numPr>
               <w:ind w:left="245" w:hanging="245"/>
-              <w:rPr>
-                <w:b w:val="0"/>
-                <w:bCs w:val="0"/>
-              </w:rPr>
-            </w:pPr>
-            <w:r>
-              <w:rPr>
-                <w:b w:val="0"/>
-                <w:bCs w:val="0"/>
-              </w:rPr>
-              <w:t xml:space="preserve">Ukraine </w:t>
+            </w:pPr>
+            <w:r>
+              <w:rPr>
+                <w:b w:val="0"/>
+                <w:bCs w:val="0"/>
+              </w:rPr>
+              <w:t xml:space="preserve">Fellowship </w:t>
             </w:r>
             <w:proofErr w:type="gramStart"/>
             <w:r>
@@ -3995,7 +3979,14 @@
                 <w:b w:val="0"/>
                 <w:bCs w:val="0"/>
               </w:rPr>
-              <w:t xml:space="preserve">Delegation  </w:t>
+              <w:t>Panels</w:t>
+            </w:r>
+            <w:r>
+              <w:rPr>
+                <w:b w:val="0"/>
+                <w:bCs w:val="0"/>
+              </w:rPr>
+              <w:t xml:space="preserve">  </w:t>
             </w:r>
             <w:r>
               <w:rPr>
@@ -4014,6 +4005,22 @@
               </w:rPr>
               <w:t xml:space="preserve"> </w:t>
             </w:r>
+            <w:r>
+              <w:rPr>
+                <w:color w:val="4F81BD" w:themeColor="accent1"/>
+                <w:sz w:val="16"/>
+                <w:szCs w:val="16"/>
+              </w:rPr>
+              <w:t>2022</w:t>
+            </w:r>
+            <w:r>
+              <w:rPr>
+                <w:color w:val="4F81BD" w:themeColor="accent1"/>
+                <w:sz w:val="16"/>
+                <w:szCs w:val="16"/>
+              </w:rPr>
+              <w:t xml:space="preserve"> – </w:t>
+            </w:r>
             <w:proofErr w:type="gramStart"/>
             <w:r>
               <w:rPr>
@@ -4021,15 +4028,15 @@
                 <w:sz w:val="16"/>
                 <w:szCs w:val="16"/>
               </w:rPr>
-              <w:t>2025</w:t>
-            </w:r>
-            <w:r>
-              <w:rPr>
-                <w:color w:val="4F81BD" w:themeColor="accent1"/>
-                <w:sz w:val="16"/>
-                <w:szCs w:val="16"/>
-              </w:rPr>
-              <w:t xml:space="preserve"> ]</w:t>
+              <w:t xml:space="preserve">Present </w:t>
+            </w:r>
+            <w:r>
+              <w:rPr>
+                <w:color w:val="4F81BD" w:themeColor="accent1"/>
+                <w:sz w:val="16"/>
+                <w:szCs w:val="16"/>
+              </w:rPr>
+              <w:t>]</w:t>
             </w:r>
             <w:proofErr w:type="gramEnd"/>
             <w:r>
@@ -4049,7 +4056,7 @@
                 <w:sz w:val="16"/>
                 <w:szCs w:val="16"/>
               </w:rPr>
-              <w:t>Virginia Tech Institute for Advanced Computing, Alexandria, VA</w:t>
+              <w:t>Alexandria, VA; Arlington, VA; Blacksburg, VA</w:t>
             </w:r>
           </w:p>
           <w:p>
@@ -4071,7 +4078,7 @@
                 <w:b w:val="0"/>
                 <w:bCs w:val="0"/>
               </w:rPr>
-              <w:t xml:space="preserve">Taiwan </w:t>
+              <w:t xml:space="preserve">Ukraine </w:t>
             </w:r>
             <w:proofErr w:type="gramStart"/>
             <w:r>
@@ -4155,7 +4162,7 @@
                 <w:b w:val="0"/>
                 <w:bCs w:val="0"/>
               </w:rPr>
-              <w:t>International Conference on Learning Representations (</w:t>
+              <w:t xml:space="preserve">Taiwan </w:t>
             </w:r>
             <w:proofErr w:type="gramStart"/>
             <w:r>
@@ -4163,7 +4170,7 @@
                 <w:b w:val="0"/>
                 <w:bCs w:val="0"/>
               </w:rPr>
-              <w:t xml:space="preserve">ICLR)  </w:t>
+              <w:t xml:space="preserve">Delegation  </w:t>
             </w:r>
             <w:r>
               <w:rPr>
@@ -4217,7 +4224,7 @@
                 <w:sz w:val="16"/>
                 <w:szCs w:val="16"/>
               </w:rPr>
-              <w:t>Singapore</w:t>
+              <w:t>Virginia Tech Institute for Advanced Computing, Alexandria, VA</w:t>
             </w:r>
           </w:p>
           <w:p>
@@ -4239,96 +4246,61 @@
                 <w:b w:val="0"/>
                 <w:bCs w:val="0"/>
               </w:rPr>
-              <w:t xml:space="preserve">Virginia Tech </w:t>
-            </w:r>
-            <w:r>
-              <w:rPr>
-                <w:b w:val="0"/>
-                <w:bCs w:val="0"/>
-              </w:rPr>
-              <w:t>Institute for Advanced Computing</w:t>
-            </w:r>
-            <w:r>
-              <w:rPr>
-                <w:b w:val="0"/>
-                <w:bCs w:val="0"/>
+              <w:t>International Conference on Learning Representations (</w:t>
+            </w:r>
+            <w:proofErr w:type="gramStart"/>
+            <w:r>
+              <w:rPr>
+                <w:b w:val="0"/>
+                <w:bCs w:val="0"/>
+              </w:rPr>
+              <w:t xml:space="preserve">ICLR)  </w:t>
+            </w:r>
+            <w:r>
+              <w:rPr>
+                <w:color w:val="4F81BD" w:themeColor="accent1"/>
+                <w:sz w:val="16"/>
+                <w:szCs w:val="16"/>
+              </w:rPr>
+              <w:t>[</w:t>
+            </w:r>
+            <w:proofErr w:type="gramEnd"/>
+            <w:r>
+              <w:rPr>
+                <w:color w:val="4F81BD" w:themeColor="accent1"/>
+                <w:sz w:val="16"/>
+                <w:szCs w:val="16"/>
               </w:rPr>
               <w:t xml:space="preserve"> </w:t>
             </w:r>
-            <w:r>
-              <w:rPr>
-                <w:b w:val="0"/>
-                <w:bCs w:val="0"/>
-              </w:rPr>
-              <w:t>Showcase</w:t>
-            </w:r>
-            <w:r>
-              <w:rPr>
-                <w:b w:val="0"/>
-                <w:bCs w:val="0"/>
-              </w:rPr>
-              <w:t xml:space="preserve"> </w:t>
-            </w:r>
             <w:proofErr w:type="gramStart"/>
             <w:r>
               <w:rPr>
-                <w:b w:val="0"/>
-                <w:bCs w:val="0"/>
-              </w:rPr>
-              <w:t>Events</w:t>
-            </w:r>
-            <w:r>
-              <w:rPr>
-                <w:b w:val="0"/>
-                <w:bCs w:val="0"/>
+                <w:color w:val="4F81BD" w:themeColor="accent1"/>
+                <w:sz w:val="16"/>
+                <w:szCs w:val="16"/>
+              </w:rPr>
+              <w:t>2025</w:t>
+            </w:r>
+            <w:r>
+              <w:rPr>
+                <w:color w:val="4F81BD" w:themeColor="accent1"/>
+                <w:sz w:val="16"/>
+                <w:szCs w:val="16"/>
+              </w:rPr>
+              <w:t xml:space="preserve"> ]</w:t>
+            </w:r>
+            <w:proofErr w:type="gramEnd"/>
+            <w:r>
+              <w:rPr>
+                <w:color w:val="4F81BD" w:themeColor="accent1"/>
+                <w:sz w:val="16"/>
+                <w:szCs w:val="16"/>
               </w:rPr>
               <w:t xml:space="preserve">  </w:t>
             </w:r>
             <w:r>
               <w:rPr>
-                <w:color w:val="4F81BD" w:themeColor="accent1"/>
-                <w:sz w:val="16"/>
-                <w:szCs w:val="16"/>
-              </w:rPr>
-              <w:t>[</w:t>
-            </w:r>
-            <w:proofErr w:type="gramEnd"/>
-            <w:r>
-              <w:rPr>
-                <w:color w:val="4F81BD" w:themeColor="accent1"/>
-                <w:sz w:val="16"/>
-                <w:szCs w:val="16"/>
-              </w:rPr>
-              <w:t xml:space="preserve"> </w:t>
-            </w:r>
-            <w:proofErr w:type="gramStart"/>
-            <w:r>
-              <w:rPr>
-                <w:color w:val="4F81BD" w:themeColor="accent1"/>
-                <w:sz w:val="16"/>
-                <w:szCs w:val="16"/>
-              </w:rPr>
-              <w:t>2025</w:t>
-            </w:r>
-            <w:r>
-              <w:rPr>
-                <w:color w:val="4F81BD" w:themeColor="accent1"/>
-                <w:sz w:val="16"/>
-                <w:szCs w:val="16"/>
-              </w:rPr>
-              <w:t xml:space="preserve"> ]</w:t>
-            </w:r>
-            <w:proofErr w:type="gramEnd"/>
-            <w:r>
-              <w:rPr>
-                <w:color w:val="4F81BD" w:themeColor="accent1"/>
-                <w:sz w:val="16"/>
-                <w:szCs w:val="16"/>
-              </w:rPr>
-              <w:t xml:space="preserve">  </w:t>
-            </w:r>
-            <w:r>
-              <w:rPr>
                 <w:rFonts w:ascii="Helvetica Neue" w:hAnsi="Helvetica Neue"/>
                 <w:b w:val="0"/>
                 <w:bCs w:val="0"/>
@@ -4336,7 +4308,7 @@
                 <w:sz w:val="16"/>
                 <w:szCs w:val="16"/>
               </w:rPr>
-              <w:t>Alexandria, VA</w:t>
+              <w:t>Singapore</w:t>
             </w:r>
           </w:p>
           <w:p>
@@ -5331,7 +5303,7 @@
                     <w:keepNext w:val="0"/>
                   </w:pPr>
                   <w:r>
-                    <w:t xml:space="preserve">[ 6 / </w:t>
+                    <w:t>[ 6/</w:t>
                   </w:r>
                   <w:proofErr w:type="gramStart"/>
                   <w:r>
@@ -5614,7 +5586,7 @@
                     <w:keepNext w:val="0"/>
                   </w:pPr>
                   <w:r>
-                    <w:t xml:space="preserve">[ 4 / </w:t>
+                    <w:t>[ 4/</w:t>
                   </w:r>
                   <w:proofErr w:type="gramStart"/>
                   <w:r>
@@ -5771,7 +5743,7 @@
                     <w:keepNext w:val="0"/>
                   </w:pPr>
                   <w:r>
-                    <w:t xml:space="preserve">[ 3 / </w:t>
+                    <w:t>[ 3/</w:t>
                   </w:r>
                   <w:proofErr w:type="gramStart"/>
                   <w:r>
@@ -6785,6 +6757,314 @@
             </w:pPr>
             <w:r>
               <w:lastRenderedPageBreak/>
+              <w:t>Featured Articles</w:t>
+            </w:r>
+          </w:p>
+        </w:tc>
+        <w:tc>
+          <w:tcPr>
+            <w:tcW w:w="77" w:type="pct"/>
+          </w:tcPr>
+          <w:p>
+            <w:pPr>
+              <w:rPr>
+                <w:sz w:val="10"/>
+                <w:szCs w:val="10"/>
+              </w:rPr>
+            </w:pPr>
+          </w:p>
+        </w:tc>
+        <w:tc>
+          <w:tcPr>
+            <w:tcW w:w="4456" w:type="pct"/>
+          </w:tcPr>
+          <w:p>
+            <w:pPr>
+              <w:pStyle w:val="Heading2"/>
+              <w:numPr>
+                <w:ilvl w:val="0"/>
+                <w:numId w:val="21"/>
+              </w:numPr>
+              <w:ind w:left="245" w:hanging="245"/>
+              <w:rPr>
+                <w:b w:val="0"/>
+                <w:bCs w:val="0"/>
+              </w:rPr>
+            </w:pPr>
+            <w:r>
+              <w:rPr>
+                <w:b w:val="0"/>
+                <w:bCs w:val="0"/>
+              </w:rPr>
+              <w:t xml:space="preserve">N. Frank and V. Tech, “Quantum entanglement could connect drones for disaster relief, bypassing traditional networks,” Phys.org. </w:t>
+            </w:r>
+            <w:r>
+              <w:rPr>
+                <w:b w:val="0"/>
+                <w:bCs w:val="0"/>
+              </w:rPr>
+              <w:t>Dec.</w:t>
+            </w:r>
+            <w:r>
+              <w:rPr>
+                <w:b w:val="0"/>
+                <w:bCs w:val="0"/>
+              </w:rPr>
+              <w:t xml:space="preserve"> 2026. Available: </w:t>
+            </w:r>
+            <w:hyperlink r:id="rId25" w:history="1">
+              <w:r>
+                <w:rPr>
+                  <w:rStyle w:val="Hyperlink"/>
+                  <w:b w:val="0"/>
+                  <w:bCs w:val="0"/>
+                </w:rPr>
+                <w:t>https://phys.org/news/2025-12-quantum-entanglement-drones-disaster-relief.html</w:t>
+              </w:r>
+            </w:hyperlink>
+          </w:p>
+          <w:p>
+            <w:pPr>
+              <w:pStyle w:val="Heading2"/>
+              <w:numPr>
+                <w:ilvl w:val="0"/>
+                <w:numId w:val="21"/>
+              </w:numPr>
+              <w:ind w:left="245" w:hanging="245"/>
+              <w:rPr>
+                <w:b w:val="0"/>
+                <w:bCs w:val="0"/>
+              </w:rPr>
+            </w:pPr>
+            <w:r>
+              <w:rPr>
+                <w:b w:val="0"/>
+                <w:bCs w:val="0"/>
+              </w:rPr>
+              <w:t>N. Frank, “How quantum entanglement can advance disaster relief, communication methods”</w:t>
+            </w:r>
+            <w:r>
+              <w:rPr>
+                <w:b w:val="0"/>
+                <w:bCs w:val="0"/>
+              </w:rPr>
+              <w:t>,</w:t>
+            </w:r>
+            <w:r>
+              <w:rPr>
+                <w:b w:val="0"/>
+                <w:bCs w:val="0"/>
+              </w:rPr>
+              <w:t xml:space="preserve"> </w:t>
+            </w:r>
+            <w:r>
+              <w:rPr>
+                <w:b w:val="0"/>
+                <w:bCs w:val="0"/>
+              </w:rPr>
+              <w:t>Dec. 2025</w:t>
+            </w:r>
+            <w:r>
+              <w:rPr>
+                <w:b w:val="0"/>
+                <w:bCs w:val="0"/>
+              </w:rPr>
+              <w:t xml:space="preserve">. Available: </w:t>
+            </w:r>
+            <w:hyperlink r:id="rId26" w:history="1">
+              <w:r>
+                <w:rPr>
+                  <w:rStyle w:val="Hyperlink"/>
+                  <w:b w:val="0"/>
+                  <w:bCs w:val="0"/>
+                </w:rPr>
+                <w:t>https://news.vt.edu/content/news_vt_edu/en/articles/2025/12/quantum-entanglement-disaster-relief-eqmarl.html</w:t>
+              </w:r>
+            </w:hyperlink>
+          </w:p>
+          <w:p>
+            <w:pPr>
+              <w:pStyle w:val="Heading2"/>
+              <w:numPr>
+                <w:ilvl w:val="0"/>
+                <w:numId w:val="21"/>
+              </w:numPr>
+              <w:ind w:left="245" w:hanging="245"/>
+              <w:rPr>
+                <w:b w:val="0"/>
+                <w:bCs w:val="0"/>
+              </w:rPr>
+            </w:pPr>
+            <w:r>
+              <w:rPr>
+                <w:b w:val="0"/>
+                <w:bCs w:val="0"/>
+              </w:rPr>
+              <w:t xml:space="preserve">S. Andrea, “Virginia Tech announces new Institute for Advanced Computing in the Washington, D.C., area.” </w:t>
+            </w:r>
+            <w:r>
+              <w:rPr>
+                <w:b w:val="0"/>
+                <w:bCs w:val="0"/>
+              </w:rPr>
+              <w:t>May</w:t>
+            </w:r>
+            <w:r>
+              <w:rPr>
+                <w:b w:val="0"/>
+                <w:bCs w:val="0"/>
+              </w:rPr>
+              <w:t xml:space="preserve"> 202</w:t>
+            </w:r>
+            <w:r>
+              <w:rPr>
+                <w:b w:val="0"/>
+                <w:bCs w:val="0"/>
+              </w:rPr>
+              <w:t>5</w:t>
+            </w:r>
+            <w:r>
+              <w:rPr>
+                <w:b w:val="0"/>
+                <w:bCs w:val="0"/>
+              </w:rPr>
+              <w:t xml:space="preserve">. Available: </w:t>
+            </w:r>
+            <w:hyperlink r:id="rId27" w:history="1">
+              <w:r>
+                <w:rPr>
+                  <w:rStyle w:val="Hyperlink"/>
+                  <w:b w:val="0"/>
+                  <w:bCs w:val="0"/>
+                </w:rPr>
+                <w:t>https://news.vt.edu/content/news_vt_edu/en/articles/2025/05/provost-dc-institute-for-advanced-computing.html</w:t>
+              </w:r>
+            </w:hyperlink>
+          </w:p>
+          <w:p>
+            <w:pPr>
+              <w:pStyle w:val="Heading2"/>
+              <w:numPr>
+                <w:ilvl w:val="0"/>
+                <w:numId w:val="21"/>
+              </w:numPr>
+              <w:ind w:left="245" w:hanging="245"/>
+              <w:rPr>
+                <w:b w:val="0"/>
+                <w:bCs w:val="0"/>
+              </w:rPr>
+            </w:pPr>
+            <w:r>
+              <w:rPr>
+                <w:b w:val="0"/>
+                <w:bCs w:val="0"/>
+              </w:rPr>
+              <w:t xml:space="preserve">K. Roeder, “Virginia Tech opens $1B innovation campus in Alexandria,” Technical.ly. </w:t>
+            </w:r>
+            <w:r>
+              <w:rPr>
+                <w:b w:val="0"/>
+                <w:bCs w:val="0"/>
+              </w:rPr>
+              <w:t>March</w:t>
+            </w:r>
+            <w:r>
+              <w:rPr>
+                <w:b w:val="0"/>
+                <w:bCs w:val="0"/>
+              </w:rPr>
+              <w:t xml:space="preserve"> 202</w:t>
+            </w:r>
+            <w:r>
+              <w:rPr>
+                <w:b w:val="0"/>
+                <w:bCs w:val="0"/>
+              </w:rPr>
+              <w:t>5</w:t>
+            </w:r>
+            <w:r>
+              <w:rPr>
+                <w:b w:val="0"/>
+                <w:bCs w:val="0"/>
+              </w:rPr>
+              <w:t xml:space="preserve">. Available: </w:t>
+            </w:r>
+            <w:hyperlink r:id="rId28" w:history="1">
+              <w:r>
+                <w:rPr>
+                  <w:rStyle w:val="Hyperlink"/>
+                  <w:b w:val="0"/>
+                  <w:bCs w:val="0"/>
+                </w:rPr>
+                <w:t>https://technical.ly/civic-news/virginia-tech-innovation-campus-alexandria/</w:t>
+              </w:r>
+            </w:hyperlink>
+          </w:p>
+        </w:tc>
+      </w:tr>
+      <w:tr>
+        <w:trPr>
+          <w:trHeight w:val="98"/>
+        </w:trPr>
+        <w:tc>
+          <w:tcPr>
+            <w:tcW w:w="467" w:type="pct"/>
+          </w:tcPr>
+          <w:p>
+            <w:pPr>
+              <w:pStyle w:val="Heading1"/>
+              <w:keepNext w:val="0"/>
+              <w:rPr>
+                <w:sz w:val="10"/>
+                <w:szCs w:val="10"/>
+              </w:rPr>
+            </w:pPr>
+          </w:p>
+        </w:tc>
+        <w:tc>
+          <w:tcPr>
+            <w:tcW w:w="77" w:type="pct"/>
+          </w:tcPr>
+          <w:p>
+            <w:pPr>
+              <w:rPr>
+                <w:sz w:val="10"/>
+                <w:szCs w:val="10"/>
+              </w:rPr>
+            </w:pPr>
+          </w:p>
+        </w:tc>
+        <w:tc>
+          <w:tcPr>
+            <w:tcW w:w="4456" w:type="pct"/>
+          </w:tcPr>
+          <w:p>
+            <w:pPr>
+              <w:pStyle w:val="Element"/>
+              <w:keepNext w:val="0"/>
+              <w:rPr>
+                <w:rFonts w:asciiTheme="majorHAnsi" w:hAnsiTheme="majorHAnsi"/>
+                <w:sz w:val="10"/>
+                <w:szCs w:val="10"/>
+              </w:rPr>
+            </w:pPr>
+          </w:p>
+        </w:tc>
+      </w:tr>
+      <w:tr>
+        <w:trPr>
+          <w:trHeight w:val="98"/>
+        </w:trPr>
+        <w:tc>
+          <w:tcPr>
+            <w:tcW w:w="467" w:type="pct"/>
+          </w:tcPr>
+          <w:p>
+            <w:pPr>
+              <w:pStyle w:val="Heading1"/>
+              <w:keepNext w:val="0"/>
+            </w:pPr>
+            <w:r>
               <w:t>Skills &amp; Abilities</w:t>
             </w:r>
           </w:p>
@@ -8203,7 +8483,7 @@
                 <w:sz w:val="16"/>
                 <w:szCs w:val="16"/>
               </w:rPr>
-              <w:t xml:space="preserve"> – </w:t>
+              <w:t xml:space="preserve"> – 2</w:t>
             </w:r>
             <w:r>
               <w:rPr>
@@ -8213,8 +8493,9 @@
                 <w:color w:val="7F7F7F" w:themeColor="text1" w:themeTint="80"/>
                 <w:sz w:val="16"/>
                 <w:szCs w:val="16"/>
-              </w:rPr>
-              <w:t>2</w:t>
+                <w:vertAlign w:val="superscript"/>
+              </w:rPr>
+              <w:t>nd</w:t>
             </w:r>
             <w:r>
               <w:rPr>
@@ -8224,31 +8505,8 @@
                 <w:color w:val="7F7F7F" w:themeColor="text1" w:themeTint="80"/>
                 <w:sz w:val="16"/>
                 <w:szCs w:val="16"/>
-                <w:vertAlign w:val="superscript"/>
-              </w:rPr>
-              <w:t>nd</w:t>
-            </w:r>
-            <w:r>
-              <w:rPr>
-                <w:rFonts w:ascii="Helvetica Neue" w:hAnsi="Helvetica Neue"/>
-                <w:b w:val="0"/>
-                <w:bCs w:val="0"/>
-                <w:color w:val="7F7F7F" w:themeColor="text1" w:themeTint="80"/>
-                <w:sz w:val="16"/>
-                <w:szCs w:val="16"/>
-              </w:rPr>
-              <w:t xml:space="preserve"> </w:t>
-            </w:r>
-            <w:r>
-              <w:rPr>
-                <w:rFonts w:ascii="Helvetica Neue" w:hAnsi="Helvetica Neue"/>
-                <w:b w:val="0"/>
-                <w:bCs w:val="0"/>
-                <w:color w:val="7F7F7F" w:themeColor="text1" w:themeTint="80"/>
-                <w:sz w:val="16"/>
-                <w:szCs w:val="16"/>
-              </w:rPr>
-              <w:t>Place Intern Project Presentation Award, Space Systems</w:t>
+              </w:rPr>
+              <w:t xml:space="preserve"> Place Intern Project Presentation Award, Space Systems</w:t>
             </w:r>
           </w:p>
           <w:p>
@@ -9367,8 +9625,8 @@
       </w:pPr>
     </w:p>
     <w:sectPr>
-      <w:headerReference w:type="even" r:id="rId25"/>
-      <w:footerReference w:type="default" r:id="rId26"/>
+      <w:headerReference w:type="even" r:id="rId29"/>
+      <w:footerReference w:type="default" r:id="rId30"/>
       <w:pgSz w:w="12240" w:h="15840"/>
       <w:pgMar w:top="720" w:right="720" w:bottom="720" w:left="720" w:header="720" w:footer="720" w:gutter="0"/>
       <w:cols w:space="720"/>
@@ -12146,6 +12404,7 @@
   </w:compat>
   <w:rsids>
     <w:rsidRoot w:val="009B4380"/>
+    <w:rsid w:val="00003476"/>
     <w:rsid w:val="00016ABB"/>
     <w:rsid w:val="000666D2"/>
     <w:rsid w:val="00095F4B"/>
@@ -12650,30 +12909,6 @@
     <w:name w:val="EFEF76946C2CCB4A80AD4E753049693B"/>
     <w:rsid w:val="009B4380"/>
   </w:style>
-  <w:style w:type="paragraph" w:customStyle="1" w:styleId="AF8FEFECD8352243B2605B7A83337F56">
-    <w:name w:val="AF8FEFECD8352243B2605B7A83337F56"/>
-    <w:rsid w:val="004133D8"/>
-    <w:pPr>
-      <w:spacing w:after="160" w:line="278" w:lineRule="auto"/>
-    </w:pPr>
-    <w:rPr>
-      <w:kern w:val="2"/>
-      <w:lang w:eastAsia="en-US"/>
-      <w14:ligatures w14:val="standardContextual"/>
-    </w:rPr>
-  </w:style>
-  <w:style w:type="paragraph" w:customStyle="1" w:styleId="18DBCF14A3D5BA429CF97382A0E96371">
-    <w:name w:val="18DBCF14A3D5BA429CF97382A0E96371"/>
-    <w:rsid w:val="004133D8"/>
-    <w:pPr>
-      <w:spacing w:after="160" w:line="278" w:lineRule="auto"/>
-    </w:pPr>
-    <w:rPr>
-      <w:kern w:val="2"/>
-      <w:lang w:eastAsia="en-US"/>
-      <w14:ligatures w14:val="standardContextual"/>
-    </w:rPr>
-  </w:style>
 </w:styles>
 </file>
 

</xml_diff>

<commit_message>
Add AI/ML and quantum skills
</commit_message>
<xml_diff>
--- a/derieux_resume_multipage.docx
+++ b/derieux_resume_multipage.docx
@@ -161,9 +161,11 @@
         <w:tblLook w:val="04A0" w:firstRow="1" w:lastRow="0" w:firstColumn="1" w:lastColumn="0" w:noHBand="0" w:noVBand="1"/>
       </w:tblPr>
       <w:tblGrid>
-        <w:gridCol w:w="1009"/>
+        <w:gridCol w:w="1014"/>
         <w:gridCol w:w="166"/>
-        <w:gridCol w:w="9625"/>
+        <w:gridCol w:w="3216"/>
+        <w:gridCol w:w="1594"/>
+        <w:gridCol w:w="4810"/>
       </w:tblGrid>
       <w:tr>
         <w:trPr>
@@ -171,7 +173,7 @@
         </w:trPr>
         <w:tc>
           <w:tcPr>
-            <w:tcW w:w="467" w:type="pct"/>
+            <w:tcW w:w="469" w:type="pct"/>
           </w:tcPr>
           <w:p>
             <w:pPr>
@@ -183,8 +185,8 @@
         </w:tc>
         <w:tc>
           <w:tcPr>
-            <w:tcW w:w="4533" w:type="pct"/>
-            <w:gridSpan w:val="2"/>
+            <w:tcW w:w="4531" w:type="pct"/>
+            <w:gridSpan w:val="4"/>
           </w:tcPr>
           <w:p>
             <w:pPr>
@@ -729,7 +731,7 @@
         </w:trPr>
         <w:tc>
           <w:tcPr>
-            <w:tcW w:w="467" w:type="pct"/>
+            <w:tcW w:w="469" w:type="pct"/>
           </w:tcPr>
           <w:p>
             <w:pPr>
@@ -757,7 +759,8 @@
         </w:tc>
         <w:tc>
           <w:tcPr>
-            <w:tcW w:w="4456" w:type="pct"/>
+            <w:tcW w:w="4454" w:type="pct"/>
+            <w:gridSpan w:val="3"/>
           </w:tcPr>
           <w:p>
             <w:pPr>
@@ -780,7 +783,7 @@
         </w:trPr>
         <w:tc>
           <w:tcPr>
-            <w:tcW w:w="467" w:type="pct"/>
+            <w:tcW w:w="469" w:type="pct"/>
           </w:tcPr>
           <w:p>
             <w:pPr>
@@ -811,7 +814,8 @@
         </w:tc>
         <w:tc>
           <w:tcPr>
-            <w:tcW w:w="4456" w:type="pct"/>
+            <w:tcW w:w="4454" w:type="pct"/>
+            <w:gridSpan w:val="3"/>
           </w:tcPr>
           <w:p>
             <w:pPr>
@@ -880,7 +884,7 @@
         </w:trPr>
         <w:tc>
           <w:tcPr>
-            <w:tcW w:w="467" w:type="pct"/>
+            <w:tcW w:w="469" w:type="pct"/>
           </w:tcPr>
           <w:p>
             <w:pPr>
@@ -908,7 +912,8 @@
         </w:tc>
         <w:tc>
           <w:tcPr>
-            <w:tcW w:w="4456" w:type="pct"/>
+            <w:tcW w:w="4454" w:type="pct"/>
+            <w:gridSpan w:val="3"/>
           </w:tcPr>
           <w:p>
             <w:pPr>
@@ -931,7 +936,7 @@
         </w:trPr>
         <w:tc>
           <w:tcPr>
-            <w:tcW w:w="467" w:type="pct"/>
+            <w:tcW w:w="469" w:type="pct"/>
           </w:tcPr>
           <w:p>
             <w:pPr>
@@ -962,7 +967,8 @@
         </w:tc>
         <w:tc>
           <w:tcPr>
-            <w:tcW w:w="4456" w:type="pct"/>
+            <w:tcW w:w="4454" w:type="pct"/>
+            <w:gridSpan w:val="3"/>
           </w:tcPr>
           <w:p>
             <w:pPr>
@@ -1055,7 +1061,7 @@
         </w:trPr>
         <w:tc>
           <w:tcPr>
-            <w:tcW w:w="467" w:type="pct"/>
+            <w:tcW w:w="469" w:type="pct"/>
           </w:tcPr>
           <w:p>
             <w:pPr>
@@ -1083,7 +1089,8 @@
         </w:tc>
         <w:tc>
           <w:tcPr>
-            <w:tcW w:w="4456" w:type="pct"/>
+            <w:tcW w:w="4454" w:type="pct"/>
+            <w:gridSpan w:val="3"/>
           </w:tcPr>
           <w:p>
             <w:pPr>
@@ -1106,7 +1113,7 @@
         </w:trPr>
         <w:tc>
           <w:tcPr>
-            <w:tcW w:w="467" w:type="pct"/>
+            <w:tcW w:w="469" w:type="pct"/>
           </w:tcPr>
           <w:p>
             <w:pPr>
@@ -1133,7 +1140,8 @@
         </w:tc>
         <w:tc>
           <w:tcPr>
-            <w:tcW w:w="4456" w:type="pct"/>
+            <w:tcW w:w="4454" w:type="pct"/>
+            <w:gridSpan w:val="3"/>
           </w:tcPr>
           <w:tbl>
             <w:tblPr>
@@ -1290,7 +1298,7 @@
         </w:trPr>
         <w:tc>
           <w:tcPr>
-            <w:tcW w:w="467" w:type="pct"/>
+            <w:tcW w:w="469" w:type="pct"/>
           </w:tcPr>
           <w:p>
             <w:pPr>
@@ -1318,7 +1326,8 @@
         </w:tc>
         <w:tc>
           <w:tcPr>
-            <w:tcW w:w="4456" w:type="pct"/>
+            <w:tcW w:w="4454" w:type="pct"/>
+            <w:gridSpan w:val="3"/>
           </w:tcPr>
           <w:tbl>
             <w:tblPr>
@@ -1466,7 +1475,7 @@
         </w:trPr>
         <w:tc>
           <w:tcPr>
-            <w:tcW w:w="467" w:type="pct"/>
+            <w:tcW w:w="469" w:type="pct"/>
           </w:tcPr>
           <w:p>
             <w:pPr>
@@ -1490,7 +1499,8 @@
         </w:tc>
         <w:tc>
           <w:tcPr>
-            <w:tcW w:w="4456" w:type="pct"/>
+            <w:tcW w:w="4454" w:type="pct"/>
+            <w:gridSpan w:val="3"/>
           </w:tcPr>
           <w:tbl>
             <w:tblPr>
@@ -1644,7 +1654,7 @@
         </w:trPr>
         <w:tc>
           <w:tcPr>
-            <w:tcW w:w="467" w:type="pct"/>
+            <w:tcW w:w="469" w:type="pct"/>
           </w:tcPr>
           <w:p>
             <w:pPr>
@@ -1668,7 +1678,8 @@
         </w:tc>
         <w:tc>
           <w:tcPr>
-            <w:tcW w:w="4456" w:type="pct"/>
+            <w:tcW w:w="4454" w:type="pct"/>
+            <w:gridSpan w:val="3"/>
           </w:tcPr>
           <w:tbl>
             <w:tblPr>
@@ -1813,7 +1824,7 @@
         </w:trPr>
         <w:tc>
           <w:tcPr>
-            <w:tcW w:w="467" w:type="pct"/>
+            <w:tcW w:w="469" w:type="pct"/>
           </w:tcPr>
           <w:p>
             <w:pPr>
@@ -1839,7 +1850,8 @@
         </w:tc>
         <w:tc>
           <w:tcPr>
-            <w:tcW w:w="4456" w:type="pct"/>
+            <w:tcW w:w="4454" w:type="pct"/>
+            <w:gridSpan w:val="3"/>
           </w:tcPr>
           <w:p>
             <w:pPr>
@@ -1865,7 +1877,7 @@
         </w:trPr>
         <w:tc>
           <w:tcPr>
-            <w:tcW w:w="467" w:type="pct"/>
+            <w:tcW w:w="469" w:type="pct"/>
           </w:tcPr>
           <w:p>
             <w:pPr>
@@ -1894,7 +1906,8 @@
         </w:tc>
         <w:tc>
           <w:tcPr>
-            <w:tcW w:w="4456" w:type="pct"/>
+            <w:tcW w:w="4454" w:type="pct"/>
+            <w:gridSpan w:val="3"/>
           </w:tcPr>
           <w:tbl>
             <w:tblPr>
@@ -2022,7 +2035,13 @@
                     <w:t>Developed</w:t>
                   </w:r>
                   <w:r>
-                    <w:t xml:space="preserve"> architectures and techniques to facilitate heterogeneous multi-task learning (HMTL) in smart garden alleys with diverse data sources.</w:t>
+                    <w:t xml:space="preserve"> </w:t>
+                  </w:r>
+                  <w:r>
+                    <w:t xml:space="preserve">artificial intelligence </w:t>
+                  </w:r>
+                  <w:r>
+                    <w:t>architectures and techniques to facilitate heterogeneous multi-task learning (HMTL) in smart garden alleys with diverse data sources.</w:t>
                   </w:r>
                 </w:p>
               </w:tc>
@@ -2046,7 +2065,7 @@
         </w:trPr>
         <w:tc>
           <w:tcPr>
-            <w:tcW w:w="467" w:type="pct"/>
+            <w:tcW w:w="469" w:type="pct"/>
           </w:tcPr>
           <w:p>
             <w:pPr>
@@ -2069,7 +2088,8 @@
         </w:tc>
         <w:tc>
           <w:tcPr>
-            <w:tcW w:w="4456" w:type="pct"/>
+            <w:tcW w:w="4454" w:type="pct"/>
+            <w:gridSpan w:val="3"/>
           </w:tcPr>
           <w:tbl>
             <w:tblPr>
@@ -2204,7 +2224,7 @@
         </w:trPr>
         <w:tc>
           <w:tcPr>
-            <w:tcW w:w="467" w:type="pct"/>
+            <w:tcW w:w="469" w:type="pct"/>
           </w:tcPr>
           <w:p>
             <w:pPr>
@@ -2227,7 +2247,8 @@
         </w:tc>
         <w:tc>
           <w:tcPr>
-            <w:tcW w:w="4456" w:type="pct"/>
+            <w:tcW w:w="4454" w:type="pct"/>
+            <w:gridSpan w:val="3"/>
           </w:tcPr>
           <w:tbl>
             <w:tblPr>
@@ -2338,7 +2359,7 @@
         </w:trPr>
         <w:tc>
           <w:tcPr>
-            <w:tcW w:w="467" w:type="pct"/>
+            <w:tcW w:w="469" w:type="pct"/>
           </w:tcPr>
           <w:p>
             <w:pPr>
@@ -2361,7 +2382,8 @@
         </w:tc>
         <w:tc>
           <w:tcPr>
-            <w:tcW w:w="4456" w:type="pct"/>
+            <w:tcW w:w="4454" w:type="pct"/>
+            <w:gridSpan w:val="3"/>
           </w:tcPr>
           <w:tbl>
             <w:tblPr>
@@ -2463,7 +2485,7 @@
         </w:trPr>
         <w:tc>
           <w:tcPr>
-            <w:tcW w:w="467" w:type="pct"/>
+            <w:tcW w:w="469" w:type="pct"/>
           </w:tcPr>
           <w:p>
             <w:pPr>
@@ -2486,7 +2508,8 @@
         </w:tc>
         <w:tc>
           <w:tcPr>
-            <w:tcW w:w="4456" w:type="pct"/>
+            <w:tcW w:w="4454" w:type="pct"/>
+            <w:gridSpan w:val="3"/>
           </w:tcPr>
           <w:tbl>
             <w:tblPr>
@@ -2600,7 +2623,7 @@
         </w:trPr>
         <w:tc>
           <w:tcPr>
-            <w:tcW w:w="467" w:type="pct"/>
+            <w:tcW w:w="469" w:type="pct"/>
           </w:tcPr>
           <w:p>
             <w:pPr>
@@ -2628,7 +2651,8 @@
         </w:tc>
         <w:tc>
           <w:tcPr>
-            <w:tcW w:w="4456" w:type="pct"/>
+            <w:tcW w:w="4454" w:type="pct"/>
+            <w:gridSpan w:val="3"/>
           </w:tcPr>
           <w:p>
             <w:pPr>
@@ -2656,7 +2680,7 @@
         </w:trPr>
         <w:tc>
           <w:tcPr>
-            <w:tcW w:w="467" w:type="pct"/>
+            <w:tcW w:w="469" w:type="pct"/>
           </w:tcPr>
           <w:p>
             <w:pPr>
@@ -2683,7 +2707,8 @@
         </w:tc>
         <w:tc>
           <w:tcPr>
-            <w:tcW w:w="4456" w:type="pct"/>
+            <w:tcW w:w="4454" w:type="pct"/>
+            <w:gridSpan w:val="3"/>
           </w:tcPr>
           <w:p>
             <w:pPr>
@@ -3181,7 +3206,7 @@
         </w:trPr>
         <w:tc>
           <w:tcPr>
-            <w:tcW w:w="467" w:type="pct"/>
+            <w:tcW w:w="469" w:type="pct"/>
           </w:tcPr>
           <w:p>
             <w:pPr>
@@ -3209,7 +3234,8 @@
         </w:tc>
         <w:tc>
           <w:tcPr>
-            <w:tcW w:w="4456" w:type="pct"/>
+            <w:tcW w:w="4454" w:type="pct"/>
+            <w:gridSpan w:val="3"/>
           </w:tcPr>
           <w:p>
             <w:pPr>
@@ -3231,7 +3257,7 @@
         </w:trPr>
         <w:tc>
           <w:tcPr>
-            <w:tcW w:w="467" w:type="pct"/>
+            <w:tcW w:w="469" w:type="pct"/>
           </w:tcPr>
           <w:p>
             <w:pPr>
@@ -3259,7 +3285,8 @@
         </w:tc>
         <w:tc>
           <w:tcPr>
-            <w:tcW w:w="4456" w:type="pct"/>
+            <w:tcW w:w="4454" w:type="pct"/>
+            <w:gridSpan w:val="3"/>
           </w:tcPr>
           <w:p>
             <w:pPr>
@@ -3281,7 +3308,7 @@
         </w:trPr>
         <w:tc>
           <w:tcPr>
-            <w:tcW w:w="467" w:type="pct"/>
+            <w:tcW w:w="469" w:type="pct"/>
           </w:tcPr>
           <w:p>
             <w:pPr>
@@ -3313,7 +3340,8 @@
         </w:tc>
         <w:tc>
           <w:tcPr>
-            <w:tcW w:w="4456" w:type="pct"/>
+            <w:tcW w:w="4454" w:type="pct"/>
+            <w:gridSpan w:val="3"/>
           </w:tcPr>
           <w:p>
             <w:pPr>
@@ -4666,7 +4694,7 @@
         </w:trPr>
         <w:tc>
           <w:tcPr>
-            <w:tcW w:w="467" w:type="pct"/>
+            <w:tcW w:w="469" w:type="pct"/>
           </w:tcPr>
           <w:p>
             <w:pPr>
@@ -4694,7 +4722,8 @@
         </w:tc>
         <w:tc>
           <w:tcPr>
-            <w:tcW w:w="4456" w:type="pct"/>
+            <w:tcW w:w="4454" w:type="pct"/>
+            <w:gridSpan w:val="3"/>
           </w:tcPr>
           <w:p>
             <w:pPr>
@@ -4716,7 +4745,7 @@
         </w:trPr>
         <w:tc>
           <w:tcPr>
-            <w:tcW w:w="467" w:type="pct"/>
+            <w:tcW w:w="469" w:type="pct"/>
           </w:tcPr>
           <w:p>
             <w:pPr>
@@ -4758,7 +4787,8 @@
         </w:tc>
         <w:tc>
           <w:tcPr>
-            <w:tcW w:w="4456" w:type="pct"/>
+            <w:tcW w:w="4454" w:type="pct"/>
+            <w:gridSpan w:val="3"/>
           </w:tcPr>
           <w:p>
             <w:pPr>
@@ -5155,7 +5185,7 @@
         </w:trPr>
         <w:tc>
           <w:tcPr>
-            <w:tcW w:w="467" w:type="pct"/>
+            <w:tcW w:w="469" w:type="pct"/>
           </w:tcPr>
           <w:p>
             <w:pPr>
@@ -5183,7 +5213,8 @@
         </w:tc>
         <w:tc>
           <w:tcPr>
-            <w:tcW w:w="4456" w:type="pct"/>
+            <w:tcW w:w="4454" w:type="pct"/>
+            <w:gridSpan w:val="3"/>
           </w:tcPr>
           <w:p>
             <w:pPr>
@@ -5205,7 +5236,7 @@
         </w:trPr>
         <w:tc>
           <w:tcPr>
-            <w:tcW w:w="467" w:type="pct"/>
+            <w:tcW w:w="469" w:type="pct"/>
           </w:tcPr>
           <w:p>
             <w:pPr>
@@ -5241,7 +5272,8 @@
         </w:tc>
         <w:tc>
           <w:tcPr>
-            <w:tcW w:w="4456" w:type="pct"/>
+            <w:tcW w:w="4454" w:type="pct"/>
+            <w:gridSpan w:val="3"/>
           </w:tcPr>
           <w:tbl>
             <w:tblPr>
@@ -5500,7 +5532,7 @@
         </w:trPr>
         <w:tc>
           <w:tcPr>
-            <w:tcW w:w="467" w:type="pct"/>
+            <w:tcW w:w="469" w:type="pct"/>
           </w:tcPr>
           <w:p>
             <w:pPr>
@@ -5524,7 +5556,8 @@
         </w:tc>
         <w:tc>
           <w:tcPr>
-            <w:tcW w:w="4456" w:type="pct"/>
+            <w:tcW w:w="4454" w:type="pct"/>
+            <w:gridSpan w:val="3"/>
           </w:tcPr>
           <w:tbl>
             <w:tblPr>
@@ -5662,7 +5695,7 @@
         </w:trPr>
         <w:tc>
           <w:tcPr>
-            <w:tcW w:w="467" w:type="pct"/>
+            <w:tcW w:w="469" w:type="pct"/>
           </w:tcPr>
           <w:p>
             <w:pPr>
@@ -5686,7 +5719,8 @@
         </w:tc>
         <w:tc>
           <w:tcPr>
-            <w:tcW w:w="4456" w:type="pct"/>
+            <w:tcW w:w="4454" w:type="pct"/>
+            <w:gridSpan w:val="3"/>
           </w:tcPr>
           <w:tbl>
             <w:tblPr>
@@ -5801,7 +5835,7 @@
         </w:trPr>
         <w:tc>
           <w:tcPr>
-            <w:tcW w:w="467" w:type="pct"/>
+            <w:tcW w:w="469" w:type="pct"/>
           </w:tcPr>
           <w:p>
             <w:pPr>
@@ -5825,7 +5859,8 @@
         </w:tc>
         <w:tc>
           <w:tcPr>
-            <w:tcW w:w="4456" w:type="pct"/>
+            <w:tcW w:w="4454" w:type="pct"/>
+            <w:gridSpan w:val="3"/>
           </w:tcPr>
           <w:tbl>
             <w:tblPr>
@@ -5938,7 +5973,7 @@
         </w:trPr>
         <w:tc>
           <w:tcPr>
-            <w:tcW w:w="467" w:type="pct"/>
+            <w:tcW w:w="469" w:type="pct"/>
           </w:tcPr>
           <w:p>
             <w:pPr>
@@ -5962,7 +5997,8 @@
         </w:tc>
         <w:tc>
           <w:tcPr>
-            <w:tcW w:w="4456" w:type="pct"/>
+            <w:tcW w:w="4454" w:type="pct"/>
+            <w:gridSpan w:val="3"/>
           </w:tcPr>
           <w:tbl>
             <w:tblPr>
@@ -6059,7 +6095,7 @@
         </w:trPr>
         <w:tc>
           <w:tcPr>
-            <w:tcW w:w="467" w:type="pct"/>
+            <w:tcW w:w="469" w:type="pct"/>
           </w:tcPr>
           <w:p>
             <w:pPr>
@@ -6083,7 +6119,8 @@
         </w:tc>
         <w:tc>
           <w:tcPr>
-            <w:tcW w:w="4456" w:type="pct"/>
+            <w:tcW w:w="4454" w:type="pct"/>
+            <w:gridSpan w:val="3"/>
           </w:tcPr>
           <w:tbl>
             <w:tblPr>
@@ -6180,7 +6217,7 @@
         </w:trPr>
         <w:tc>
           <w:tcPr>
-            <w:tcW w:w="467" w:type="pct"/>
+            <w:tcW w:w="469" w:type="pct"/>
           </w:tcPr>
           <w:p>
             <w:pPr>
@@ -6204,7 +6241,8 @@
         </w:tc>
         <w:tc>
           <w:tcPr>
-            <w:tcW w:w="4456" w:type="pct"/>
+            <w:tcW w:w="4454" w:type="pct"/>
+            <w:gridSpan w:val="3"/>
           </w:tcPr>
           <w:tbl>
             <w:tblPr>
@@ -6296,7 +6334,7 @@
         </w:trPr>
         <w:tc>
           <w:tcPr>
-            <w:tcW w:w="467" w:type="pct"/>
+            <w:tcW w:w="469" w:type="pct"/>
           </w:tcPr>
           <w:p>
             <w:pPr>
@@ -6320,7 +6358,8 @@
         </w:tc>
         <w:tc>
           <w:tcPr>
-            <w:tcW w:w="4456" w:type="pct"/>
+            <w:tcW w:w="4454" w:type="pct"/>
+            <w:gridSpan w:val="3"/>
           </w:tcPr>
           <w:tbl>
             <w:tblPr>
@@ -6423,7 +6462,7 @@
         </w:trPr>
         <w:tc>
           <w:tcPr>
-            <w:tcW w:w="467" w:type="pct"/>
+            <w:tcW w:w="469" w:type="pct"/>
           </w:tcPr>
           <w:p>
             <w:pPr>
@@ -6447,7 +6486,8 @@
         </w:tc>
         <w:tc>
           <w:tcPr>
-            <w:tcW w:w="4456" w:type="pct"/>
+            <w:tcW w:w="4454" w:type="pct"/>
+            <w:gridSpan w:val="3"/>
           </w:tcPr>
           <w:tbl>
             <w:tblPr>
@@ -6569,7 +6609,7 @@
         </w:trPr>
         <w:tc>
           <w:tcPr>
-            <w:tcW w:w="467" w:type="pct"/>
+            <w:tcW w:w="469" w:type="pct"/>
           </w:tcPr>
           <w:p>
             <w:pPr>
@@ -6593,7 +6633,8 @@
         </w:tc>
         <w:tc>
           <w:tcPr>
-            <w:tcW w:w="4456" w:type="pct"/>
+            <w:tcW w:w="4454" w:type="pct"/>
+            <w:gridSpan w:val="3"/>
           </w:tcPr>
           <w:tbl>
             <w:tblPr>
@@ -6694,7 +6735,7 @@
         </w:trPr>
         <w:tc>
           <w:tcPr>
-            <w:tcW w:w="467" w:type="pct"/>
+            <w:tcW w:w="469" w:type="pct"/>
           </w:tcPr>
           <w:p>
             <w:pPr>
@@ -6722,7 +6763,8 @@
         </w:tc>
         <w:tc>
           <w:tcPr>
-            <w:tcW w:w="4456" w:type="pct"/>
+            <w:tcW w:w="4454" w:type="pct"/>
+            <w:gridSpan w:val="3"/>
           </w:tcPr>
           <w:p>
             <w:pPr>
@@ -6742,7 +6784,7 @@
         </w:trPr>
         <w:tc>
           <w:tcPr>
-            <w:tcW w:w="467" w:type="pct"/>
+            <w:tcW w:w="469" w:type="pct"/>
           </w:tcPr>
           <w:p>
             <w:pPr>
@@ -6770,7 +6812,8 @@
         </w:tc>
         <w:tc>
           <w:tcPr>
-            <w:tcW w:w="4456" w:type="pct"/>
+            <w:tcW w:w="4454" w:type="pct"/>
+            <w:gridSpan w:val="3"/>
           </w:tcPr>
           <w:p>
             <w:pPr>
@@ -7016,7 +7059,7 @@
         </w:trPr>
         <w:tc>
           <w:tcPr>
-            <w:tcW w:w="467" w:type="pct"/>
+            <w:tcW w:w="469" w:type="pct"/>
           </w:tcPr>
           <w:p>
             <w:pPr>
@@ -7044,7 +7087,8 @@
         </w:tc>
         <w:tc>
           <w:tcPr>
-            <w:tcW w:w="4456" w:type="pct"/>
+            <w:tcW w:w="4454" w:type="pct"/>
+            <w:gridSpan w:val="3"/>
           </w:tcPr>
           <w:p>
             <w:pPr>
@@ -7065,7 +7109,8 @@
         </w:trPr>
         <w:tc>
           <w:tcPr>
-            <w:tcW w:w="467" w:type="pct"/>
+            <w:tcW w:w="469" w:type="pct"/>
+            <w:vMerge w:val="restart"/>
           </w:tcPr>
           <w:p>
             <w:pPr>
@@ -7092,369 +7137,43 @@
         </w:tc>
         <w:tc>
           <w:tcPr>
-            <w:tcW w:w="4456" w:type="pct"/>
-          </w:tcPr>
-          <w:tbl>
-            <w:tblPr>
-              <w:tblStyle w:val="TableGrid"/>
-              <w:tblW w:w="9634" w:type="dxa"/>
-              <w:tblInd w:w="5" w:type="dxa"/>
-              <w:tblBorders>
-                <w:top w:val="none" w:sz="0" w:space="0" w:color="auto"/>
-                <w:left w:val="none" w:sz="0" w:space="0" w:color="auto"/>
-                <w:bottom w:val="none" w:sz="0" w:space="0" w:color="auto"/>
-                <w:right w:val="none" w:sz="0" w:space="0" w:color="auto"/>
-                <w:insideH w:val="none" w:sz="0" w:space="0" w:color="auto"/>
-                <w:insideV w:val="none" w:sz="0" w:space="0" w:color="auto"/>
-              </w:tblBorders>
-              <w:tblLayout w:type="fixed"/>
-              <w:tblCellMar>
-                <w:left w:w="0" w:type="dxa"/>
-                <w:right w:w="0" w:type="dxa"/>
-              </w:tblCellMar>
-              <w:tblLook w:val="04A0" w:firstRow="1" w:lastRow="0" w:firstColumn="1" w:lastColumn="0" w:noHBand="0" w:noVBand="1"/>
-            </w:tblPr>
-            <w:tblGrid>
-              <w:gridCol w:w="3220"/>
-              <w:gridCol w:w="3426"/>
-              <w:gridCol w:w="2988"/>
-            </w:tblGrid>
-            <w:tr>
-              <w:trPr>
-                <w:gridAfter w:val="1"/>
-                <w:wAfter w:w="1551" w:type="pct"/>
-              </w:trPr>
-              <w:tc>
-                <w:tcPr>
-                  <w:tcW w:w="1671" w:type="pct"/>
-                </w:tcPr>
-                <w:p>
-                  <w:pPr>
-                    <w:pStyle w:val="Element"/>
-                    <w:keepNext w:val="0"/>
-                    <w:rPr>
-                      <w:rFonts w:asciiTheme="majorHAnsi" w:hAnsiTheme="majorHAnsi"/>
-                    </w:rPr>
-                  </w:pPr>
-                  <w:r>
-                    <w:rPr>
-                      <w:rFonts w:asciiTheme="majorHAnsi" w:hAnsiTheme="majorHAnsi"/>
-                    </w:rPr>
-                    <w:t>Programming Languages</w:t>
-                  </w:r>
-                </w:p>
-              </w:tc>
-              <w:tc>
-                <w:tcPr>
-                  <w:tcW w:w="1778" w:type="pct"/>
-                </w:tcPr>
-                <w:p>
-                  <w:pPr>
-                    <w:pStyle w:val="Element"/>
-                    <w:keepNext w:val="0"/>
-                    <w:rPr>
-                      <w:rFonts w:asciiTheme="majorHAnsi" w:hAnsiTheme="majorHAnsi"/>
-                    </w:rPr>
-                  </w:pPr>
-                  <w:r>
-                    <w:rPr>
-                      <w:rFonts w:asciiTheme="majorHAnsi" w:hAnsiTheme="majorHAnsi"/>
-                    </w:rPr>
-                    <w:t>APIs / Frameworks / Packages / Tools</w:t>
-                  </w:r>
-                </w:p>
-              </w:tc>
-            </w:tr>
-            <w:tr>
-              <w:trPr>
-                <w:trHeight w:val="360"/>
-              </w:trPr>
-              <w:tc>
-                <w:tcPr>
-                  <w:tcW w:w="1671" w:type="pct"/>
-                </w:tcPr>
-                <w:p>
-                  <w:pPr>
-                    <w:pStyle w:val="Content"/>
-                    <w:numPr>
-                      <w:ilvl w:val="0"/>
-                      <w:numId w:val="12"/>
-                    </w:numPr>
-                    <w:ind w:left="245" w:hanging="164"/>
-                  </w:pPr>
-                  <w:r>
-                    <w:t>Python</w:t>
-                  </w:r>
-                </w:p>
-                <w:p>
-                  <w:pPr>
-                    <w:pStyle w:val="Content"/>
-                    <w:numPr>
-                      <w:ilvl w:val="0"/>
-                      <w:numId w:val="12"/>
-                    </w:numPr>
-                    <w:ind w:left="245" w:hanging="164"/>
-                  </w:pPr>
-                  <w:r>
-                    <w:t>C / C++ / C#</w:t>
-                  </w:r>
-                </w:p>
-                <w:p>
-                  <w:pPr>
-                    <w:pStyle w:val="Content"/>
-                    <w:numPr>
-                      <w:ilvl w:val="0"/>
-                      <w:numId w:val="12"/>
-                    </w:numPr>
-                    <w:ind w:left="245" w:hanging="164"/>
-                  </w:pPr>
-                  <w:r>
-                    <w:t>MATLAB</w:t>
-                  </w:r>
-                </w:p>
-                <w:p>
-                  <w:pPr>
-                    <w:pStyle w:val="Content"/>
-                    <w:numPr>
-                      <w:ilvl w:val="0"/>
-                      <w:numId w:val="12"/>
-                    </w:numPr>
-                    <w:ind w:left="245" w:hanging="164"/>
-                  </w:pPr>
-                  <w:r>
-                    <w:t>JavaScript / TypeScript / HTML / CSS</w:t>
-                  </w:r>
-                </w:p>
-                <w:p>
-                  <w:pPr>
-                    <w:pStyle w:val="Content"/>
-                    <w:numPr>
-                      <w:ilvl w:val="0"/>
-                      <w:numId w:val="12"/>
-                    </w:numPr>
-                    <w:ind w:left="245" w:hanging="164"/>
-                  </w:pPr>
-                  <w:r>
-                    <w:t>Java</w:t>
-                  </w:r>
-                </w:p>
-                <w:p>
-                  <w:pPr>
-                    <w:pStyle w:val="Content"/>
-                    <w:numPr>
-                      <w:ilvl w:val="0"/>
-                      <w:numId w:val="12"/>
-                    </w:numPr>
-                    <w:ind w:left="245" w:hanging="164"/>
-                  </w:pPr>
-                  <w:r>
-                    <w:t>Rust / Go</w:t>
-                  </w:r>
-                </w:p>
-                <w:p>
-                  <w:pPr>
-                    <w:pStyle w:val="Content"/>
-                    <w:numPr>
-                      <w:ilvl w:val="0"/>
-                      <w:numId w:val="12"/>
-                    </w:numPr>
-                    <w:ind w:left="245" w:hanging="164"/>
-                  </w:pPr>
-                  <w:r>
-                    <w:t>Fortran</w:t>
-                  </w:r>
-                </w:p>
-                <w:p>
-                  <w:pPr>
-                    <w:pStyle w:val="Content"/>
-                    <w:numPr>
-                      <w:ilvl w:val="0"/>
-                      <w:numId w:val="12"/>
-                    </w:numPr>
-                    <w:ind w:left="245" w:hanging="164"/>
-                  </w:pPr>
-                  <w:r>
-                    <w:t>LaTeX</w:t>
-                  </w:r>
-                </w:p>
-              </w:tc>
-              <w:tc>
-                <w:tcPr>
-                  <w:tcW w:w="3329" w:type="pct"/>
-                  <w:gridSpan w:val="2"/>
-                </w:tcPr>
-                <w:p>
-                  <w:pPr>
-                    <w:pStyle w:val="Content"/>
-                    <w:numPr>
-                      <w:ilvl w:val="0"/>
-                      <w:numId w:val="12"/>
-                    </w:numPr>
-                    <w:ind w:left="278" w:hanging="187"/>
-                  </w:pPr>
-                  <w:r>
-                    <w:rPr>
-                      <w:b/>
-                      <w:bCs/>
-                    </w:rPr>
-                    <w:t>Python packages</w:t>
-                  </w:r>
-                  <w:r>
-                    <w:t xml:space="preserve">: JAX / FLAX / TensorFlow / </w:t>
-                  </w:r>
-                  <w:proofErr w:type="spellStart"/>
-                  <w:r>
-                    <w:t>PyTorch</w:t>
-                  </w:r>
-                  <w:proofErr w:type="spellEnd"/>
-                  <w:r>
-                    <w:t xml:space="preserve"> / Gymnasium </w:t>
-                  </w:r>
-                  <w:r>
-                    <w:br/>
-                    <w:t xml:space="preserve">/ PennyLane / </w:t>
-                  </w:r>
-                  <w:proofErr w:type="spellStart"/>
-                  <w:r>
-                    <w:t>Qiskit</w:t>
-                  </w:r>
-                  <w:proofErr w:type="spellEnd"/>
-                  <w:r>
-                    <w:t xml:space="preserve"> / Cirq / TensorFlow Quantum / Torch Quantum</w:t>
-                  </w:r>
-                  <w:r>
-                    <w:br/>
-                    <w:t xml:space="preserve">/ NumPy / Pandas / SciPy / Scikit-Learn / Matplotlib / Seaborn / Flask / </w:t>
-                  </w:r>
-                  <w:proofErr w:type="spellStart"/>
-                  <w:r>
-                    <w:t>NetworkX</w:t>
-                  </w:r>
-                  <w:proofErr w:type="spellEnd"/>
-                  <w:r>
-                    <w:t xml:space="preserve"> </w:t>
-                  </w:r>
-                  <w:r>
-                    <w:br/>
-                    <w:t xml:space="preserve">/ </w:t>
-                  </w:r>
-                  <w:proofErr w:type="spellStart"/>
-                  <w:r>
-                    <w:t>BeautifulSoup</w:t>
-                  </w:r>
-                  <w:proofErr w:type="spellEnd"/>
-                  <w:r>
-                    <w:t xml:space="preserve"> / OpenCV / Pillow / </w:t>
-                  </w:r>
-                  <w:proofErr w:type="spellStart"/>
-                  <w:r>
-                    <w:t>PyQt</w:t>
-                  </w:r>
-                  <w:proofErr w:type="spellEnd"/>
-                  <w:r>
-                    <w:t xml:space="preserve"> / </w:t>
-                  </w:r>
-                  <w:proofErr w:type="spellStart"/>
-                  <w:r>
-                    <w:t>Pytest</w:t>
-                  </w:r>
-                  <w:proofErr w:type="spellEnd"/>
-                  <w:r>
-                    <w:t xml:space="preserve"> / UV / </w:t>
-                  </w:r>
-                  <w:proofErr w:type="spellStart"/>
-                  <w:r>
-                    <w:t>Pipenv</w:t>
-                  </w:r>
-                  <w:proofErr w:type="spellEnd"/>
-                  <w:r>
-                    <w:t xml:space="preserve"> / </w:t>
-                  </w:r>
-                  <w:proofErr w:type="spellStart"/>
-                  <w:r>
-                    <w:t>Pyenv</w:t>
-                  </w:r>
-                  <w:proofErr w:type="spellEnd"/>
-                  <w:r>
-                    <w:t xml:space="preserve"> / Requests </w:t>
-                  </w:r>
-                  <w:r>
-                    <w:br/>
-                    <w:t xml:space="preserve">/ </w:t>
-                  </w:r>
-                  <w:proofErr w:type="spellStart"/>
-                  <w:r>
-                    <w:t>WandB</w:t>
-                  </w:r>
-                  <w:proofErr w:type="spellEnd"/>
-                  <w:r>
-                    <w:t xml:space="preserve"> / </w:t>
-                  </w:r>
-                  <w:r>
-                    <w:t>etc.</w:t>
-                  </w:r>
-                </w:p>
-                <w:p>
-                  <w:pPr>
-                    <w:pStyle w:val="Content"/>
-                    <w:numPr>
-                      <w:ilvl w:val="0"/>
-                      <w:numId w:val="12"/>
-                    </w:numPr>
-                    <w:ind w:left="278" w:hanging="187"/>
-                  </w:pPr>
-                  <w:r>
-                    <w:rPr>
-                      <w:b/>
-                      <w:bCs/>
-                    </w:rPr>
-                    <w:t>Webapp</w:t>
-                  </w:r>
-                  <w:r>
-                    <w:rPr>
-                      <w:b/>
-                      <w:bCs/>
-                    </w:rPr>
-                    <w:t xml:space="preserve"> packages</w:t>
-                  </w:r>
-                  <w:r>
-                    <w:t>:  React.js / Electron.js / Cesium.js / Bootstrap</w:t>
-                  </w:r>
-                </w:p>
-                <w:p>
-                  <w:pPr>
-                    <w:pStyle w:val="Content"/>
-                    <w:numPr>
-                      <w:ilvl w:val="0"/>
-                      <w:numId w:val="12"/>
-                    </w:numPr>
-                    <w:ind w:left="278" w:hanging="187"/>
-                  </w:pPr>
-                  <w:r>
-                    <w:t>Grafana</w:t>
-                  </w:r>
-                </w:p>
-                <w:p>
-                  <w:pPr>
-                    <w:pStyle w:val="Content"/>
-                    <w:numPr>
-                      <w:ilvl w:val="0"/>
-                      <w:numId w:val="12"/>
-                    </w:numPr>
-                    <w:ind w:left="278" w:hanging="187"/>
-                  </w:pPr>
-                  <w:r>
-                    <w:t>Canvas LMS</w:t>
-                  </w:r>
-                </w:p>
-              </w:tc>
-            </w:tr>
-          </w:tbl>
-          <w:p>
-            <w:pPr>
-              <w:pStyle w:val="Heading2"/>
-              <w:keepNext w:val="0"/>
-            </w:pPr>
+            <w:tcW w:w="2227" w:type="pct"/>
+            <w:gridSpan w:val="2"/>
+          </w:tcPr>
+          <w:p>
+            <w:pPr>
+              <w:pStyle w:val="Element"/>
+              <w:keepNext w:val="0"/>
+              <w:rPr>
+                <w:rFonts w:asciiTheme="majorHAnsi" w:hAnsiTheme="majorHAnsi"/>
+              </w:rPr>
+            </w:pPr>
+            <w:r>
+              <w:rPr>
+                <w:rFonts w:asciiTheme="majorHAnsi" w:hAnsiTheme="majorHAnsi"/>
+              </w:rPr>
+              <w:t>Artificial Intelligence / Machine Learning</w:t>
+            </w:r>
+          </w:p>
+        </w:tc>
+        <w:tc>
+          <w:tcPr>
+            <w:tcW w:w="2227" w:type="pct"/>
+          </w:tcPr>
+          <w:p>
+            <w:pPr>
+              <w:pStyle w:val="Element"/>
+              <w:keepNext w:val="0"/>
+              <w:rPr>
+                <w:rFonts w:asciiTheme="majorHAnsi" w:hAnsiTheme="majorHAnsi"/>
+              </w:rPr>
+            </w:pPr>
+            <w:r>
+              <w:rPr>
+                <w:rFonts w:asciiTheme="majorHAnsi" w:hAnsiTheme="majorHAnsi"/>
+              </w:rPr>
+              <w:t>Quantum Computing</w:t>
+            </w:r>
           </w:p>
         </w:tc>
       </w:tr>
@@ -7464,12 +7183,22 @@
         </w:trPr>
         <w:tc>
           <w:tcPr>
-            <w:tcW w:w="467" w:type="pct"/>
+            <w:tcW w:w="469" w:type="pct"/>
+            <w:vMerge/>
           </w:tcPr>
           <w:p>
             <w:pPr>
               <w:pStyle w:val="Heading1"/>
               <w:keepNext w:val="0"/>
+            </w:pPr>
+          </w:p>
+        </w:tc>
+        <w:tc>
+          <w:tcPr>
+            <w:tcW w:w="77" w:type="pct"/>
+          </w:tcPr>
+          <w:p>
+            <w:pPr>
               <w:rPr>
                 <w:sz w:val="10"/>
                 <w:szCs w:val="10"/>
@@ -7479,30 +7208,204 @@
         </w:tc>
         <w:tc>
           <w:tcPr>
-            <w:tcW w:w="77" w:type="pct"/>
-          </w:tcPr>
-          <w:p>
-            <w:pPr>
-              <w:rPr>
-                <w:sz w:val="10"/>
-                <w:szCs w:val="10"/>
-              </w:rPr>
-            </w:pPr>
-          </w:p>
-        </w:tc>
-        <w:tc>
-          <w:tcPr>
-            <w:tcW w:w="4456" w:type="pct"/>
-          </w:tcPr>
-          <w:p>
-            <w:pPr>
-              <w:pStyle w:val="Heading2"/>
-              <w:keepNext w:val="0"/>
-              <w:rPr>
-                <w:sz w:val="10"/>
-                <w:szCs w:val="10"/>
-              </w:rPr>
-            </w:pPr>
+            <w:tcW w:w="2227" w:type="pct"/>
+            <w:gridSpan w:val="2"/>
+          </w:tcPr>
+          <w:p>
+            <w:pPr>
+              <w:pStyle w:val="Content"/>
+              <w:numPr>
+                <w:ilvl w:val="0"/>
+                <w:numId w:val="12"/>
+              </w:numPr>
+              <w:ind w:left="245" w:hanging="164"/>
+            </w:pPr>
+            <w:r>
+              <w:t xml:space="preserve">Reinforcement Learning </w:t>
+            </w:r>
+            <w:r>
+              <w:t xml:space="preserve">(RL) </w:t>
+            </w:r>
+            <w:r>
+              <w:t>/ Multi-Agent Reinforcement Learning</w:t>
+            </w:r>
+            <w:r>
+              <w:t xml:space="preserve"> (MARL)</w:t>
+            </w:r>
+          </w:p>
+          <w:p>
+            <w:pPr>
+              <w:pStyle w:val="Content"/>
+              <w:numPr>
+                <w:ilvl w:val="0"/>
+                <w:numId w:val="12"/>
+              </w:numPr>
+              <w:ind w:left="245" w:hanging="164"/>
+            </w:pPr>
+            <w:r>
+              <w:t xml:space="preserve">Generative Modeling / </w:t>
+            </w:r>
+            <w:r>
+              <w:t>Multi-Task Learning</w:t>
+            </w:r>
+            <w:r>
+              <w:t xml:space="preserve"> / </w:t>
+            </w:r>
+            <w:r>
+              <w:t>Time-series Forecasting</w:t>
+            </w:r>
+            <w:r>
+              <w:t xml:space="preserve"> / Regression / Classification / etc.</w:t>
+            </w:r>
+          </w:p>
+          <w:p>
+            <w:pPr>
+              <w:pStyle w:val="Content"/>
+              <w:numPr>
+                <w:ilvl w:val="0"/>
+                <w:numId w:val="12"/>
+              </w:numPr>
+              <w:ind w:left="245" w:hanging="164"/>
+            </w:pPr>
+            <w:r>
+              <w:t>Multi-Arm Bandits (MAB) / Multi-Agent Multi-Arm Bandits (M</w:t>
+            </w:r>
+            <w:r>
+              <w:t>A</w:t>
+            </w:r>
+            <w:r>
+              <w:t>MAB)</w:t>
+            </w:r>
+          </w:p>
+          <w:p>
+            <w:pPr>
+              <w:pStyle w:val="Content"/>
+              <w:numPr>
+                <w:ilvl w:val="0"/>
+                <w:numId w:val="12"/>
+              </w:numPr>
+              <w:ind w:left="245" w:hanging="164"/>
+            </w:pPr>
+            <w:r>
+              <w:t>Game Theory</w:t>
+            </w:r>
+            <w:r>
+              <w:t xml:space="preserve"> / Optimization</w:t>
+            </w:r>
+          </w:p>
+          <w:p>
+            <w:pPr>
+              <w:pStyle w:val="Content"/>
+              <w:numPr>
+                <w:ilvl w:val="0"/>
+                <w:numId w:val="12"/>
+              </w:numPr>
+              <w:ind w:left="245" w:hanging="164"/>
+            </w:pPr>
+            <w:r>
+              <w:t>Transformers / Attention Mechanisms</w:t>
+            </w:r>
+            <w:r>
+              <w:t xml:space="preserve"> / </w:t>
+            </w:r>
+            <w:r>
+              <w:t xml:space="preserve">Generative Adversarial Networks (GANs) / </w:t>
+            </w:r>
+            <w:r>
+              <w:t>Convolutional Neural Networks (CNNs) / Recurrent Neural Networks (RNNs)</w:t>
+            </w:r>
+            <w:r>
+              <w:t xml:space="preserve"> / etc.</w:t>
+            </w:r>
+          </w:p>
+        </w:tc>
+        <w:tc>
+          <w:tcPr>
+            <w:tcW w:w="2227" w:type="pct"/>
+          </w:tcPr>
+          <w:p>
+            <w:pPr>
+              <w:pStyle w:val="Content"/>
+              <w:numPr>
+                <w:ilvl w:val="0"/>
+                <w:numId w:val="12"/>
+              </w:numPr>
+              <w:ind w:left="245" w:hanging="164"/>
+            </w:pPr>
+            <w:r>
+              <w:t>Quantum Artificial Intelligence (QAI) / Quantum Machine Learning (QML)</w:t>
+            </w:r>
+          </w:p>
+          <w:p>
+            <w:pPr>
+              <w:pStyle w:val="Content"/>
+              <w:numPr>
+                <w:ilvl w:val="0"/>
+                <w:numId w:val="12"/>
+              </w:numPr>
+              <w:ind w:left="245" w:hanging="164"/>
+            </w:pPr>
+            <w:r>
+              <w:t>Quantum Neural Networks (QNNs) / Quantum Generative Adversarial Networks (QGANs)</w:t>
+            </w:r>
+          </w:p>
+          <w:p>
+            <w:pPr>
+              <w:pStyle w:val="Content"/>
+              <w:numPr>
+                <w:ilvl w:val="0"/>
+                <w:numId w:val="12"/>
+              </w:numPr>
+              <w:ind w:left="245" w:hanging="164"/>
+            </w:pPr>
+            <w:r>
+              <w:t>Quantum Information Theory</w:t>
+            </w:r>
+            <w:r>
+              <w:t xml:space="preserve"> / Entanglement / etc.</w:t>
+            </w:r>
+          </w:p>
+          <w:p>
+            <w:pPr>
+              <w:pStyle w:val="Content"/>
+              <w:numPr>
+                <w:ilvl w:val="0"/>
+                <w:numId w:val="12"/>
+              </w:numPr>
+              <w:ind w:left="245" w:hanging="164"/>
+            </w:pPr>
+            <w:r>
+              <w:t>Quantum Circuits</w:t>
+            </w:r>
+            <w:r>
+              <w:t xml:space="preserve"> / Variational Quantum Circuits (VQCs)</w:t>
+            </w:r>
+          </w:p>
+          <w:p>
+            <w:pPr>
+              <w:pStyle w:val="Content"/>
+              <w:numPr>
+                <w:ilvl w:val="0"/>
+                <w:numId w:val="12"/>
+              </w:numPr>
+              <w:ind w:left="245" w:hanging="164"/>
+            </w:pPr>
+            <w:r>
+              <w:t>Quantum Simulation</w:t>
+            </w:r>
+          </w:p>
+          <w:p>
+            <w:pPr>
+              <w:pStyle w:val="Content"/>
+              <w:numPr>
+                <w:ilvl w:val="0"/>
+                <w:numId w:val="12"/>
+              </w:numPr>
+              <w:ind w:left="245" w:hanging="164"/>
+            </w:pPr>
+            <w:r>
+              <w:t>Quantum Internet / Quantum Networks</w:t>
+            </w:r>
           </w:p>
         </w:tc>
       </w:tr>
@@ -7512,7 +7415,7 @@
         </w:trPr>
         <w:tc>
           <w:tcPr>
-            <w:tcW w:w="467" w:type="pct"/>
+            <w:tcW w:w="469" w:type="pct"/>
           </w:tcPr>
           <w:p>
             <w:pPr>
@@ -7536,7 +7439,432 @@
         </w:tc>
         <w:tc>
           <w:tcPr>
-            <w:tcW w:w="4456" w:type="pct"/>
+            <w:tcW w:w="1489" w:type="pct"/>
+          </w:tcPr>
+          <w:p>
+            <w:pPr>
+              <w:pStyle w:val="Element"/>
+              <w:keepNext w:val="0"/>
+              <w:rPr>
+                <w:rFonts w:asciiTheme="majorHAnsi" w:hAnsiTheme="majorHAnsi"/>
+              </w:rPr>
+            </w:pPr>
+            <w:r>
+              <w:rPr>
+                <w:rFonts w:asciiTheme="majorHAnsi" w:hAnsiTheme="majorHAnsi"/>
+              </w:rPr>
+              <w:t>Programming Languages</w:t>
+            </w:r>
+          </w:p>
+        </w:tc>
+        <w:tc>
+          <w:tcPr>
+            <w:tcW w:w="2965" w:type="pct"/>
+            <w:gridSpan w:val="2"/>
+          </w:tcPr>
+          <w:p>
+            <w:pPr>
+              <w:pStyle w:val="Element"/>
+              <w:keepNext w:val="0"/>
+              <w:rPr>
+                <w:rFonts w:asciiTheme="majorHAnsi" w:hAnsiTheme="majorHAnsi"/>
+              </w:rPr>
+            </w:pPr>
+            <w:r>
+              <w:rPr>
+                <w:rFonts w:asciiTheme="majorHAnsi" w:hAnsiTheme="majorHAnsi"/>
+              </w:rPr>
+              <w:t>APIs / Frameworks / Packages / Tools</w:t>
+            </w:r>
+          </w:p>
+        </w:tc>
+      </w:tr>
+      <w:tr>
+        <w:trPr>
+          <w:trHeight w:val="98"/>
+        </w:trPr>
+        <w:tc>
+          <w:tcPr>
+            <w:tcW w:w="469" w:type="pct"/>
+          </w:tcPr>
+          <w:p>
+            <w:pPr>
+              <w:pStyle w:val="Heading1"/>
+              <w:keepNext w:val="0"/>
+            </w:pPr>
+          </w:p>
+        </w:tc>
+        <w:tc>
+          <w:tcPr>
+            <w:tcW w:w="77" w:type="pct"/>
+          </w:tcPr>
+          <w:p>
+            <w:pPr>
+              <w:rPr>
+                <w:sz w:val="10"/>
+                <w:szCs w:val="10"/>
+              </w:rPr>
+            </w:pPr>
+          </w:p>
+        </w:tc>
+        <w:tc>
+          <w:tcPr>
+            <w:tcW w:w="1489" w:type="pct"/>
+          </w:tcPr>
+          <w:p>
+            <w:pPr>
+              <w:pStyle w:val="Content"/>
+              <w:numPr>
+                <w:ilvl w:val="0"/>
+                <w:numId w:val="12"/>
+              </w:numPr>
+              <w:ind w:left="245" w:hanging="164"/>
+            </w:pPr>
+            <w:r>
+              <w:t>Python</w:t>
+            </w:r>
+          </w:p>
+          <w:p>
+            <w:pPr>
+              <w:pStyle w:val="Content"/>
+              <w:numPr>
+                <w:ilvl w:val="0"/>
+                <w:numId w:val="12"/>
+              </w:numPr>
+              <w:ind w:left="245" w:hanging="164"/>
+            </w:pPr>
+            <w:r>
+              <w:t>C / C++ / C#</w:t>
+            </w:r>
+          </w:p>
+          <w:p>
+            <w:pPr>
+              <w:pStyle w:val="Content"/>
+              <w:numPr>
+                <w:ilvl w:val="0"/>
+                <w:numId w:val="12"/>
+              </w:numPr>
+              <w:ind w:left="245" w:hanging="164"/>
+            </w:pPr>
+            <w:r>
+              <w:t>MATLAB</w:t>
+            </w:r>
+          </w:p>
+          <w:p>
+            <w:pPr>
+              <w:pStyle w:val="Content"/>
+              <w:numPr>
+                <w:ilvl w:val="0"/>
+                <w:numId w:val="12"/>
+              </w:numPr>
+              <w:ind w:left="245" w:hanging="164"/>
+            </w:pPr>
+            <w:r>
+              <w:t>JavaScript / TypeScript / HTML / CSS</w:t>
+            </w:r>
+          </w:p>
+          <w:p>
+            <w:pPr>
+              <w:pStyle w:val="Content"/>
+              <w:numPr>
+                <w:ilvl w:val="0"/>
+                <w:numId w:val="12"/>
+              </w:numPr>
+              <w:ind w:left="245" w:hanging="164"/>
+            </w:pPr>
+            <w:r>
+              <w:t>Java</w:t>
+            </w:r>
+          </w:p>
+          <w:p>
+            <w:pPr>
+              <w:pStyle w:val="Content"/>
+              <w:numPr>
+                <w:ilvl w:val="0"/>
+                <w:numId w:val="12"/>
+              </w:numPr>
+              <w:ind w:left="245" w:hanging="164"/>
+            </w:pPr>
+            <w:r>
+              <w:t>Rust / Go</w:t>
+            </w:r>
+          </w:p>
+          <w:p>
+            <w:pPr>
+              <w:pStyle w:val="Content"/>
+              <w:numPr>
+                <w:ilvl w:val="0"/>
+                <w:numId w:val="12"/>
+              </w:numPr>
+              <w:ind w:left="245" w:hanging="164"/>
+            </w:pPr>
+            <w:r>
+              <w:t>Fortran</w:t>
+            </w:r>
+          </w:p>
+          <w:p>
+            <w:pPr>
+              <w:pStyle w:val="Content"/>
+              <w:numPr>
+                <w:ilvl w:val="0"/>
+                <w:numId w:val="12"/>
+              </w:numPr>
+              <w:ind w:left="245" w:hanging="164"/>
+            </w:pPr>
+            <w:r>
+              <w:t>LaTeX</w:t>
+            </w:r>
+          </w:p>
+        </w:tc>
+        <w:tc>
+          <w:tcPr>
+            <w:tcW w:w="2965" w:type="pct"/>
+            <w:gridSpan w:val="2"/>
+          </w:tcPr>
+          <w:p>
+            <w:pPr>
+              <w:pStyle w:val="Content"/>
+              <w:numPr>
+                <w:ilvl w:val="0"/>
+                <w:numId w:val="12"/>
+              </w:numPr>
+              <w:ind w:left="278" w:hanging="187"/>
+            </w:pPr>
+            <w:r>
+              <w:rPr>
+                <w:b/>
+                <w:bCs/>
+              </w:rPr>
+              <w:t>Python packages</w:t>
+            </w:r>
+            <w:r>
+              <w:t xml:space="preserve">: JAX / FLAX / TensorFlow / </w:t>
+            </w:r>
+            <w:proofErr w:type="spellStart"/>
+            <w:r>
+              <w:t>PyTorch</w:t>
+            </w:r>
+            <w:proofErr w:type="spellEnd"/>
+            <w:r>
+              <w:t xml:space="preserve"> / Gymnasium </w:t>
+            </w:r>
+            <w:r>
+              <w:br/>
+              <w:t xml:space="preserve">/ PennyLane / </w:t>
+            </w:r>
+            <w:proofErr w:type="spellStart"/>
+            <w:r>
+              <w:t>Qiskit</w:t>
+            </w:r>
+            <w:proofErr w:type="spellEnd"/>
+            <w:r>
+              <w:t xml:space="preserve"> / Cirq / TensorFlow Quantum / Torch Quantum</w:t>
+            </w:r>
+            <w:r>
+              <w:br/>
+              <w:t xml:space="preserve">/ NumPy / Pandas / SciPy / Scikit-Learn / Matplotlib / Seaborn / Flask / </w:t>
+            </w:r>
+            <w:proofErr w:type="spellStart"/>
+            <w:r>
+              <w:t>NetworkX</w:t>
+            </w:r>
+            <w:proofErr w:type="spellEnd"/>
+            <w:r>
+              <w:t xml:space="preserve"> </w:t>
+            </w:r>
+            <w:r>
+              <w:br/>
+              <w:t xml:space="preserve">/ </w:t>
+            </w:r>
+            <w:proofErr w:type="spellStart"/>
+            <w:r>
+              <w:t>BeautifulSoup</w:t>
+            </w:r>
+            <w:proofErr w:type="spellEnd"/>
+            <w:r>
+              <w:t xml:space="preserve"> / OpenCV / Pillow / </w:t>
+            </w:r>
+            <w:proofErr w:type="spellStart"/>
+            <w:r>
+              <w:t>PyQt</w:t>
+            </w:r>
+            <w:proofErr w:type="spellEnd"/>
+            <w:r>
+              <w:t xml:space="preserve"> / </w:t>
+            </w:r>
+            <w:proofErr w:type="spellStart"/>
+            <w:r>
+              <w:t>Pytest</w:t>
+            </w:r>
+            <w:proofErr w:type="spellEnd"/>
+            <w:r>
+              <w:t xml:space="preserve"> / UV / </w:t>
+            </w:r>
+            <w:proofErr w:type="spellStart"/>
+            <w:r>
+              <w:t>Pipenv</w:t>
+            </w:r>
+            <w:proofErr w:type="spellEnd"/>
+            <w:r>
+              <w:t xml:space="preserve"> / </w:t>
+            </w:r>
+            <w:proofErr w:type="spellStart"/>
+            <w:r>
+              <w:t>Pyenv</w:t>
+            </w:r>
+            <w:proofErr w:type="spellEnd"/>
+            <w:r>
+              <w:t xml:space="preserve"> / Requests </w:t>
+            </w:r>
+            <w:r>
+              <w:br/>
+              <w:t xml:space="preserve">/ </w:t>
+            </w:r>
+            <w:proofErr w:type="spellStart"/>
+            <w:r>
+              <w:t>WandB</w:t>
+            </w:r>
+            <w:proofErr w:type="spellEnd"/>
+            <w:r>
+              <w:t xml:space="preserve"> / etc.</w:t>
+            </w:r>
+          </w:p>
+          <w:p>
+            <w:pPr>
+              <w:pStyle w:val="Content"/>
+              <w:numPr>
+                <w:ilvl w:val="0"/>
+                <w:numId w:val="12"/>
+              </w:numPr>
+              <w:ind w:left="278" w:hanging="187"/>
+            </w:pPr>
+            <w:r>
+              <w:rPr>
+                <w:b/>
+                <w:bCs/>
+              </w:rPr>
+              <w:t>Webapp</w:t>
+            </w:r>
+            <w:r>
+              <w:rPr>
+                <w:b/>
+                <w:bCs/>
+              </w:rPr>
+              <w:t xml:space="preserve"> packages</w:t>
+            </w:r>
+            <w:r>
+              <w:t>:  React.js / Electron.js / Cesium.js / Bootstrap</w:t>
+            </w:r>
+          </w:p>
+          <w:p>
+            <w:pPr>
+              <w:pStyle w:val="Content"/>
+              <w:numPr>
+                <w:ilvl w:val="0"/>
+                <w:numId w:val="12"/>
+              </w:numPr>
+              <w:ind w:left="278" w:hanging="187"/>
+            </w:pPr>
+            <w:r>
+              <w:t>Grafana</w:t>
+            </w:r>
+          </w:p>
+          <w:p>
+            <w:pPr>
+              <w:pStyle w:val="Content"/>
+              <w:numPr>
+                <w:ilvl w:val="0"/>
+                <w:numId w:val="12"/>
+              </w:numPr>
+              <w:ind w:left="278" w:hanging="187"/>
+            </w:pPr>
+            <w:r>
+              <w:t>Canvas LMS</w:t>
+            </w:r>
+          </w:p>
+        </w:tc>
+      </w:tr>
+      <w:tr>
+        <w:trPr>
+          <w:trHeight w:val="98"/>
+        </w:trPr>
+        <w:tc>
+          <w:tcPr>
+            <w:tcW w:w="469" w:type="pct"/>
+          </w:tcPr>
+          <w:p>
+            <w:pPr>
+              <w:pStyle w:val="Heading1"/>
+              <w:keepNext w:val="0"/>
+              <w:rPr>
+                <w:sz w:val="10"/>
+                <w:szCs w:val="10"/>
+              </w:rPr>
+            </w:pPr>
+          </w:p>
+        </w:tc>
+        <w:tc>
+          <w:tcPr>
+            <w:tcW w:w="77" w:type="pct"/>
+          </w:tcPr>
+          <w:p>
+            <w:pPr>
+              <w:rPr>
+                <w:sz w:val="10"/>
+                <w:szCs w:val="10"/>
+              </w:rPr>
+            </w:pPr>
+          </w:p>
+        </w:tc>
+        <w:tc>
+          <w:tcPr>
+            <w:tcW w:w="4454" w:type="pct"/>
+            <w:gridSpan w:val="3"/>
+          </w:tcPr>
+          <w:p>
+            <w:pPr>
+              <w:pStyle w:val="Heading2"/>
+              <w:keepNext w:val="0"/>
+              <w:rPr>
+                <w:sz w:val="10"/>
+                <w:szCs w:val="10"/>
+              </w:rPr>
+            </w:pPr>
+          </w:p>
+        </w:tc>
+      </w:tr>
+      <w:tr>
+        <w:trPr>
+          <w:trHeight w:val="98"/>
+        </w:trPr>
+        <w:tc>
+          <w:tcPr>
+            <w:tcW w:w="469" w:type="pct"/>
+          </w:tcPr>
+          <w:p>
+            <w:pPr>
+              <w:pStyle w:val="Heading1"/>
+              <w:keepNext w:val="0"/>
+            </w:pPr>
+          </w:p>
+        </w:tc>
+        <w:tc>
+          <w:tcPr>
+            <w:tcW w:w="77" w:type="pct"/>
+          </w:tcPr>
+          <w:p>
+            <w:pPr>
+              <w:rPr>
+                <w:sz w:val="10"/>
+                <w:szCs w:val="10"/>
+              </w:rPr>
+            </w:pPr>
+          </w:p>
+        </w:tc>
+        <w:tc>
+          <w:tcPr>
+            <w:tcW w:w="4454" w:type="pct"/>
+            <w:gridSpan w:val="3"/>
           </w:tcPr>
           <w:tbl>
             <w:tblPr>
@@ -7879,7 +8207,7 @@
         </w:trPr>
         <w:tc>
           <w:tcPr>
-            <w:tcW w:w="467" w:type="pct"/>
+            <w:tcW w:w="469" w:type="pct"/>
           </w:tcPr>
           <w:p>
             <w:pPr>
@@ -7907,7 +8235,8 @@
         </w:tc>
         <w:tc>
           <w:tcPr>
-            <w:tcW w:w="4456" w:type="pct"/>
+            <w:tcW w:w="4454" w:type="pct"/>
+            <w:gridSpan w:val="3"/>
           </w:tcPr>
           <w:p>
             <w:pPr>
@@ -7927,7 +8256,7 @@
         </w:trPr>
         <w:tc>
           <w:tcPr>
-            <w:tcW w:w="467" w:type="pct"/>
+            <w:tcW w:w="469" w:type="pct"/>
           </w:tcPr>
           <w:p>
             <w:pPr>
@@ -7962,7 +8291,8 @@
         </w:tc>
         <w:tc>
           <w:tcPr>
-            <w:tcW w:w="4456" w:type="pct"/>
+            <w:tcW w:w="4454" w:type="pct"/>
+            <w:gridSpan w:val="3"/>
           </w:tcPr>
           <w:p>
             <w:pPr>
@@ -7976,6 +8306,9 @@
             <w:proofErr w:type="spellEnd"/>
             <w:r>
               <w:t xml:space="preserve"> Kappa Nu</w:t>
+            </w:r>
+            <w:r>
+              <w:t xml:space="preserve"> (HKN)</w:t>
             </w:r>
             <w:r>
               <w:rPr>
@@ -8079,7 +8412,7 @@
         </w:trPr>
         <w:tc>
           <w:tcPr>
-            <w:tcW w:w="467" w:type="pct"/>
+            <w:tcW w:w="469" w:type="pct"/>
           </w:tcPr>
           <w:p>
             <w:pPr>
@@ -8107,7 +8440,8 @@
         </w:tc>
         <w:tc>
           <w:tcPr>
-            <w:tcW w:w="4456" w:type="pct"/>
+            <w:tcW w:w="4454" w:type="pct"/>
+            <w:gridSpan w:val="3"/>
           </w:tcPr>
           <w:p>
             <w:pPr>
@@ -8127,7 +8461,7 @@
         </w:trPr>
         <w:tc>
           <w:tcPr>
-            <w:tcW w:w="467" w:type="pct"/>
+            <w:tcW w:w="469" w:type="pct"/>
           </w:tcPr>
           <w:p>
             <w:pPr>
@@ -8160,7 +8494,8 @@
         </w:tc>
         <w:tc>
           <w:tcPr>
-            <w:tcW w:w="4456" w:type="pct"/>
+            <w:tcW w:w="4454" w:type="pct"/>
+            <w:gridSpan w:val="3"/>
           </w:tcPr>
           <w:p>
             <w:pPr>
@@ -8600,7 +8935,7 @@
         </w:trPr>
         <w:tc>
           <w:tcPr>
-            <w:tcW w:w="467" w:type="pct"/>
+            <w:tcW w:w="469" w:type="pct"/>
           </w:tcPr>
           <w:p>
             <w:pPr>
@@ -8628,7 +8963,8 @@
         </w:tc>
         <w:tc>
           <w:tcPr>
-            <w:tcW w:w="4456" w:type="pct"/>
+            <w:tcW w:w="4454" w:type="pct"/>
+            <w:gridSpan w:val="3"/>
           </w:tcPr>
           <w:p>
             <w:pPr>
@@ -8648,7 +8984,7 @@
         </w:trPr>
         <w:tc>
           <w:tcPr>
-            <w:tcW w:w="467" w:type="pct"/>
+            <w:tcW w:w="469" w:type="pct"/>
           </w:tcPr>
           <w:p>
             <w:pPr>
@@ -8675,7 +9011,8 @@
         </w:tc>
         <w:tc>
           <w:tcPr>
-            <w:tcW w:w="4456" w:type="pct"/>
+            <w:tcW w:w="4454" w:type="pct"/>
+            <w:gridSpan w:val="3"/>
           </w:tcPr>
           <w:p>
             <w:pPr>
@@ -8805,7 +9142,7 @@
         </w:trPr>
         <w:tc>
           <w:tcPr>
-            <w:tcW w:w="467" w:type="pct"/>
+            <w:tcW w:w="469" w:type="pct"/>
           </w:tcPr>
           <w:p>
             <w:pPr>
@@ -8829,7 +9166,8 @@
         </w:tc>
         <w:tc>
           <w:tcPr>
-            <w:tcW w:w="4456" w:type="pct"/>
+            <w:tcW w:w="4454" w:type="pct"/>
+            <w:gridSpan w:val="3"/>
           </w:tcPr>
           <w:p>
             <w:pPr>
@@ -8963,7 +9301,7 @@
         </w:trPr>
         <w:tc>
           <w:tcPr>
-            <w:tcW w:w="467" w:type="pct"/>
+            <w:tcW w:w="469" w:type="pct"/>
           </w:tcPr>
           <w:p>
             <w:pPr>
@@ -8987,7 +9325,8 @@
         </w:tc>
         <w:tc>
           <w:tcPr>
-            <w:tcW w:w="4456" w:type="pct"/>
+            <w:tcW w:w="4454" w:type="pct"/>
+            <w:gridSpan w:val="3"/>
           </w:tcPr>
           <w:p>
             <w:pPr>
@@ -9113,7 +9452,7 @@
         </w:trPr>
         <w:tc>
           <w:tcPr>
-            <w:tcW w:w="467" w:type="pct"/>
+            <w:tcW w:w="469" w:type="pct"/>
           </w:tcPr>
           <w:p>
             <w:pPr>
@@ -9137,7 +9476,8 @@
         </w:tc>
         <w:tc>
           <w:tcPr>
-            <w:tcW w:w="4456" w:type="pct"/>
+            <w:tcW w:w="4454" w:type="pct"/>
+            <w:gridSpan w:val="3"/>
           </w:tcPr>
           <w:p>
             <w:pPr>
@@ -9230,7 +9570,7 @@
         </w:trPr>
         <w:tc>
           <w:tcPr>
-            <w:tcW w:w="467" w:type="pct"/>
+            <w:tcW w:w="469" w:type="pct"/>
           </w:tcPr>
           <w:p>
             <w:pPr>
@@ -9254,7 +9594,8 @@
         </w:tc>
         <w:tc>
           <w:tcPr>
-            <w:tcW w:w="4456" w:type="pct"/>
+            <w:tcW w:w="4454" w:type="pct"/>
+            <w:gridSpan w:val="3"/>
           </w:tcPr>
           <w:p>
             <w:pPr>
@@ -9330,7 +9671,7 @@
         </w:trPr>
         <w:tc>
           <w:tcPr>
-            <w:tcW w:w="467" w:type="pct"/>
+            <w:tcW w:w="469" w:type="pct"/>
           </w:tcPr>
           <w:p>
             <w:pPr>
@@ -9358,7 +9699,8 @@
         </w:tc>
         <w:tc>
           <w:tcPr>
-            <w:tcW w:w="4456" w:type="pct"/>
+            <w:tcW w:w="4454" w:type="pct"/>
+            <w:gridSpan w:val="3"/>
           </w:tcPr>
           <w:p>
             <w:pPr>
@@ -9378,7 +9720,7 @@
         </w:trPr>
         <w:tc>
           <w:tcPr>
-            <w:tcW w:w="467" w:type="pct"/>
+            <w:tcW w:w="469" w:type="pct"/>
             <w:vMerge w:val="restart"/>
           </w:tcPr>
           <w:p>
@@ -9406,7 +9748,8 @@
         </w:tc>
         <w:tc>
           <w:tcPr>
-            <w:tcW w:w="4456" w:type="pct"/>
+            <w:tcW w:w="4454" w:type="pct"/>
+            <w:gridSpan w:val="3"/>
           </w:tcPr>
           <w:p>
             <w:pPr>
@@ -9458,7 +9801,7 @@
         </w:trPr>
         <w:tc>
           <w:tcPr>
-            <w:tcW w:w="467" w:type="pct"/>
+            <w:tcW w:w="469" w:type="pct"/>
             <w:vMerge/>
           </w:tcPr>
           <w:p>
@@ -9483,7 +9826,8 @@
         </w:tc>
         <w:tc>
           <w:tcPr>
-            <w:tcW w:w="4456" w:type="pct"/>
+            <w:tcW w:w="4454" w:type="pct"/>
+            <w:gridSpan w:val="3"/>
           </w:tcPr>
           <w:p>
             <w:pPr>
@@ -9527,7 +9871,7 @@
         </w:trPr>
         <w:tc>
           <w:tcPr>
-            <w:tcW w:w="467" w:type="pct"/>
+            <w:tcW w:w="469" w:type="pct"/>
           </w:tcPr>
           <w:p>
             <w:pPr>
@@ -9551,7 +9895,8 @@
         </w:tc>
         <w:tc>
           <w:tcPr>
-            <w:tcW w:w="4456" w:type="pct"/>
+            <w:tcW w:w="4454" w:type="pct"/>
+            <w:gridSpan w:val="3"/>
           </w:tcPr>
           <w:p>
             <w:pPr>
@@ -9595,7 +9940,7 @@
         </w:trPr>
         <w:tc>
           <w:tcPr>
-            <w:tcW w:w="467" w:type="pct"/>
+            <w:tcW w:w="469" w:type="pct"/>
           </w:tcPr>
           <w:p>
             <w:pPr>
@@ -9619,7 +9964,8 @@
         </w:tc>
         <w:tc>
           <w:tcPr>
-            <w:tcW w:w="4456" w:type="pct"/>
+            <w:tcW w:w="4454" w:type="pct"/>
+            <w:gridSpan w:val="3"/>
           </w:tcPr>
           <w:p>
             <w:pPr>
@@ -12473,7 +12819,6 @@
     <w:rsid w:val="004A4065"/>
     <w:rsid w:val="004B2B15"/>
     <w:rsid w:val="004B72E9"/>
-    <w:rsid w:val="004D17CE"/>
     <w:rsid w:val="004E6208"/>
     <w:rsid w:val="0053687F"/>
     <w:rsid w:val="00674A94"/>
@@ -12499,6 +12844,7 @@
     <w:rsid w:val="00C135B0"/>
     <w:rsid w:val="00CA3FC5"/>
     <w:rsid w:val="00CC0A20"/>
+    <w:rsid w:val="00CC4DC8"/>
     <w:rsid w:val="00E16A43"/>
     <w:rsid w:val="00E61DFF"/>
     <w:rsid w:val="00EA0651"/>

</xml_diff>

<commit_message>
Update AI/ML and quantum skills
</commit_message>
<xml_diff>
--- a/derieux_resume_multipage.docx
+++ b/derieux_resume_multipage.docx
@@ -161,11 +161,11 @@
         <w:tblLook w:val="04A0" w:firstRow="1" w:lastRow="0" w:firstColumn="1" w:lastColumn="0" w:noHBand="0" w:noVBand="1"/>
       </w:tblPr>
       <w:tblGrid>
-        <w:gridCol w:w="1014"/>
+        <w:gridCol w:w="1013"/>
         <w:gridCol w:w="166"/>
         <w:gridCol w:w="3216"/>
-        <w:gridCol w:w="1594"/>
-        <w:gridCol w:w="4810"/>
+        <w:gridCol w:w="1983"/>
+        <w:gridCol w:w="4422"/>
       </w:tblGrid>
       <w:tr>
         <w:trPr>
@@ -7137,7 +7137,7 @@
         </w:tc>
         <w:tc>
           <w:tcPr>
-            <w:tcW w:w="2227" w:type="pct"/>
+            <w:tcW w:w="2407" w:type="pct"/>
             <w:gridSpan w:val="2"/>
           </w:tcPr>
           <w:p>
@@ -7158,7 +7158,7 @@
         </w:tc>
         <w:tc>
           <w:tcPr>
-            <w:tcW w:w="2227" w:type="pct"/>
+            <w:tcW w:w="2047" w:type="pct"/>
           </w:tcPr>
           <w:p>
             <w:pPr>
@@ -7208,7 +7208,7 @@
         </w:tc>
         <w:tc>
           <w:tcPr>
-            <w:tcW w:w="2227" w:type="pct"/>
+            <w:tcW w:w="2407" w:type="pct"/>
             <w:gridSpan w:val="2"/>
           </w:tcPr>
           <w:p>
@@ -7227,7 +7227,10 @@
               <w:t xml:space="preserve">(RL) </w:t>
             </w:r>
             <w:r>
-              <w:t>/ Multi-Agent Reinforcement Learning</w:t>
+              <w:t>/</w:t>
+            </w:r>
+            <w:r>
+              <w:t xml:space="preserve"> Multi-Agent Reinforcement Learning</w:t>
             </w:r>
             <w:r>
               <w:t xml:space="preserve"> (MARL)</w:t>
@@ -7246,16 +7249,40 @@
               <w:t xml:space="preserve">Generative Modeling / </w:t>
             </w:r>
             <w:r>
-              <w:t>Multi-Task Learning</w:t>
-            </w:r>
-            <w:r>
-              <w:t xml:space="preserve"> / </w:t>
+              <w:t>Natural Language Processing (NLP)</w:t>
+            </w:r>
+            <w:r>
+              <w:t xml:space="preserve"> </w:t>
+            </w:r>
+            <w:r>
+              <w:br/>
+            </w:r>
+            <w:r>
+              <w:t xml:space="preserve">/ </w:t>
             </w:r>
             <w:r>
               <w:t>Time-series Forecasting</w:t>
             </w:r>
             <w:r>
-              <w:t xml:space="preserve"> / Regression / Classification / etc.</w:t>
+              <w:t xml:space="preserve"> / Regression / Classification </w:t>
+            </w:r>
+            <w:r>
+              <w:br/>
+            </w:r>
+            <w:r>
+              <w:t>/</w:t>
+            </w:r>
+            <w:r>
+              <w:t xml:space="preserve"> Multi-Task Learning /</w:t>
+            </w:r>
+            <w:r>
+              <w:t xml:space="preserve"> </w:t>
+            </w:r>
+            <w:r>
+              <w:t xml:space="preserve">Adversarial Learning / </w:t>
+            </w:r>
+            <w:r>
+              <w:t>etc.</w:t>
             </w:r>
           </w:p>
           <w:p>
@@ -7321,7 +7348,7 @@
         </w:tc>
         <w:tc>
           <w:tcPr>
-            <w:tcW w:w="2227" w:type="pct"/>
+            <w:tcW w:w="2047" w:type="pct"/>
           </w:tcPr>
           <w:p>
             <w:pPr>
@@ -7406,6 +7433,9 @@
             <w:r>
               <w:t>Quantum Internet / Quantum Networks</w:t>
             </w:r>
+            <w:r>
+              <w:t xml:space="preserve"> / Quantum Communications</w:t>
+            </w:r>
           </w:p>
         </w:tc>
       </w:tr>
@@ -7638,7 +7668,13 @@
               <w:t>Python packages</w:t>
             </w:r>
             <w:r>
-              <w:t xml:space="preserve">: JAX / FLAX / TensorFlow / </w:t>
+              <w:t xml:space="preserve">: </w:t>
+            </w:r>
+            <w:r>
+              <w:t xml:space="preserve"> </w:t>
+            </w:r>
+            <w:r>
+              <w:t xml:space="preserve">JAX / FLAX / TensorFlow / </w:t>
             </w:r>
             <w:proofErr w:type="spellStart"/>
             <w:r>
@@ -7753,7 +7789,13 @@
               <w:t xml:space="preserve"> packages</w:t>
             </w:r>
             <w:r>
-              <w:t>:  React.js / Electron.js / Cesium.js / Bootstrap</w:t>
+              <w:t xml:space="preserve">: </w:t>
+            </w:r>
+            <w:r>
+              <w:t xml:space="preserve"> </w:t>
+            </w:r>
+            <w:r>
+              <w:t>React.js / Electron.js / Cesium.js / Bootstrap</w:t>
             </w:r>
           </w:p>
           <w:p>
@@ -8036,7 +8078,13 @@
                     <w:t>Databases</w:t>
                   </w:r>
                   <w:r>
-                    <w:t xml:space="preserve">: </w:t>
+                    <w:t>:</w:t>
+                  </w:r>
+                  <w:r>
+                    <w:t xml:space="preserve"> </w:t>
+                  </w:r>
+                  <w:r>
+                    <w:t xml:space="preserve"> </w:t>
                   </w:r>
                   <w:proofErr w:type="spellStart"/>
                   <w:r>
@@ -8092,7 +8140,13 @@
                     <w:t xml:space="preserve"> &amp; Apps</w:t>
                   </w:r>
                   <w:r>
-                    <w:t>: Linux / macOS / Windows / iOS / Android</w:t>
+                    <w:t>:</w:t>
+                  </w:r>
+                  <w:r>
+                    <w:t xml:space="preserve"> </w:t>
+                  </w:r>
+                  <w:r>
+                    <w:t xml:space="preserve"> Linux / macOS / Windows / iOS / Android</w:t>
                   </w:r>
                 </w:p>
               </w:tc>
@@ -12839,12 +12893,12 @@
     <w:rsid w:val="00B85965"/>
     <w:rsid w:val="00BA4BB8"/>
     <w:rsid w:val="00BE09F0"/>
+    <w:rsid w:val="00BE351D"/>
     <w:rsid w:val="00BF3AAB"/>
     <w:rsid w:val="00C055D2"/>
     <w:rsid w:val="00C135B0"/>
     <w:rsid w:val="00CA3FC5"/>
     <w:rsid w:val="00CC0A20"/>
-    <w:rsid w:val="00CC4DC8"/>
     <w:rsid w:val="00E16A43"/>
     <w:rsid w:val="00E61DFF"/>
     <w:rsid w:val="00EA0651"/>

</xml_diff>